<commit_message>
docs: modification on project tracking v10
</commit_message>
<xml_diff>
--- a/Documentation/Fiche_suivi_projet_v10.docx
+++ b/Documentation/Fiche_suivi_projet_v10.docx
@@ -973,7 +973,7 @@
           <w:r>
             <w:fldChar w:fldCharType="separate"/>
           </w:r>
-          <w:hyperlink w:anchor="_Toc228354313" w:history="1">
+          <w:hyperlink w:anchor="_Toc228372199" w:history="1">
             <w:r>
               <w:rPr>
                 <w:rStyle w:val="Lienhypertexte"/>
@@ -1020,7 +1020,7 @@
                 <w:noProof/>
                 <w:webHidden/>
               </w:rPr>
-              <w:instrText xml:space="preserve"> PAGEREF _Toc228354313 \h </w:instrText>
+              <w:instrText xml:space="preserve"> PAGEREF _Toc228372199 \h </w:instrText>
             </w:r>
             <w:r>
               <w:rPr>
@@ -1068,7 +1068,7 @@
               <w14:ligatures w14:val="standardContextual"/>
             </w:rPr>
           </w:pPr>
-          <w:hyperlink w:anchor="_Toc228354314" w:history="1">
+          <w:hyperlink w:anchor="_Toc228372200" w:history="1">
             <w:r>
               <w:rPr>
                 <w:rStyle w:val="Lienhypertexte"/>
@@ -1114,7 +1114,7 @@
                 <w:noProof/>
                 <w:webHidden/>
               </w:rPr>
-              <w:instrText xml:space="preserve"> PAGEREF _Toc228354314 \h </w:instrText>
+              <w:instrText xml:space="preserve"> PAGEREF _Toc228372200 \h </w:instrText>
             </w:r>
             <w:r>
               <w:rPr>
@@ -1134,7 +1134,7 @@
                 <w:noProof/>
                 <w:webHidden/>
               </w:rPr>
-              <w:t>4</w:t>
+              <w:t>5</w:t>
             </w:r>
             <w:r>
               <w:rPr>
@@ -1162,7 +1162,7 @@
               <w14:ligatures w14:val="standardContextual"/>
             </w:rPr>
           </w:pPr>
-          <w:hyperlink w:anchor="_Toc228354315" w:history="1">
+          <w:hyperlink w:anchor="_Toc228372201" w:history="1">
             <w:r>
               <w:rPr>
                 <w:rStyle w:val="Lienhypertexte"/>
@@ -1208,7 +1208,7 @@
                 <w:noProof/>
                 <w:webHidden/>
               </w:rPr>
-              <w:instrText xml:space="preserve"> PAGEREF _Toc228354315 \h </w:instrText>
+              <w:instrText xml:space="preserve"> PAGEREF _Toc228372201 \h </w:instrText>
             </w:r>
             <w:r>
               <w:rPr>
@@ -1228,7 +1228,7 @@
                 <w:noProof/>
                 <w:webHidden/>
               </w:rPr>
-              <w:t>4</w:t>
+              <w:t>5</w:t>
             </w:r>
             <w:r>
               <w:rPr>
@@ -1256,7 +1256,7 @@
               <w14:ligatures w14:val="standardContextual"/>
             </w:rPr>
           </w:pPr>
-          <w:hyperlink w:anchor="_Toc228354316" w:history="1">
+          <w:hyperlink w:anchor="_Toc228372202" w:history="1">
             <w:r>
               <w:rPr>
                 <w:rStyle w:val="Lienhypertexte"/>
@@ -1302,7 +1302,7 @@
                 <w:noProof/>
                 <w:webHidden/>
               </w:rPr>
-              <w:instrText xml:space="preserve"> PAGEREF _Toc228354316 \h </w:instrText>
+              <w:instrText xml:space="preserve"> PAGEREF _Toc228372202 \h </w:instrText>
             </w:r>
             <w:r>
               <w:rPr>
@@ -1349,7 +1349,7 @@
               <w14:ligatures w14:val="standardContextual"/>
             </w:rPr>
           </w:pPr>
-          <w:hyperlink w:anchor="_Toc228354317" w:history="1">
+          <w:hyperlink w:anchor="_Toc228372203" w:history="1">
             <w:r>
               <w:rPr>
                 <w:noProof/>
@@ -1369,7 +1369,7 @@
                 <w:noProof/>
                 <w:webHidden/>
               </w:rPr>
-              <w:instrText xml:space="preserve"> PAGEREF _Toc228354317 \h </w:instrText>
+              <w:instrText xml:space="preserve"> PAGEREF _Toc228372203 \h </w:instrText>
             </w:r>
             <w:r>
               <w:rPr>
@@ -1417,7 +1417,7 @@
               <w14:ligatures w14:val="standardContextual"/>
             </w:rPr>
           </w:pPr>
-          <w:hyperlink w:anchor="_Toc228354318" w:history="1">
+          <w:hyperlink w:anchor="_Toc228372204" w:history="1">
             <w:r>
               <w:rPr>
                 <w:rStyle w:val="Lienhypertexte"/>
@@ -1463,7 +1463,7 @@
                 <w:noProof/>
                 <w:webHidden/>
               </w:rPr>
-              <w:instrText xml:space="preserve"> PAGEREF _Toc228354318 \h </w:instrText>
+              <w:instrText xml:space="preserve"> PAGEREF _Toc228372204 \h </w:instrText>
             </w:r>
             <w:r>
               <w:rPr>
@@ -1511,7 +1511,7 @@
               <w14:ligatures w14:val="standardContextual"/>
             </w:rPr>
           </w:pPr>
-          <w:hyperlink w:anchor="_Toc228354319" w:history="1">
+          <w:hyperlink w:anchor="_Toc228372205" w:history="1">
             <w:r>
               <w:rPr>
                 <w:rStyle w:val="Lienhypertexte"/>
@@ -1557,7 +1557,7 @@
                 <w:noProof/>
                 <w:webHidden/>
               </w:rPr>
-              <w:instrText xml:space="preserve"> PAGEREF _Toc228354319 \h </w:instrText>
+              <w:instrText xml:space="preserve"> PAGEREF _Toc228372205 \h </w:instrText>
             </w:r>
             <w:r>
               <w:rPr>
@@ -1605,7 +1605,7 @@
               <w14:ligatures w14:val="standardContextual"/>
             </w:rPr>
           </w:pPr>
-          <w:hyperlink w:anchor="_Toc228354320" w:history="1">
+          <w:hyperlink w:anchor="_Toc228372206" w:history="1">
             <w:r>
               <w:rPr>
                 <w:rStyle w:val="Lienhypertexte"/>
@@ -1651,7 +1651,7 @@
                 <w:noProof/>
                 <w:webHidden/>
               </w:rPr>
-              <w:instrText xml:space="preserve"> PAGEREF _Toc228354320 \h </w:instrText>
+              <w:instrText xml:space="preserve"> PAGEREF _Toc228372206 \h </w:instrText>
             </w:r>
             <w:r>
               <w:rPr>
@@ -1699,7 +1699,7 @@
               <w14:ligatures w14:val="standardContextual"/>
             </w:rPr>
           </w:pPr>
-          <w:hyperlink w:anchor="_Toc228354321" w:history="1">
+          <w:hyperlink w:anchor="_Toc228372207" w:history="1">
             <w:r>
               <w:rPr>
                 <w:rStyle w:val="Lienhypertexte"/>
@@ -1745,7 +1745,7 @@
                 <w:noProof/>
                 <w:webHidden/>
               </w:rPr>
-              <w:instrText xml:space="preserve"> PAGEREF _Toc228354321 \h </w:instrText>
+              <w:instrText xml:space="preserve"> PAGEREF _Toc228372207 \h </w:instrText>
             </w:r>
             <w:r>
               <w:rPr>
@@ -1792,7 +1792,7 @@
               <w14:ligatures w14:val="standardContextual"/>
             </w:rPr>
           </w:pPr>
-          <w:hyperlink w:anchor="_Toc228354322" w:history="1">
+          <w:hyperlink w:anchor="_Toc228372208" w:history="1">
             <w:r>
               <w:rPr>
                 <w:noProof/>
@@ -1812,7 +1812,7 @@
                 <w:noProof/>
                 <w:webHidden/>
               </w:rPr>
-              <w:instrText xml:space="preserve"> PAGEREF _Toc228354322 \h </w:instrText>
+              <w:instrText xml:space="preserve"> PAGEREF _Toc228372208 \h </w:instrText>
             </w:r>
             <w:r>
               <w:rPr>
@@ -1860,7 +1860,7 @@
               <w14:ligatures w14:val="standardContextual"/>
             </w:rPr>
           </w:pPr>
-          <w:hyperlink w:anchor="_Toc228354323" w:history="1">
+          <w:hyperlink w:anchor="_Toc228372209" w:history="1">
             <w:r>
               <w:rPr>
                 <w:rStyle w:val="Lienhypertexte"/>
@@ -1906,7 +1906,7 @@
                 <w:noProof/>
                 <w:webHidden/>
               </w:rPr>
-              <w:instrText xml:space="preserve"> PAGEREF _Toc228354323 \h </w:instrText>
+              <w:instrText xml:space="preserve"> PAGEREF _Toc228372209 \h </w:instrText>
             </w:r>
             <w:r>
               <w:rPr>
@@ -1954,7 +1954,7 @@
               <w14:ligatures w14:val="standardContextual"/>
             </w:rPr>
           </w:pPr>
-          <w:hyperlink w:anchor="_Toc228354327" w:history="1">
+          <w:hyperlink w:anchor="_Toc228372213" w:history="1">
             <w:r>
               <w:rPr>
                 <w:rStyle w:val="Lienhypertexte"/>
@@ -2000,7 +2000,7 @@
                 <w:noProof/>
                 <w:webHidden/>
               </w:rPr>
-              <w:instrText xml:space="preserve"> PAGEREF _Toc228354327 \h </w:instrText>
+              <w:instrText xml:space="preserve"> PAGEREF _Toc228372213 \h </w:instrText>
             </w:r>
             <w:r>
               <w:rPr>
@@ -2048,7 +2048,7 @@
               <w14:ligatures w14:val="standardContextual"/>
             </w:rPr>
           </w:pPr>
-          <w:hyperlink w:anchor="_Toc228354341" w:history="1">
+          <w:hyperlink w:anchor="_Toc228372227" w:history="1">
             <w:r>
               <w:rPr>
                 <w:rStyle w:val="Lienhypertexte"/>
@@ -2094,7 +2094,7 @@
                 <w:noProof/>
                 <w:webHidden/>
               </w:rPr>
-              <w:instrText xml:space="preserve"> PAGEREF _Toc228354341 \h </w:instrText>
+              <w:instrText xml:space="preserve"> PAGEREF _Toc228372227 \h </w:instrText>
             </w:r>
             <w:r>
               <w:rPr>
@@ -2142,7 +2142,7 @@
               <w14:ligatures w14:val="standardContextual"/>
             </w:rPr>
           </w:pPr>
-          <w:hyperlink w:anchor="_Toc228354356" w:history="1">
+          <w:hyperlink w:anchor="_Toc228372242" w:history="1">
             <w:r>
               <w:rPr>
                 <w:rStyle w:val="Lienhypertexte"/>
@@ -2188,7 +2188,7 @@
                 <w:noProof/>
                 <w:webHidden/>
               </w:rPr>
-              <w:instrText xml:space="preserve"> PAGEREF _Toc228354356 \h </w:instrText>
+              <w:instrText xml:space="preserve"> PAGEREF _Toc228372242 \h </w:instrText>
             </w:r>
             <w:r>
               <w:rPr>
@@ -2236,7 +2236,7 @@
               <w14:ligatures w14:val="standardContextual"/>
             </w:rPr>
           </w:pPr>
-          <w:hyperlink w:anchor="_Toc228354368" w:history="1">
+          <w:hyperlink w:anchor="_Toc228372254" w:history="1">
             <w:r>
               <w:rPr>
                 <w:rStyle w:val="Lienhypertexte"/>
@@ -2261,7 +2261,7 @@
                 <w:rStyle w:val="Lienhypertexte"/>
                 <w:noProof/>
               </w:rPr>
-              <w:t>Avancement du projet</w:t>
+              <w:t>Code Backend &amp; Frontend</w:t>
             </w:r>
             <w:r>
               <w:rPr>
@@ -2282,7 +2282,7 @@
                 <w:noProof/>
                 <w:webHidden/>
               </w:rPr>
-              <w:instrText xml:space="preserve"> PAGEREF _Toc228354368 \h </w:instrText>
+              <w:instrText xml:space="preserve"> PAGEREF _Toc228372254 \h </w:instrText>
             </w:r>
             <w:r>
               <w:rPr>
@@ -2330,7 +2330,7 @@
               <w14:ligatures w14:val="standardContextual"/>
             </w:rPr>
           </w:pPr>
-          <w:hyperlink w:anchor="_Toc228354369" w:history="1">
+          <w:hyperlink w:anchor="_Toc228372255" w:history="1">
             <w:r>
               <w:rPr>
                 <w:rStyle w:val="Lienhypertexte"/>
@@ -2355,7 +2355,7 @@
                 <w:rStyle w:val="Lienhypertexte"/>
                 <w:noProof/>
               </w:rPr>
-              <w:t>Récapitulatif des tâches réalisées</w:t>
+              <w:t>Justification des langages utilisés</w:t>
             </w:r>
             <w:r>
               <w:rPr>
@@ -2376,7 +2376,7 @@
                 <w:noProof/>
                 <w:webHidden/>
               </w:rPr>
-              <w:instrText xml:space="preserve"> PAGEREF _Toc228354369 \h </w:instrText>
+              <w:instrText xml:space="preserve"> PAGEREF _Toc228372255 \h </w:instrText>
             </w:r>
             <w:r>
               <w:rPr>
@@ -2424,7 +2424,7 @@
               <w14:ligatures w14:val="standardContextual"/>
             </w:rPr>
           </w:pPr>
-          <w:hyperlink w:anchor="_Toc228354370" w:history="1">
+          <w:hyperlink w:anchor="_Toc228372270" w:history="1">
             <w:r>
               <w:rPr>
                 <w:rStyle w:val="Lienhypertexte"/>
@@ -2449,7 +2449,7 @@
                 <w:rStyle w:val="Lienhypertexte"/>
                 <w:noProof/>
               </w:rPr>
-              <w:t>Tâches restantes à réaliser</w:t>
+              <w:t>Structure du projet</w:t>
             </w:r>
             <w:r>
               <w:rPr>
@@ -2470,7 +2470,7 @@
                 <w:noProof/>
                 <w:webHidden/>
               </w:rPr>
-              <w:instrText xml:space="preserve"> PAGEREF _Toc228354370 \h </w:instrText>
+              <w:instrText xml:space="preserve"> PAGEREF _Toc228372270 \h </w:instrText>
             </w:r>
             <w:r>
               <w:rPr>
@@ -2490,7 +2490,289 @@
                 <w:noProof/>
                 <w:webHidden/>
               </w:rPr>
+              <w:t>12</w:t>
+            </w:r>
+            <w:r>
+              <w:rPr>
+                <w:noProof/>
+                <w:webHidden/>
+              </w:rPr>
+              <w:fldChar w:fldCharType="end"/>
+            </w:r>
+          </w:hyperlink>
+        </w:p>
+        <w:p>
+          <w:pPr>
+            <w:pStyle w:val="TM2"/>
+            <w:tabs>
+              <w:tab w:val="left" w:pos="960"/>
+              <w:tab w:val="right" w:leader="dot" w:pos="9970"/>
+            </w:tabs>
+            <w:rPr>
+              <w:rFonts w:asciiTheme="minorHAnsi" w:eastAsiaTheme="minorEastAsia" w:hAnsiTheme="minorHAnsi" w:cstheme="minorBidi"/>
+              <w:noProof/>
+              <w:kern w:val="2"/>
+              <w:sz w:val="24"/>
+              <w:szCs w:val="24"/>
+              <w:lang w:eastAsia="fr-FR"/>
+              <w14:ligatures w14:val="standardContextual"/>
+            </w:rPr>
+          </w:pPr>
+          <w:hyperlink w:anchor="_Toc228372271" w:history="1">
+            <w:r>
+              <w:rPr>
+                <w:rStyle w:val="Lienhypertexte"/>
+                <w:noProof/>
+              </w:rPr>
+              <w:t>4.3.</w:t>
+            </w:r>
+            <w:r>
+              <w:rPr>
+                <w:rFonts w:asciiTheme="minorHAnsi" w:eastAsiaTheme="minorEastAsia" w:hAnsiTheme="minorHAnsi" w:cstheme="minorBidi"/>
+                <w:noProof/>
+                <w:kern w:val="2"/>
+                <w:sz w:val="24"/>
+                <w:szCs w:val="24"/>
+                <w:lang w:eastAsia="fr-FR"/>
+                <w14:ligatures w14:val="standardContextual"/>
+              </w:rPr>
+              <w:tab/>
+            </w:r>
+            <w:r>
+              <w:rPr>
+                <w:rStyle w:val="Lienhypertexte"/>
+                <w:noProof/>
+              </w:rPr>
+              <w:t>App.js, la fondation du projet</w:t>
+            </w:r>
+            <w:r>
+              <w:rPr>
+                <w:noProof/>
+                <w:webHidden/>
+              </w:rPr>
+              <w:tab/>
+            </w:r>
+            <w:r>
+              <w:rPr>
+                <w:noProof/>
+                <w:webHidden/>
+              </w:rPr>
+              <w:fldChar w:fldCharType="begin"/>
+            </w:r>
+            <w:r>
+              <w:rPr>
+                <w:noProof/>
+                <w:webHidden/>
+              </w:rPr>
+              <w:instrText xml:space="preserve"> PAGEREF _Toc228372271 \h </w:instrText>
+            </w:r>
+            <w:r>
+              <w:rPr>
+                <w:noProof/>
+                <w:webHidden/>
+              </w:rPr>
+            </w:r>
+            <w:r>
+              <w:rPr>
+                <w:noProof/>
+                <w:webHidden/>
+              </w:rPr>
+              <w:fldChar w:fldCharType="separate"/>
+            </w:r>
+            <w:r>
+              <w:rPr>
+                <w:noProof/>
+                <w:webHidden/>
+              </w:rPr>
               <w:t>13</w:t>
+            </w:r>
+            <w:r>
+              <w:rPr>
+                <w:noProof/>
+                <w:webHidden/>
+              </w:rPr>
+              <w:fldChar w:fldCharType="end"/>
+            </w:r>
+          </w:hyperlink>
+        </w:p>
+        <w:p>
+          <w:pPr>
+            <w:pStyle w:val="TM2"/>
+            <w:tabs>
+              <w:tab w:val="left" w:pos="960"/>
+              <w:tab w:val="right" w:leader="dot" w:pos="9970"/>
+            </w:tabs>
+            <w:rPr>
+              <w:rFonts w:asciiTheme="minorHAnsi" w:eastAsiaTheme="minorEastAsia" w:hAnsiTheme="minorHAnsi" w:cstheme="minorBidi"/>
+              <w:noProof/>
+              <w:kern w:val="2"/>
+              <w:sz w:val="24"/>
+              <w:szCs w:val="24"/>
+              <w:lang w:eastAsia="fr-FR"/>
+              <w14:ligatures w14:val="standardContextual"/>
+            </w:rPr>
+          </w:pPr>
+          <w:hyperlink w:anchor="_Toc228372272" w:history="1">
+            <w:r>
+              <w:rPr>
+                <w:rStyle w:val="Lienhypertexte"/>
+                <w:noProof/>
+              </w:rPr>
+              <w:t>4.4.</w:t>
+            </w:r>
+            <w:r>
+              <w:rPr>
+                <w:rFonts w:asciiTheme="minorHAnsi" w:eastAsiaTheme="minorEastAsia" w:hAnsiTheme="minorHAnsi" w:cstheme="minorBidi"/>
+                <w:noProof/>
+                <w:kern w:val="2"/>
+                <w:sz w:val="24"/>
+                <w:szCs w:val="24"/>
+                <w:lang w:eastAsia="fr-FR"/>
+                <w14:ligatures w14:val="standardContextual"/>
+              </w:rPr>
+              <w:tab/>
+            </w:r>
+            <w:r>
+              <w:rPr>
+                <w:rStyle w:val="Lienhypertexte"/>
+                <w:noProof/>
+              </w:rPr>
+              <w:t>O365.js – La gestion de la connexion avec Office 365</w:t>
+            </w:r>
+            <w:r>
+              <w:rPr>
+                <w:noProof/>
+                <w:webHidden/>
+              </w:rPr>
+              <w:tab/>
+            </w:r>
+            <w:r>
+              <w:rPr>
+                <w:noProof/>
+                <w:webHidden/>
+              </w:rPr>
+              <w:fldChar w:fldCharType="begin"/>
+            </w:r>
+            <w:r>
+              <w:rPr>
+                <w:noProof/>
+                <w:webHidden/>
+              </w:rPr>
+              <w:instrText xml:space="preserve"> PAGEREF _Toc228372272 \h </w:instrText>
+            </w:r>
+            <w:r>
+              <w:rPr>
+                <w:noProof/>
+                <w:webHidden/>
+              </w:rPr>
+            </w:r>
+            <w:r>
+              <w:rPr>
+                <w:noProof/>
+                <w:webHidden/>
+              </w:rPr>
+              <w:fldChar w:fldCharType="separate"/>
+            </w:r>
+            <w:r>
+              <w:rPr>
+                <w:noProof/>
+                <w:webHidden/>
+              </w:rPr>
+              <w:t>14</w:t>
+            </w:r>
+            <w:r>
+              <w:rPr>
+                <w:noProof/>
+                <w:webHidden/>
+              </w:rPr>
+              <w:fldChar w:fldCharType="end"/>
+            </w:r>
+          </w:hyperlink>
+        </w:p>
+        <w:p>
+          <w:pPr>
+            <w:pStyle w:val="TM2"/>
+            <w:tabs>
+              <w:tab w:val="left" w:pos="960"/>
+              <w:tab w:val="right" w:leader="dot" w:pos="9970"/>
+            </w:tabs>
+            <w:rPr>
+              <w:rFonts w:asciiTheme="minorHAnsi" w:eastAsiaTheme="minorEastAsia" w:hAnsiTheme="minorHAnsi" w:cstheme="minorBidi"/>
+              <w:noProof/>
+              <w:kern w:val="2"/>
+              <w:sz w:val="24"/>
+              <w:szCs w:val="24"/>
+              <w:lang w:eastAsia="fr-FR"/>
+              <w14:ligatures w14:val="standardContextual"/>
+            </w:rPr>
+          </w:pPr>
+          <w:hyperlink w:anchor="_Toc228372273" w:history="1">
+            <w:r>
+              <w:rPr>
+                <w:rStyle w:val="Lienhypertexte"/>
+                <w:noProof/>
+              </w:rPr>
+              <w:t>4.5.</w:t>
+            </w:r>
+            <w:r>
+              <w:rPr>
+                <w:rFonts w:asciiTheme="minorHAnsi" w:eastAsiaTheme="minorEastAsia" w:hAnsiTheme="minorHAnsi" w:cstheme="minorBidi"/>
+                <w:noProof/>
+                <w:kern w:val="2"/>
+                <w:sz w:val="24"/>
+                <w:szCs w:val="24"/>
+                <w:lang w:eastAsia="fr-FR"/>
+                <w14:ligatures w14:val="standardContextual"/>
+              </w:rPr>
+              <w:tab/>
+            </w:r>
+            <w:r>
+              <w:rPr>
+                <w:rStyle w:val="Lienhypertexte"/>
+                <w:noProof/>
+              </w:rPr>
+              <w:t>Match_office_to_ED.js – La gestion des rôles utilisateurs sur la PWA</w:t>
+            </w:r>
+            <w:r>
+              <w:rPr>
+                <w:noProof/>
+                <w:webHidden/>
+              </w:rPr>
+              <w:tab/>
+            </w:r>
+            <w:r>
+              <w:rPr>
+                <w:noProof/>
+                <w:webHidden/>
+              </w:rPr>
+              <w:fldChar w:fldCharType="begin"/>
+            </w:r>
+            <w:r>
+              <w:rPr>
+                <w:noProof/>
+                <w:webHidden/>
+              </w:rPr>
+              <w:instrText xml:space="preserve"> PAGEREF _Toc228372273 \h </w:instrText>
+            </w:r>
+            <w:r>
+              <w:rPr>
+                <w:noProof/>
+                <w:webHidden/>
+              </w:rPr>
+            </w:r>
+            <w:r>
+              <w:rPr>
+                <w:noProof/>
+                <w:webHidden/>
+              </w:rPr>
+              <w:fldChar w:fldCharType="separate"/>
+            </w:r>
+            <w:r>
+              <w:rPr>
+                <w:noProof/>
+                <w:webHidden/>
+              </w:rPr>
+              <w:t>15</w:t>
             </w:r>
             <w:r>
               <w:rPr>
@@ -2518,7 +2800,7 @@
               <w14:ligatures w14:val="standardContextual"/>
             </w:rPr>
           </w:pPr>
-          <w:hyperlink w:anchor="_Toc228354371" w:history="1">
+          <w:hyperlink w:anchor="_Toc228372274" w:history="1">
             <w:r>
               <w:rPr>
                 <w:rStyle w:val="Lienhypertexte"/>
@@ -2543,7 +2825,7 @@
                 <w:rStyle w:val="Lienhypertexte"/>
                 <w:noProof/>
               </w:rPr>
-              <w:t>Tableau récapitulatif d'avancement</w:t>
+              <w:t>Avancement du projet</w:t>
             </w:r>
             <w:r>
               <w:rPr>
@@ -2564,7 +2846,7 @@
                 <w:noProof/>
                 <w:webHidden/>
               </w:rPr>
-              <w:instrText xml:space="preserve"> PAGEREF _Toc228354371 \h </w:instrText>
+              <w:instrText xml:space="preserve"> PAGEREF _Toc228372274 \h </w:instrText>
             </w:r>
             <w:r>
               <w:rPr>
@@ -2584,7 +2866,195 @@
                 <w:noProof/>
                 <w:webHidden/>
               </w:rPr>
-              <w:t>14</w:t>
+              <w:t>16</w:t>
+            </w:r>
+            <w:r>
+              <w:rPr>
+                <w:noProof/>
+                <w:webHidden/>
+              </w:rPr>
+              <w:fldChar w:fldCharType="end"/>
+            </w:r>
+          </w:hyperlink>
+        </w:p>
+        <w:p>
+          <w:pPr>
+            <w:pStyle w:val="TM2"/>
+            <w:tabs>
+              <w:tab w:val="left" w:pos="960"/>
+              <w:tab w:val="right" w:leader="dot" w:pos="9970"/>
+            </w:tabs>
+            <w:rPr>
+              <w:rFonts w:asciiTheme="minorHAnsi" w:eastAsiaTheme="minorEastAsia" w:hAnsiTheme="minorHAnsi" w:cstheme="minorBidi"/>
+              <w:noProof/>
+              <w:kern w:val="2"/>
+              <w:sz w:val="24"/>
+              <w:szCs w:val="24"/>
+              <w:lang w:eastAsia="fr-FR"/>
+              <w14:ligatures w14:val="standardContextual"/>
+            </w:rPr>
+          </w:pPr>
+          <w:hyperlink w:anchor="_Toc228372275" w:history="1">
+            <w:r>
+              <w:rPr>
+                <w:rStyle w:val="Lienhypertexte"/>
+                <w:noProof/>
+              </w:rPr>
+              <w:t>5.1.</w:t>
+            </w:r>
+            <w:r>
+              <w:rPr>
+                <w:rFonts w:asciiTheme="minorHAnsi" w:eastAsiaTheme="minorEastAsia" w:hAnsiTheme="minorHAnsi" w:cstheme="minorBidi"/>
+                <w:noProof/>
+                <w:kern w:val="2"/>
+                <w:sz w:val="24"/>
+                <w:szCs w:val="24"/>
+                <w:lang w:eastAsia="fr-FR"/>
+                <w14:ligatures w14:val="standardContextual"/>
+              </w:rPr>
+              <w:tab/>
+            </w:r>
+            <w:r>
+              <w:rPr>
+                <w:rStyle w:val="Lienhypertexte"/>
+                <w:noProof/>
+              </w:rPr>
+              <w:t>Récapitulatif des tâches réalisées</w:t>
+            </w:r>
+            <w:r>
+              <w:rPr>
+                <w:noProof/>
+                <w:webHidden/>
+              </w:rPr>
+              <w:tab/>
+            </w:r>
+            <w:r>
+              <w:rPr>
+                <w:noProof/>
+                <w:webHidden/>
+              </w:rPr>
+              <w:fldChar w:fldCharType="begin"/>
+            </w:r>
+            <w:r>
+              <w:rPr>
+                <w:noProof/>
+                <w:webHidden/>
+              </w:rPr>
+              <w:instrText xml:space="preserve"> PAGEREF _Toc228372275 \h </w:instrText>
+            </w:r>
+            <w:r>
+              <w:rPr>
+                <w:noProof/>
+                <w:webHidden/>
+              </w:rPr>
+            </w:r>
+            <w:r>
+              <w:rPr>
+                <w:noProof/>
+                <w:webHidden/>
+              </w:rPr>
+              <w:fldChar w:fldCharType="separate"/>
+            </w:r>
+            <w:r>
+              <w:rPr>
+                <w:noProof/>
+                <w:webHidden/>
+              </w:rPr>
+              <w:t>16</w:t>
+            </w:r>
+            <w:r>
+              <w:rPr>
+                <w:noProof/>
+                <w:webHidden/>
+              </w:rPr>
+              <w:fldChar w:fldCharType="end"/>
+            </w:r>
+          </w:hyperlink>
+        </w:p>
+        <w:p>
+          <w:pPr>
+            <w:pStyle w:val="TM2"/>
+            <w:tabs>
+              <w:tab w:val="left" w:pos="960"/>
+              <w:tab w:val="right" w:leader="dot" w:pos="9970"/>
+            </w:tabs>
+            <w:rPr>
+              <w:rFonts w:asciiTheme="minorHAnsi" w:eastAsiaTheme="minorEastAsia" w:hAnsiTheme="minorHAnsi" w:cstheme="minorBidi"/>
+              <w:noProof/>
+              <w:kern w:val="2"/>
+              <w:sz w:val="24"/>
+              <w:szCs w:val="24"/>
+              <w:lang w:eastAsia="fr-FR"/>
+              <w14:ligatures w14:val="standardContextual"/>
+            </w:rPr>
+          </w:pPr>
+          <w:hyperlink w:anchor="_Toc228372276" w:history="1">
+            <w:r>
+              <w:rPr>
+                <w:rStyle w:val="Lienhypertexte"/>
+                <w:noProof/>
+              </w:rPr>
+              <w:t>5.2.</w:t>
+            </w:r>
+            <w:r>
+              <w:rPr>
+                <w:rFonts w:asciiTheme="minorHAnsi" w:eastAsiaTheme="minorEastAsia" w:hAnsiTheme="minorHAnsi" w:cstheme="minorBidi"/>
+                <w:noProof/>
+                <w:kern w:val="2"/>
+                <w:sz w:val="24"/>
+                <w:szCs w:val="24"/>
+                <w:lang w:eastAsia="fr-FR"/>
+                <w14:ligatures w14:val="standardContextual"/>
+              </w:rPr>
+              <w:tab/>
+            </w:r>
+            <w:r>
+              <w:rPr>
+                <w:rStyle w:val="Lienhypertexte"/>
+                <w:noProof/>
+              </w:rPr>
+              <w:t>Tâches restantes à réaliser</w:t>
+            </w:r>
+            <w:r>
+              <w:rPr>
+                <w:noProof/>
+                <w:webHidden/>
+              </w:rPr>
+              <w:tab/>
+            </w:r>
+            <w:r>
+              <w:rPr>
+                <w:noProof/>
+                <w:webHidden/>
+              </w:rPr>
+              <w:fldChar w:fldCharType="begin"/>
+            </w:r>
+            <w:r>
+              <w:rPr>
+                <w:noProof/>
+                <w:webHidden/>
+              </w:rPr>
+              <w:instrText xml:space="preserve"> PAGEREF _Toc228372276 \h </w:instrText>
+            </w:r>
+            <w:r>
+              <w:rPr>
+                <w:noProof/>
+                <w:webHidden/>
+              </w:rPr>
+            </w:r>
+            <w:r>
+              <w:rPr>
+                <w:noProof/>
+                <w:webHidden/>
+              </w:rPr>
+              <w:fldChar w:fldCharType="separate"/>
+            </w:r>
+            <w:r>
+              <w:rPr>
+                <w:noProof/>
+                <w:webHidden/>
+              </w:rPr>
+              <w:t>17</w:t>
             </w:r>
             <w:r>
               <w:rPr>
@@ -2612,7 +3082,7 @@
               <w14:ligatures w14:val="standardContextual"/>
             </w:rPr>
           </w:pPr>
-          <w:hyperlink w:anchor="_Toc228354372" w:history="1">
+          <w:hyperlink w:anchor="_Toc228372277" w:history="1">
             <w:r>
               <w:rPr>
                 <w:rStyle w:val="Lienhypertexte"/>
@@ -2637,7 +3107,7 @@
                 <w:rStyle w:val="Lienhypertexte"/>
                 <w:noProof/>
               </w:rPr>
-              <w:t>Diagramme de Gantt</w:t>
+              <w:t>Tableau récapitulatif d'avancement</w:t>
             </w:r>
             <w:r>
               <w:rPr>
@@ -2658,7 +3128,7 @@
                 <w:noProof/>
                 <w:webHidden/>
               </w:rPr>
-              <w:instrText xml:space="preserve"> PAGEREF _Toc228354372 \h </w:instrText>
+              <w:instrText xml:space="preserve"> PAGEREF _Toc228372277 \h </w:instrText>
             </w:r>
             <w:r>
               <w:rPr>
@@ -2678,7 +3148,7 @@
                 <w:noProof/>
                 <w:webHidden/>
               </w:rPr>
-              <w:t>15</w:t>
+              <w:t>18</w:t>
             </w:r>
             <w:r>
               <w:rPr>
@@ -2706,7 +3176,7 @@
               <w14:ligatures w14:val="standardContextual"/>
             </w:rPr>
           </w:pPr>
-          <w:hyperlink w:anchor="_Toc228354373" w:history="1">
+          <w:hyperlink w:anchor="_Toc228372278" w:history="1">
             <w:r>
               <w:rPr>
                 <w:rStyle w:val="Lienhypertexte"/>
@@ -2731,6 +3201,100 @@
                 <w:rStyle w:val="Lienhypertexte"/>
                 <w:noProof/>
               </w:rPr>
+              <w:t>Diagramme de Gantt</w:t>
+            </w:r>
+            <w:r>
+              <w:rPr>
+                <w:noProof/>
+                <w:webHidden/>
+              </w:rPr>
+              <w:tab/>
+            </w:r>
+            <w:r>
+              <w:rPr>
+                <w:noProof/>
+                <w:webHidden/>
+              </w:rPr>
+              <w:fldChar w:fldCharType="begin"/>
+            </w:r>
+            <w:r>
+              <w:rPr>
+                <w:noProof/>
+                <w:webHidden/>
+              </w:rPr>
+              <w:instrText xml:space="preserve"> PAGEREF _Toc228372278 \h </w:instrText>
+            </w:r>
+            <w:r>
+              <w:rPr>
+                <w:noProof/>
+                <w:webHidden/>
+              </w:rPr>
+            </w:r>
+            <w:r>
+              <w:rPr>
+                <w:noProof/>
+                <w:webHidden/>
+              </w:rPr>
+              <w:fldChar w:fldCharType="separate"/>
+            </w:r>
+            <w:r>
+              <w:rPr>
+                <w:noProof/>
+                <w:webHidden/>
+              </w:rPr>
+              <w:t>19</w:t>
+            </w:r>
+            <w:r>
+              <w:rPr>
+                <w:noProof/>
+                <w:webHidden/>
+              </w:rPr>
+              <w:fldChar w:fldCharType="end"/>
+            </w:r>
+          </w:hyperlink>
+        </w:p>
+        <w:p>
+          <w:pPr>
+            <w:pStyle w:val="TM1"/>
+            <w:tabs>
+              <w:tab w:val="left" w:pos="480"/>
+              <w:tab w:val="right" w:leader="dot" w:pos="9970"/>
+            </w:tabs>
+            <w:rPr>
+              <w:rFonts w:asciiTheme="minorHAnsi" w:eastAsiaTheme="minorEastAsia" w:hAnsiTheme="minorHAnsi" w:cstheme="minorBidi"/>
+              <w:noProof/>
+              <w:kern w:val="2"/>
+              <w:sz w:val="24"/>
+              <w:szCs w:val="24"/>
+              <w:lang w:eastAsia="fr-FR"/>
+              <w14:ligatures w14:val="standardContextual"/>
+            </w:rPr>
+          </w:pPr>
+          <w:hyperlink w:anchor="_Toc228372279" w:history="1">
+            <w:r>
+              <w:rPr>
+                <w:rStyle w:val="Lienhypertexte"/>
+                <w:noProof/>
+              </w:rPr>
+              <w:t>8.</w:t>
+            </w:r>
+            <w:r>
+              <w:rPr>
+                <w:rFonts w:asciiTheme="minorHAnsi" w:eastAsiaTheme="minorEastAsia" w:hAnsiTheme="minorHAnsi" w:cstheme="minorBidi"/>
+                <w:noProof/>
+                <w:kern w:val="2"/>
+                <w:sz w:val="24"/>
+                <w:szCs w:val="24"/>
+                <w:lang w:eastAsia="fr-FR"/>
+                <w14:ligatures w14:val="standardContextual"/>
+              </w:rPr>
+              <w:tab/>
+            </w:r>
+            <w:r>
+              <w:rPr>
+                <w:rStyle w:val="Lienhypertexte"/>
+                <w:noProof/>
+              </w:rPr>
               <w:t>Lexique</w:t>
             </w:r>
             <w:r>
@@ -2752,7 +3316,7 @@
                 <w:noProof/>
                 <w:webHidden/>
               </w:rPr>
-              <w:instrText xml:space="preserve"> PAGEREF _Toc228354373 \h </w:instrText>
+              <w:instrText xml:space="preserve"> PAGEREF _Toc228372279 \h </w:instrText>
             </w:r>
             <w:r>
               <w:rPr>
@@ -2772,7 +3336,7 @@
                 <w:noProof/>
                 <w:webHidden/>
               </w:rPr>
-              <w:t>16</w:t>
+              <w:t>20</w:t>
             </w:r>
             <w:r>
               <w:rPr>
@@ -2800,13 +3364,13 @@
               <w14:ligatures w14:val="standardContextual"/>
             </w:rPr>
           </w:pPr>
-          <w:hyperlink w:anchor="_Toc228354374" w:history="1">
+          <w:hyperlink w:anchor="_Toc228372280" w:history="1">
             <w:r>
               <w:rPr>
                 <w:rStyle w:val="Lienhypertexte"/>
                 <w:noProof/>
               </w:rPr>
-              <w:t>7.1.</w:t>
+              <w:t>8.1.</w:t>
             </w:r>
             <w:r>
               <w:rPr>
@@ -2846,7 +3410,7 @@
                 <w:noProof/>
                 <w:webHidden/>
               </w:rPr>
-              <w:instrText xml:space="preserve"> PAGEREF _Toc228354374 \h </w:instrText>
+              <w:instrText xml:space="preserve"> PAGEREF _Toc228372280 \h </w:instrText>
             </w:r>
             <w:r>
               <w:rPr>
@@ -2866,7 +3430,7 @@
                 <w:noProof/>
                 <w:webHidden/>
               </w:rPr>
-              <w:t>16</w:t>
+              <w:t>20</w:t>
             </w:r>
             <w:r>
               <w:rPr>
@@ -2894,13 +3458,13 @@
               <w14:ligatures w14:val="standardContextual"/>
             </w:rPr>
           </w:pPr>
-          <w:hyperlink w:anchor="_Toc228354375" w:history="1">
+          <w:hyperlink w:anchor="_Toc228372281" w:history="1">
             <w:r>
               <w:rPr>
                 <w:rStyle w:val="Lienhypertexte"/>
                 <w:noProof/>
               </w:rPr>
-              <w:t>7.2.</w:t>
+              <w:t>8.2.</w:t>
             </w:r>
             <w:r>
               <w:rPr>
@@ -2940,7 +3504,7 @@
                 <w:noProof/>
                 <w:webHidden/>
               </w:rPr>
-              <w:instrText xml:space="preserve"> PAGEREF _Toc228354375 \h </w:instrText>
+              <w:instrText xml:space="preserve"> PAGEREF _Toc228372281 \h </w:instrText>
             </w:r>
             <w:r>
               <w:rPr>
@@ -2960,7 +3524,7 @@
                 <w:noProof/>
                 <w:webHidden/>
               </w:rPr>
-              <w:t>16</w:t>
+              <w:t>20</w:t>
             </w:r>
             <w:r>
               <w:rPr>
@@ -2988,13 +3552,13 @@
               <w14:ligatures w14:val="standardContextual"/>
             </w:rPr>
           </w:pPr>
-          <w:hyperlink w:anchor="_Toc228354376" w:history="1">
+          <w:hyperlink w:anchor="_Toc228372282" w:history="1">
             <w:r>
               <w:rPr>
                 <w:rStyle w:val="Lienhypertexte"/>
                 <w:noProof/>
               </w:rPr>
-              <w:t>7.3.</w:t>
+              <w:t>8.3.</w:t>
             </w:r>
             <w:r>
               <w:rPr>
@@ -3034,7 +3598,7 @@
                 <w:noProof/>
                 <w:webHidden/>
               </w:rPr>
-              <w:instrText xml:space="preserve"> PAGEREF _Toc228354376 \h </w:instrText>
+              <w:instrText xml:space="preserve"> PAGEREF _Toc228372282 \h </w:instrText>
             </w:r>
             <w:r>
               <w:rPr>
@@ -3054,7 +3618,7 @@
                 <w:noProof/>
                 <w:webHidden/>
               </w:rPr>
-              <w:t>16</w:t>
+              <w:t>20</w:t>
             </w:r>
             <w:r>
               <w:rPr>
@@ -3238,9 +3802,8 @@
         </w:rPr>
       </w:pPr>
       <w:bookmarkStart w:id="1" w:name="_Toc183509429"/>
-      <w:bookmarkStart w:id="2" w:name="_Toc228354313"/>
-      <w:r>
-        <w:lastRenderedPageBreak/>
+      <w:bookmarkStart w:id="2" w:name="_Toc228372199"/>
+      <w:r>
         <w:t>Présentation Générale du Système Supportant le Proj</w:t>
       </w:r>
       <w:bookmarkEnd w:id="1"/>
@@ -3431,7 +3994,7 @@
       <w:pPr>
         <w:pStyle w:val="Titre1"/>
       </w:pPr>
-      <w:bookmarkStart w:id="3" w:name="_Toc228354314"/>
+      <w:bookmarkStart w:id="3" w:name="_Toc228372200"/>
       <w:r>
         <w:t>Cahier des charges</w:t>
       </w:r>
@@ -3443,7 +4006,7 @@
         <w:pStyle w:val="Titre2"/>
       </w:pPr>
       <w:bookmarkStart w:id="4" w:name="_Toc183509430"/>
-      <w:bookmarkStart w:id="5" w:name="_Toc228354315"/>
+      <w:bookmarkStart w:id="5" w:name="_Toc228372201"/>
       <w:r>
         <w:t xml:space="preserve">Cahier des charges - </w:t>
       </w:r>
@@ -3547,7 +4110,7 @@
       <w:pPr>
         <w:pStyle w:val="Titre2"/>
       </w:pPr>
-      <w:bookmarkStart w:id="6" w:name="_Toc228354316"/>
+      <w:bookmarkStart w:id="6" w:name="_Toc228372202"/>
       <w:r>
         <w:lastRenderedPageBreak/>
         <w:t>Diagramme des cas d’utilisation (UML)</w:t>
@@ -3563,7 +4126,7 @@
         </w:numPr>
         <w:ind w:left="360" w:hanging="360"/>
       </w:pPr>
-      <w:bookmarkStart w:id="7" w:name="_Toc228354317"/>
+      <w:bookmarkStart w:id="7" w:name="_Toc228372203"/>
       <w:r>
         <w:rPr>
           <w:noProof/>
@@ -3639,7 +4202,7 @@
         <w:pStyle w:val="Titre2"/>
       </w:pPr>
       <w:bookmarkStart w:id="8" w:name="_Toc183509431"/>
-      <w:bookmarkStart w:id="9" w:name="_Toc228354318"/>
+      <w:bookmarkStart w:id="9" w:name="_Toc228372204"/>
       <w:r>
         <w:t xml:space="preserve">Cahier des charges - </w:t>
       </w:r>
@@ -3903,7 +4466,7 @@
       <w:pPr>
         <w:pStyle w:val="Titre2"/>
       </w:pPr>
-      <w:bookmarkStart w:id="10" w:name="_Toc228354319"/>
+      <w:bookmarkStart w:id="10" w:name="_Toc228372205"/>
       <w:r>
         <w:lastRenderedPageBreak/>
         <w:t>Cahier des charges – Analyse fonctionnelle</w:t>
@@ -4097,7 +4660,7 @@
       <w:pPr>
         <w:pStyle w:val="Titre2"/>
       </w:pPr>
-      <w:bookmarkStart w:id="11" w:name="_Toc228354320"/>
+      <w:bookmarkStart w:id="11" w:name="_Toc228372206"/>
       <w:r>
         <w:rPr>
           <w:noProof/>
@@ -4304,7 +4867,7 @@
         <w:pStyle w:val="Titre2"/>
       </w:pPr>
       <w:bookmarkStart w:id="13" w:name="_Toc183509436"/>
-      <w:bookmarkStart w:id="14" w:name="_Toc228354321"/>
+      <w:bookmarkStart w:id="14" w:name="_Toc228372207"/>
       <w:bookmarkEnd w:id="12"/>
       <w:r>
         <w:t xml:space="preserve">Cahier des charges – </w:t>
@@ -4329,7 +4892,7 @@
           <w:rFonts w:eastAsia="Arial"/>
         </w:rPr>
       </w:pPr>
-      <w:bookmarkStart w:id="15" w:name="_Toc228354322"/>
+      <w:bookmarkStart w:id="15" w:name="_Toc228372208"/>
       <w:r>
         <w:rPr>
           <w:noProof/>
@@ -4413,7 +4976,7 @@
           <w:bCs/>
         </w:rPr>
       </w:pPr>
-      <w:bookmarkStart w:id="16" w:name="_Toc228354323"/>
+      <w:bookmarkStart w:id="16" w:name="_Toc228372209"/>
       <w:r>
         <w:rPr>
           <w:rStyle w:val="Titre2Car"/>
@@ -4670,6 +5233,7 @@
       <w:bookmarkStart w:id="17" w:name="_Toc228349913"/>
       <w:bookmarkStart w:id="18" w:name="_Toc228351034"/>
       <w:bookmarkStart w:id="19" w:name="_Toc228354324"/>
+      <w:bookmarkStart w:id="20" w:name="_Toc228372210"/>
       <w:r>
         <w:rPr>
           <w:rStyle w:val="Titre2Car"/>
@@ -4681,6 +5245,7 @@
       <w:bookmarkEnd w:id="17"/>
       <w:bookmarkEnd w:id="18"/>
       <w:bookmarkEnd w:id="19"/>
+      <w:bookmarkEnd w:id="20"/>
       <w:r>
         <w:rPr>
           <w:rStyle w:val="Titre2Car"/>
@@ -4782,9 +5347,10 @@
           </wp:anchor>
         </w:drawing>
       </w:r>
-      <w:bookmarkStart w:id="20" w:name="_Toc228349914"/>
-      <w:bookmarkStart w:id="21" w:name="_Toc228351035"/>
-      <w:bookmarkStart w:id="22" w:name="_Toc228354325"/>
+      <w:bookmarkStart w:id="21" w:name="_Toc228349914"/>
+      <w:bookmarkStart w:id="22" w:name="_Toc228351035"/>
+      <w:bookmarkStart w:id="23" w:name="_Toc228354325"/>
+      <w:bookmarkStart w:id="24" w:name="_Toc228372211"/>
       <w:r>
         <w:rPr>
           <w:rStyle w:val="Titre2Car"/>
@@ -4809,9 +5375,10 @@
         </w:rPr>
         <w:t>.</w:t>
       </w:r>
-      <w:bookmarkEnd w:id="20"/>
       <w:bookmarkEnd w:id="21"/>
       <w:bookmarkEnd w:id="22"/>
+      <w:bookmarkEnd w:id="23"/>
+      <w:bookmarkEnd w:id="24"/>
       <w:r>
         <w:rPr>
           <w:rStyle w:val="Titre2Car"/>
@@ -4838,9 +5405,10 @@
           <w:bCs w:val="0"/>
         </w:rPr>
       </w:pPr>
-      <w:bookmarkStart w:id="23" w:name="_Toc228349915"/>
-      <w:bookmarkStart w:id="24" w:name="_Toc228351036"/>
-      <w:bookmarkStart w:id="25" w:name="_Toc228354326"/>
+      <w:bookmarkStart w:id="25" w:name="_Toc228349915"/>
+      <w:bookmarkStart w:id="26" w:name="_Toc228351036"/>
+      <w:bookmarkStart w:id="27" w:name="_Toc228354326"/>
+      <w:bookmarkStart w:id="28" w:name="_Toc228372212"/>
       <w:r>
         <w:rPr>
           <w:rStyle w:val="Titre2Car"/>
@@ -4855,9 +5423,10 @@
         </w:rPr>
         <w:t> : Il ne faut surtout pas confondre le NFC et le RFID, le NFC découle du RFID par la norme ISO/CEI 14443. Malgré leur proximité technique, ce ne sont pas les mêmes technologies !</w:t>
       </w:r>
-      <w:bookmarkEnd w:id="23"/>
-      <w:bookmarkEnd w:id="24"/>
       <w:bookmarkEnd w:id="25"/>
+      <w:bookmarkEnd w:id="26"/>
+      <w:bookmarkEnd w:id="27"/>
+      <w:bookmarkEnd w:id="28"/>
     </w:p>
     <w:p>
       <w:pPr>
@@ -4886,7 +5455,7 @@
           <w:bCs/>
         </w:rPr>
       </w:pPr>
-      <w:bookmarkStart w:id="26" w:name="_Toc228354327"/>
+      <w:bookmarkStart w:id="29" w:name="_Toc228372213"/>
       <w:r>
         <w:rPr>
           <w:rStyle w:val="Titre2Car"/>
@@ -4895,7 +5464,7 @@
         </w:rPr>
         <w:t>Différence entre le RFID et le NFC</w:t>
       </w:r>
-      <w:bookmarkEnd w:id="26"/>
+      <w:bookmarkEnd w:id="29"/>
     </w:p>
     <w:p>
       <w:pPr>
@@ -4914,9 +5483,10 @@
           <w:bCs w:val="0"/>
         </w:rPr>
       </w:pPr>
-      <w:bookmarkStart w:id="27" w:name="_Toc228349917"/>
-      <w:bookmarkStart w:id="28" w:name="_Toc228351038"/>
-      <w:bookmarkStart w:id="29" w:name="_Toc228354328"/>
+      <w:bookmarkStart w:id="30" w:name="_Toc228349917"/>
+      <w:bookmarkStart w:id="31" w:name="_Toc228351038"/>
+      <w:bookmarkStart w:id="32" w:name="_Toc228354328"/>
+      <w:bookmarkStart w:id="33" w:name="_Toc228372214"/>
       <w:r>
         <w:rPr>
           <w:rStyle w:val="Titre2Car"/>
@@ -4924,60 +5494,11 @@
           <w:bCs w:val="0"/>
         </w:rPr>
         <w:t>Malgré leur proximité technique, ces technologies sont différentes, le NFC est une technologie de communication de très courte portée (généralement 10cm maximum selon le type de norme utilisé.</w:t>
-      </w:r>
-      <w:bookmarkEnd w:id="27"/>
-      <w:bookmarkEnd w:id="28"/>
-      <w:bookmarkEnd w:id="29"/>
-    </w:p>
-    <w:p>
-      <w:pPr>
-        <w:rPr>
-          <w:rStyle w:val="Titre2Car"/>
-          <w:b w:val="0"/>
-          <w:bCs w:val="0"/>
-        </w:rPr>
-      </w:pPr>
-    </w:p>
-    <w:p>
-      <w:pPr>
-        <w:rPr>
-          <w:rStyle w:val="Titre2Car"/>
-          <w:b w:val="0"/>
-          <w:bCs w:val="0"/>
-        </w:rPr>
-      </w:pPr>
-      <w:bookmarkStart w:id="30" w:name="_Toc228349918"/>
-      <w:bookmarkStart w:id="31" w:name="_Toc228351039"/>
-      <w:bookmarkStart w:id="32" w:name="_Toc228354329"/>
-      <w:r>
-        <w:rPr>
-          <w:rStyle w:val="Titre2Car"/>
-          <w:b w:val="0"/>
-          <w:bCs w:val="0"/>
-        </w:rPr>
-        <w:t xml:space="preserve">C’est également une technologie dite « bidirectionnelle », un appareil NFC peut agir </w:t>
-      </w:r>
-      <w:proofErr w:type="gramStart"/>
-      <w:r>
-        <w:rPr>
-          <w:rStyle w:val="Titre2Car"/>
-          <w:b w:val="0"/>
-          <w:bCs w:val="0"/>
-        </w:rPr>
-        <w:t>a</w:t>
-      </w:r>
-      <w:proofErr w:type="gramEnd"/>
-      <w:r>
-        <w:rPr>
-          <w:rStyle w:val="Titre2Car"/>
-          <w:b w:val="0"/>
-          <w:bCs w:val="0"/>
-        </w:rPr>
-        <w:t xml:space="preserve"> la fois comme un lecteur et comme une étiquette. Dans le cadre de la téléphonie, cela permet l’échange de données entre 2 téléphones (envoie de fichiers, partage de contacts…)</w:t>
       </w:r>
       <w:bookmarkEnd w:id="30"/>
       <w:bookmarkEnd w:id="31"/>
       <w:bookmarkEnd w:id="32"/>
+      <w:bookmarkEnd w:id="33"/>
     </w:p>
     <w:p>
       <w:pPr>
@@ -4996,20 +5517,40 @@
           <w:bCs w:val="0"/>
         </w:rPr>
       </w:pPr>
-      <w:bookmarkStart w:id="33" w:name="_Toc228349919"/>
-      <w:bookmarkStart w:id="34" w:name="_Toc228351040"/>
-      <w:bookmarkStart w:id="35" w:name="_Toc228354330"/>
+      <w:bookmarkStart w:id="34" w:name="_Toc228349918"/>
+      <w:bookmarkStart w:id="35" w:name="_Toc228351039"/>
+      <w:bookmarkStart w:id="36" w:name="_Toc228354329"/>
+      <w:bookmarkStart w:id="37" w:name="_Toc228372215"/>
       <w:r>
         <w:rPr>
           <w:rStyle w:val="Titre2Car"/>
           <w:b w:val="0"/>
           <w:bCs w:val="0"/>
         </w:rPr>
-        <w:t>Le RFID quand a lui est une technologie de communication a longue portée, selon sa fréquence (basse, haute ou ultra-haute), il peut fonctionner de quelques centimètres a plus de 100 mètres.</w:t>
-      </w:r>
-      <w:bookmarkEnd w:id="33"/>
+        <w:t xml:space="preserve">C’est également une technologie dite « bidirectionnelle », un appareil NFC peut agir </w:t>
+      </w:r>
+      <w:proofErr w:type="gramStart"/>
+      <w:r>
+        <w:rPr>
+          <w:rStyle w:val="Titre2Car"/>
+          <w:b w:val="0"/>
+          <w:bCs w:val="0"/>
+        </w:rPr>
+        <w:t>a</w:t>
+      </w:r>
+      <w:proofErr w:type="gramEnd"/>
+      <w:r>
+        <w:rPr>
+          <w:rStyle w:val="Titre2Car"/>
+          <w:b w:val="0"/>
+          <w:bCs w:val="0"/>
+        </w:rPr>
+        <w:t xml:space="preserve"> la fois comme un lecteur et comme une étiquette. Dans le cadre de la téléphonie, cela permet l’échange de données entre 2 téléphones (envoie de fichiers, partage de contacts…)</w:t>
+      </w:r>
       <w:bookmarkEnd w:id="34"/>
       <w:bookmarkEnd w:id="35"/>
+      <w:bookmarkEnd w:id="36"/>
+      <w:bookmarkEnd w:id="37"/>
     </w:p>
     <w:p>
       <w:pPr>
@@ -5028,97 +5569,19 @@
           <w:bCs w:val="0"/>
         </w:rPr>
       </w:pPr>
-      <w:bookmarkStart w:id="36" w:name="_Toc228349920"/>
-      <w:bookmarkStart w:id="37" w:name="_Toc228351041"/>
-      <w:bookmarkStart w:id="38" w:name="_Toc228354331"/>
+      <w:bookmarkStart w:id="38" w:name="_Toc228349919"/>
+      <w:bookmarkStart w:id="39" w:name="_Toc228351040"/>
+      <w:bookmarkStart w:id="40" w:name="_Toc228354330"/>
+      <w:bookmarkStart w:id="41" w:name="_Toc228372216"/>
       <w:r>
         <w:rPr>
           <w:rStyle w:val="Titre2Car"/>
           <w:b w:val="0"/>
           <w:bCs w:val="0"/>
         </w:rPr>
-        <w:t xml:space="preserve">Contrairement au NFC qui est une technologie de communication bidirectionnelle, le RFID est une technologie de communication « unidirectionnelle ». Le RFID est un système « Maître/Esclave ». Un lecteur envoie un signal a une </w:t>
-      </w:r>
-      <w:r>
-        <w:rPr>
-          <w:rStyle w:val="Titre2Car"/>
-          <w:b w:val="0"/>
-          <w:bCs w:val="0"/>
-        </w:rPr>
-        <w:t>étiquette</w:t>
-      </w:r>
-      <w:r>
-        <w:rPr>
-          <w:rStyle w:val="Titre2Car"/>
-          <w:b w:val="0"/>
-          <w:bCs w:val="0"/>
-        </w:rPr>
-        <w:t xml:space="preserve"> (un tag) passive. Le tag ne </w:t>
-      </w:r>
-      <w:r>
-        <w:rPr>
-          <w:rStyle w:val="Titre2Car"/>
-          <w:b w:val="0"/>
-          <w:bCs w:val="0"/>
-        </w:rPr>
-        <w:t>peut</w:t>
-      </w:r>
-      <w:r>
-        <w:rPr>
-          <w:rStyle w:val="Titre2Car"/>
-          <w:b w:val="0"/>
-          <w:bCs w:val="0"/>
-        </w:rPr>
-        <w:t xml:space="preserve"> pas lire le lecteur. Dans le cadre de la vie courante, le RFID est très utilisé par exemple avec les badges pour rentrer dans une </w:t>
-      </w:r>
-      <w:r>
-        <w:rPr>
-          <w:rStyle w:val="Titre2Car"/>
-          <w:b w:val="0"/>
-          <w:bCs w:val="0"/>
-        </w:rPr>
-        <w:t>résidence</w:t>
-      </w:r>
-      <w:r>
-        <w:rPr>
-          <w:rStyle w:val="Titre2Car"/>
-          <w:b w:val="0"/>
-          <w:bCs w:val="0"/>
-        </w:rPr>
-        <w:t>, le tag (qui est la borne ou on pose son badge) est passif dans le système</w:t>
-      </w:r>
-      <w:bookmarkEnd w:id="36"/>
-      <w:bookmarkEnd w:id="37"/>
+        <w:t>Le RFID quand a lui est une technologie de communication a longue portée, selon sa fréquence (basse, haute ou ultra-haute), il peut fonctionner de quelques centimètres a plus de 100 mètres.</w:t>
+      </w:r>
       <w:bookmarkEnd w:id="38"/>
-    </w:p>
-    <w:p>
-      <w:pPr>
-        <w:rPr>
-          <w:rStyle w:val="Titre2Car"/>
-          <w:b w:val="0"/>
-          <w:bCs w:val="0"/>
-        </w:rPr>
-      </w:pPr>
-    </w:p>
-    <w:p>
-      <w:pPr>
-        <w:rPr>
-          <w:rStyle w:val="Titre2Car"/>
-          <w:b w:val="0"/>
-          <w:bCs w:val="0"/>
-        </w:rPr>
-      </w:pPr>
-      <w:bookmarkStart w:id="39" w:name="_Toc228349921"/>
-      <w:bookmarkStart w:id="40" w:name="_Toc228351042"/>
-      <w:bookmarkStart w:id="41" w:name="_Toc228354332"/>
-      <w:r>
-        <w:rPr>
-          <w:rStyle w:val="Titre2Car"/>
-          <w:b w:val="0"/>
-          <w:bCs w:val="0"/>
-        </w:rPr>
-        <w:t>Pour résumer :</w:t>
-      </w:r>
       <w:bookmarkEnd w:id="39"/>
       <w:bookmarkEnd w:id="40"/>
       <w:bookmarkEnd w:id="41"/>
@@ -5140,20 +5603,138 @@
           <w:bCs w:val="0"/>
         </w:rPr>
       </w:pPr>
-      <w:bookmarkStart w:id="42" w:name="_Toc228349922"/>
-      <w:bookmarkStart w:id="43" w:name="_Toc228351043"/>
-      <w:bookmarkStart w:id="44" w:name="_Toc228354333"/>
+      <w:bookmarkStart w:id="42" w:name="_Toc228349920"/>
+      <w:bookmarkStart w:id="43" w:name="_Toc228351041"/>
+      <w:bookmarkStart w:id="44" w:name="_Toc228354331"/>
+      <w:bookmarkStart w:id="45" w:name="_Toc228372217"/>
       <w:r>
         <w:rPr>
           <w:rStyle w:val="Titre2Car"/>
           <w:b w:val="0"/>
           <w:bCs w:val="0"/>
         </w:rPr>
-        <w:t>Le RFID sert à :</w:t>
+        <w:t xml:space="preserve">Contrairement au NFC qui est une technologie de communication bidirectionnelle, le RFID est une technologie de communication « unidirectionnelle ». Le RFID est un système « Maître/Esclave ». Un lecteur envoie un signal a une </w:t>
+      </w:r>
+      <w:r>
+        <w:rPr>
+          <w:rStyle w:val="Titre2Car"/>
+          <w:b w:val="0"/>
+          <w:bCs w:val="0"/>
+        </w:rPr>
+        <w:t>étiquette</w:t>
+      </w:r>
+      <w:r>
+        <w:rPr>
+          <w:rStyle w:val="Titre2Car"/>
+          <w:b w:val="0"/>
+          <w:bCs w:val="0"/>
+        </w:rPr>
+        <w:t xml:space="preserve"> (un tag) passive. Le tag ne </w:t>
+      </w:r>
+      <w:r>
+        <w:rPr>
+          <w:rStyle w:val="Titre2Car"/>
+          <w:b w:val="0"/>
+          <w:bCs w:val="0"/>
+        </w:rPr>
+        <w:t>peut</w:t>
+      </w:r>
+      <w:r>
+        <w:rPr>
+          <w:rStyle w:val="Titre2Car"/>
+          <w:b w:val="0"/>
+          <w:bCs w:val="0"/>
+        </w:rPr>
+        <w:t xml:space="preserve"> pas lire le lecteur. Dans le cadre de la vie courante, le RFID est très utilisé par exemple avec les badges pour rentrer dans une </w:t>
+      </w:r>
+      <w:r>
+        <w:rPr>
+          <w:rStyle w:val="Titre2Car"/>
+          <w:b w:val="0"/>
+          <w:bCs w:val="0"/>
+        </w:rPr>
+        <w:t>résidence</w:t>
+      </w:r>
+      <w:r>
+        <w:rPr>
+          <w:rStyle w:val="Titre2Car"/>
+          <w:b w:val="0"/>
+          <w:bCs w:val="0"/>
+        </w:rPr>
+        <w:t>, le tag (qui est la borne ou on pose son badge) est passif dans le système</w:t>
       </w:r>
       <w:bookmarkEnd w:id="42"/>
       <w:bookmarkEnd w:id="43"/>
       <w:bookmarkEnd w:id="44"/>
+      <w:bookmarkEnd w:id="45"/>
+    </w:p>
+    <w:p>
+      <w:pPr>
+        <w:rPr>
+          <w:rStyle w:val="Titre2Car"/>
+          <w:b w:val="0"/>
+          <w:bCs w:val="0"/>
+        </w:rPr>
+      </w:pPr>
+    </w:p>
+    <w:p>
+      <w:pPr>
+        <w:rPr>
+          <w:rStyle w:val="Titre2Car"/>
+          <w:b w:val="0"/>
+          <w:bCs w:val="0"/>
+        </w:rPr>
+      </w:pPr>
+      <w:bookmarkStart w:id="46" w:name="_Toc228349921"/>
+      <w:bookmarkStart w:id="47" w:name="_Toc228351042"/>
+      <w:bookmarkStart w:id="48" w:name="_Toc228354332"/>
+      <w:bookmarkStart w:id="49" w:name="_Toc228372218"/>
+      <w:r>
+        <w:rPr>
+          <w:rStyle w:val="Titre2Car"/>
+          <w:b w:val="0"/>
+          <w:bCs w:val="0"/>
+        </w:rPr>
+        <w:t>Pour résumer :</w:t>
+      </w:r>
+      <w:bookmarkEnd w:id="46"/>
+      <w:bookmarkEnd w:id="47"/>
+      <w:bookmarkEnd w:id="48"/>
+      <w:bookmarkEnd w:id="49"/>
+    </w:p>
+    <w:p>
+      <w:pPr>
+        <w:rPr>
+          <w:rStyle w:val="Titre2Car"/>
+          <w:b w:val="0"/>
+          <w:bCs w:val="0"/>
+        </w:rPr>
+      </w:pPr>
+    </w:p>
+    <w:p>
+      <w:pPr>
+        <w:rPr>
+          <w:rStyle w:val="Titre2Car"/>
+          <w:b w:val="0"/>
+          <w:bCs w:val="0"/>
+        </w:rPr>
+      </w:pPr>
+      <w:bookmarkStart w:id="50" w:name="_Toc228349922"/>
+      <w:bookmarkStart w:id="51" w:name="_Toc228351043"/>
+      <w:bookmarkStart w:id="52" w:name="_Toc228354333"/>
+      <w:bookmarkStart w:id="53" w:name="_Toc228372219"/>
+      <w:r>
+        <w:rPr>
+          <w:rStyle w:val="Titre2Car"/>
+          <w:b w:val="0"/>
+          <w:bCs w:val="0"/>
+        </w:rPr>
+        <w:t>Le RFID sert à :</w:t>
+      </w:r>
+      <w:bookmarkEnd w:id="50"/>
+      <w:bookmarkEnd w:id="51"/>
+      <w:bookmarkEnd w:id="52"/>
+      <w:bookmarkEnd w:id="53"/>
       <w:r>
         <w:rPr>
           <w:rStyle w:val="Titre2Car"/>
@@ -5185,9 +5766,10 @@
           <w:bCs w:val="0"/>
         </w:rPr>
       </w:pPr>
-      <w:bookmarkStart w:id="45" w:name="_Toc228349923"/>
-      <w:bookmarkStart w:id="46" w:name="_Toc228351044"/>
-      <w:bookmarkStart w:id="47" w:name="_Toc228354334"/>
+      <w:bookmarkStart w:id="54" w:name="_Toc228349923"/>
+      <w:bookmarkStart w:id="55" w:name="_Toc228351044"/>
+      <w:bookmarkStart w:id="56" w:name="_Toc228354334"/>
+      <w:bookmarkStart w:id="57" w:name="_Toc228372220"/>
       <w:r>
         <w:rPr>
           <w:rStyle w:val="Titre2Car"/>
@@ -5196,9 +5778,10 @@
         </w:rPr>
         <w:t>Logistique : suivi des palettes dans un entrepôt</w:t>
       </w:r>
-      <w:bookmarkEnd w:id="45"/>
-      <w:bookmarkEnd w:id="46"/>
-      <w:bookmarkEnd w:id="47"/>
+      <w:bookmarkEnd w:id="54"/>
+      <w:bookmarkEnd w:id="55"/>
+      <w:bookmarkEnd w:id="56"/>
+      <w:bookmarkEnd w:id="57"/>
       <w:r>
         <w:rPr>
           <w:rStyle w:val="Titre2Car"/>
@@ -5221,9 +5804,10 @@
           <w:bCs w:val="0"/>
         </w:rPr>
       </w:pPr>
-      <w:bookmarkStart w:id="48" w:name="_Toc228349924"/>
-      <w:bookmarkStart w:id="49" w:name="_Toc228351045"/>
-      <w:bookmarkStart w:id="50" w:name="_Toc228354335"/>
+      <w:bookmarkStart w:id="58" w:name="_Toc228349924"/>
+      <w:bookmarkStart w:id="59" w:name="_Toc228351045"/>
+      <w:bookmarkStart w:id="60" w:name="_Toc228354335"/>
+      <w:bookmarkStart w:id="61" w:name="_Toc228372221"/>
       <w:r>
         <w:rPr>
           <w:rStyle w:val="Titre2Car"/>
@@ -5232,9 +5816,10 @@
         </w:rPr>
         <w:t>Péages : Badges de télépéage</w:t>
       </w:r>
-      <w:bookmarkEnd w:id="48"/>
-      <w:bookmarkEnd w:id="49"/>
-      <w:bookmarkEnd w:id="50"/>
+      <w:bookmarkEnd w:id="58"/>
+      <w:bookmarkEnd w:id="59"/>
+      <w:bookmarkEnd w:id="60"/>
+      <w:bookmarkEnd w:id="61"/>
       <w:r>
         <w:rPr>
           <w:rStyle w:val="Titre2Car"/>
@@ -5257,9 +5842,10 @@
           <w:bCs w:val="0"/>
         </w:rPr>
       </w:pPr>
-      <w:bookmarkStart w:id="51" w:name="_Toc228349925"/>
-      <w:bookmarkStart w:id="52" w:name="_Toc228351046"/>
-      <w:bookmarkStart w:id="53" w:name="_Toc228354336"/>
+      <w:bookmarkStart w:id="62" w:name="_Toc228349925"/>
+      <w:bookmarkStart w:id="63" w:name="_Toc228351046"/>
+      <w:bookmarkStart w:id="64" w:name="_Toc228354336"/>
+      <w:bookmarkStart w:id="65" w:name="_Toc228372222"/>
       <w:r>
         <w:rPr>
           <w:rStyle w:val="Titre2Car"/>
@@ -5294,9 +5880,10 @@
         </w:rPr>
         <w:t>.</w:t>
       </w:r>
-      <w:bookmarkEnd w:id="51"/>
-      <w:bookmarkEnd w:id="52"/>
-      <w:bookmarkEnd w:id="53"/>
+      <w:bookmarkEnd w:id="62"/>
+      <w:bookmarkEnd w:id="63"/>
+      <w:bookmarkEnd w:id="64"/>
+      <w:bookmarkEnd w:id="65"/>
       <w:r>
         <w:rPr>
           <w:rStyle w:val="Titre2Car"/>
@@ -5336,9 +5923,10 @@
           <w:bCs w:val="0"/>
         </w:rPr>
       </w:pPr>
-      <w:bookmarkStart w:id="54" w:name="_Toc228349926"/>
-      <w:bookmarkStart w:id="55" w:name="_Toc228351047"/>
-      <w:bookmarkStart w:id="56" w:name="_Toc228354337"/>
+      <w:bookmarkStart w:id="66" w:name="_Toc228349926"/>
+      <w:bookmarkStart w:id="67" w:name="_Toc228351047"/>
+      <w:bookmarkStart w:id="68" w:name="_Toc228354337"/>
+      <w:bookmarkStart w:id="69" w:name="_Toc228372223"/>
       <w:r>
         <w:rPr>
           <w:rStyle w:val="Titre2Car"/>
@@ -5348,9 +5936,10 @@
         <w:lastRenderedPageBreak/>
         <w:t>Le NFC sert à :</w:t>
       </w:r>
-      <w:bookmarkEnd w:id="54"/>
-      <w:bookmarkEnd w:id="55"/>
-      <w:bookmarkEnd w:id="56"/>
+      <w:bookmarkEnd w:id="66"/>
+      <w:bookmarkEnd w:id="67"/>
+      <w:bookmarkEnd w:id="68"/>
+      <w:bookmarkEnd w:id="69"/>
     </w:p>
     <w:p>
       <w:pPr>
@@ -5374,9 +5963,10 @@
           <w:bCs w:val="0"/>
         </w:rPr>
       </w:pPr>
-      <w:bookmarkStart w:id="57" w:name="_Toc228349927"/>
-      <w:bookmarkStart w:id="58" w:name="_Toc228351048"/>
-      <w:bookmarkStart w:id="59" w:name="_Toc228354338"/>
+      <w:bookmarkStart w:id="70" w:name="_Toc228349927"/>
+      <w:bookmarkStart w:id="71" w:name="_Toc228351048"/>
+      <w:bookmarkStart w:id="72" w:name="_Toc228354338"/>
+      <w:bookmarkStart w:id="73" w:name="_Toc228372224"/>
       <w:r>
         <w:rPr>
           <w:rStyle w:val="Titre2Car"/>
@@ -5385,9 +5975,10 @@
         </w:rPr>
         <w:t>Paiement mobile : Apple Pay, Google Pay, cartes bancaires sans contact</w:t>
       </w:r>
-      <w:bookmarkEnd w:id="57"/>
-      <w:bookmarkEnd w:id="58"/>
-      <w:bookmarkEnd w:id="59"/>
+      <w:bookmarkEnd w:id="70"/>
+      <w:bookmarkEnd w:id="71"/>
+      <w:bookmarkEnd w:id="72"/>
+      <w:bookmarkEnd w:id="73"/>
     </w:p>
     <w:p>
       <w:pPr>
@@ -5402,9 +5993,10 @@
           <w:bCs w:val="0"/>
         </w:rPr>
       </w:pPr>
-      <w:bookmarkStart w:id="60" w:name="_Toc228349928"/>
-      <w:bookmarkStart w:id="61" w:name="_Toc228351049"/>
-      <w:bookmarkStart w:id="62" w:name="_Toc228354339"/>
+      <w:bookmarkStart w:id="74" w:name="_Toc228349928"/>
+      <w:bookmarkStart w:id="75" w:name="_Toc228351049"/>
+      <w:bookmarkStart w:id="76" w:name="_Toc228354339"/>
+      <w:bookmarkStart w:id="77" w:name="_Toc228372225"/>
       <w:r>
         <w:rPr>
           <w:rStyle w:val="Titre2Car"/>
@@ -5413,9 +6005,10 @@
         </w:rPr>
         <w:t>Contrôle d’accès : Badge de bureau, carte de transport</w:t>
       </w:r>
-      <w:bookmarkEnd w:id="60"/>
-      <w:bookmarkEnd w:id="61"/>
-      <w:bookmarkEnd w:id="62"/>
+      <w:bookmarkEnd w:id="74"/>
+      <w:bookmarkEnd w:id="75"/>
+      <w:bookmarkEnd w:id="76"/>
+      <w:bookmarkEnd w:id="77"/>
       <w:r>
         <w:rPr>
           <w:rStyle w:val="Titre2Car"/>
@@ -5438,9 +6031,10 @@
           <w:bCs w:val="0"/>
         </w:rPr>
       </w:pPr>
-      <w:bookmarkStart w:id="63" w:name="_Toc228349929"/>
-      <w:bookmarkStart w:id="64" w:name="_Toc228351050"/>
-      <w:bookmarkStart w:id="65" w:name="_Toc228354340"/>
+      <w:bookmarkStart w:id="78" w:name="_Toc228349929"/>
+      <w:bookmarkStart w:id="79" w:name="_Toc228351050"/>
+      <w:bookmarkStart w:id="80" w:name="_Toc228354340"/>
+      <w:bookmarkStart w:id="81" w:name="_Toc228372226"/>
       <w:r>
         <w:rPr>
           <w:rStyle w:val="Titre2Car"/>
@@ -5449,9 +6043,10 @@
         </w:rPr>
         <w:t>Appairage rapide : Connecter un casque Bluetooth a son téléphone sans le brancher</w:t>
       </w:r>
-      <w:bookmarkEnd w:id="63"/>
-      <w:bookmarkEnd w:id="64"/>
-      <w:bookmarkEnd w:id="65"/>
+      <w:bookmarkEnd w:id="78"/>
+      <w:bookmarkEnd w:id="79"/>
+      <w:bookmarkEnd w:id="80"/>
+      <w:bookmarkEnd w:id="81"/>
     </w:p>
     <w:p>
       <w:pPr>
@@ -5471,8 +6066,8 @@
           <w:bCs/>
         </w:rPr>
       </w:pPr>
-      <w:bookmarkStart w:id="66" w:name="_Toc228349930"/>
-      <w:bookmarkStart w:id="67" w:name="_Toc228354341"/>
+      <w:bookmarkStart w:id="82" w:name="_Toc228349930"/>
+      <w:bookmarkStart w:id="83" w:name="_Toc228372227"/>
       <w:r>
         <w:rPr>
           <w:rStyle w:val="Titre2Car"/>
@@ -5481,8 +6076,8 @@
         </w:rPr>
         <w:t>Les différentes normes de la technologie NFC</w:t>
       </w:r>
-      <w:bookmarkEnd w:id="66"/>
-      <w:bookmarkEnd w:id="67"/>
+      <w:bookmarkEnd w:id="82"/>
+      <w:bookmarkEnd w:id="83"/>
     </w:p>
     <w:p/>
     <w:p>
@@ -5648,18 +6243,20 @@
           <w:rStyle w:val="Titre2Car"/>
         </w:rPr>
       </w:pPr>
-      <w:bookmarkStart w:id="68" w:name="_Toc228349931"/>
-      <w:bookmarkStart w:id="69" w:name="_Toc228351052"/>
-      <w:bookmarkStart w:id="70" w:name="_Toc228354342"/>
+      <w:bookmarkStart w:id="84" w:name="_Toc228349931"/>
+      <w:bookmarkStart w:id="85" w:name="_Toc228351052"/>
+      <w:bookmarkStart w:id="86" w:name="_Toc228354342"/>
+      <w:bookmarkStart w:id="87" w:name="_Toc228372228"/>
       <w:r>
         <w:rPr>
           <w:rStyle w:val="Titre2Car"/>
         </w:rPr>
         <w:t>Les Normes de Compatibilité (Héritage RFID)</w:t>
       </w:r>
-      <w:bookmarkEnd w:id="68"/>
-      <w:bookmarkEnd w:id="69"/>
-      <w:bookmarkEnd w:id="70"/>
+      <w:bookmarkEnd w:id="84"/>
+      <w:bookmarkEnd w:id="85"/>
+      <w:bookmarkEnd w:id="86"/>
+      <w:bookmarkEnd w:id="87"/>
     </w:p>
     <w:p>
       <w:pPr>
@@ -5674,9 +6271,10 @@
           <w:bCs w:val="0"/>
         </w:rPr>
       </w:pPr>
-      <w:bookmarkStart w:id="71" w:name="_Toc228349932"/>
-      <w:bookmarkStart w:id="72" w:name="_Toc228351053"/>
-      <w:bookmarkStart w:id="73" w:name="_Toc228354343"/>
+      <w:bookmarkStart w:id="88" w:name="_Toc228349932"/>
+      <w:bookmarkStart w:id="89" w:name="_Toc228351053"/>
+      <w:bookmarkStart w:id="90" w:name="_Toc228354343"/>
+      <w:bookmarkStart w:id="91" w:name="_Toc228372229"/>
       <w:r>
         <w:rPr>
           <w:rStyle w:val="Titre2Car"/>
@@ -5685,9 +6283,10 @@
         </w:rPr>
         <w:t>ISO/IEC 14443 (Type A &amp; B)</w:t>
       </w:r>
-      <w:bookmarkEnd w:id="71"/>
-      <w:bookmarkEnd w:id="72"/>
-      <w:bookmarkEnd w:id="73"/>
+      <w:bookmarkEnd w:id="88"/>
+      <w:bookmarkEnd w:id="89"/>
+      <w:bookmarkEnd w:id="90"/>
+      <w:bookmarkEnd w:id="91"/>
     </w:p>
     <w:p>
       <w:pPr>
@@ -5702,9 +6301,10 @@
           <w:bCs w:val="0"/>
         </w:rPr>
       </w:pPr>
-      <w:bookmarkStart w:id="74" w:name="_Toc228349933"/>
-      <w:bookmarkStart w:id="75" w:name="_Toc228351054"/>
-      <w:bookmarkStart w:id="76" w:name="_Toc228354344"/>
+      <w:bookmarkStart w:id="92" w:name="_Toc228349933"/>
+      <w:bookmarkStart w:id="93" w:name="_Toc228351054"/>
+      <w:bookmarkStart w:id="94" w:name="_Toc228354344"/>
+      <w:bookmarkStart w:id="95" w:name="_Toc228372230"/>
       <w:r>
         <w:rPr>
           <w:rStyle w:val="Titre2Car"/>
@@ -5713,9 +6313,10 @@
         </w:rPr>
         <w:t>Norme utilisée par les cartes de transports et cartes de paiement. Elle est la base de la plupart des tags</w:t>
       </w:r>
-      <w:bookmarkEnd w:id="74"/>
-      <w:bookmarkEnd w:id="75"/>
-      <w:bookmarkEnd w:id="76"/>
+      <w:bookmarkEnd w:id="92"/>
+      <w:bookmarkEnd w:id="93"/>
+      <w:bookmarkEnd w:id="94"/>
+      <w:bookmarkEnd w:id="95"/>
       <w:r>
         <w:rPr>
           <w:rStyle w:val="Titre2Car"/>
@@ -5746,9 +6347,10 @@
           <w:bCs w:val="0"/>
         </w:rPr>
       </w:pPr>
-      <w:bookmarkStart w:id="77" w:name="_Toc228349934"/>
-      <w:bookmarkStart w:id="78" w:name="_Toc228351055"/>
-      <w:bookmarkStart w:id="79" w:name="_Toc228354345"/>
+      <w:bookmarkStart w:id="96" w:name="_Toc228349934"/>
+      <w:bookmarkStart w:id="97" w:name="_Toc228351055"/>
+      <w:bookmarkStart w:id="98" w:name="_Toc228354345"/>
+      <w:bookmarkStart w:id="99" w:name="_Toc228372231"/>
       <w:r>
         <w:rPr>
           <w:rStyle w:val="Titre2Car"/>
@@ -5757,9 +6359,10 @@
         </w:rPr>
         <w:t>ISO/IEC 15693</w:t>
       </w:r>
-      <w:bookmarkEnd w:id="77"/>
-      <w:bookmarkEnd w:id="78"/>
-      <w:bookmarkEnd w:id="79"/>
+      <w:bookmarkEnd w:id="96"/>
+      <w:bookmarkEnd w:id="97"/>
+      <w:bookmarkEnd w:id="98"/>
+      <w:bookmarkEnd w:id="99"/>
     </w:p>
     <w:p>
       <w:pPr>
@@ -5774,9 +6377,10 @@
           <w:bCs w:val="0"/>
         </w:rPr>
       </w:pPr>
-      <w:bookmarkStart w:id="80" w:name="_Toc228349935"/>
-      <w:bookmarkStart w:id="81" w:name="_Toc228351056"/>
-      <w:bookmarkStart w:id="82" w:name="_Toc228354346"/>
+      <w:bookmarkStart w:id="100" w:name="_Toc228349935"/>
+      <w:bookmarkStart w:id="101" w:name="_Toc228351056"/>
+      <w:bookmarkStart w:id="102" w:name="_Toc228354346"/>
+      <w:bookmarkStart w:id="103" w:name="_Toc228372232"/>
       <w:r>
         <w:rPr>
           <w:rStyle w:val="Titre2Car"/>
@@ -5785,9 +6389,10 @@
         </w:rPr>
         <w:t>Concerne les tags dits «</w:t>
       </w:r>
-      <w:bookmarkEnd w:id="80"/>
-      <w:bookmarkEnd w:id="81"/>
-      <w:bookmarkEnd w:id="82"/>
+      <w:bookmarkEnd w:id="100"/>
+      <w:bookmarkEnd w:id="101"/>
+      <w:bookmarkEnd w:id="102"/>
+      <w:bookmarkEnd w:id="103"/>
       <w:r>
         <w:rPr>
           <w:rStyle w:val="Titre2Car"/>
@@ -5826,9 +6431,10 @@
           <w:bCs w:val="0"/>
         </w:rPr>
       </w:pPr>
-      <w:bookmarkStart w:id="83" w:name="_Toc228349936"/>
-      <w:bookmarkStart w:id="84" w:name="_Toc228351057"/>
-      <w:bookmarkStart w:id="85" w:name="_Toc228354347"/>
+      <w:bookmarkStart w:id="104" w:name="_Toc228349936"/>
+      <w:bookmarkStart w:id="105" w:name="_Toc228351057"/>
+      <w:bookmarkStart w:id="106" w:name="_Toc228354347"/>
+      <w:bookmarkStart w:id="107" w:name="_Toc228372233"/>
       <w:r>
         <w:rPr>
           <w:rStyle w:val="Titre2Car"/>
@@ -5837,9 +6443,10 @@
         </w:rPr>
         <w:t>ISO/IEC 18000-3</w:t>
       </w:r>
-      <w:bookmarkEnd w:id="83"/>
-      <w:bookmarkEnd w:id="84"/>
-      <w:bookmarkEnd w:id="85"/>
+      <w:bookmarkEnd w:id="104"/>
+      <w:bookmarkEnd w:id="105"/>
+      <w:bookmarkEnd w:id="106"/>
+      <w:bookmarkEnd w:id="107"/>
     </w:p>
     <w:p>
       <w:pPr>
@@ -5854,9 +6461,10 @@
           <w:bCs w:val="0"/>
         </w:rPr>
       </w:pPr>
-      <w:bookmarkStart w:id="86" w:name="_Toc228349937"/>
-      <w:bookmarkStart w:id="87" w:name="_Toc228351058"/>
-      <w:bookmarkStart w:id="88" w:name="_Toc228354348"/>
+      <w:bookmarkStart w:id="108" w:name="_Toc228349937"/>
+      <w:bookmarkStart w:id="109" w:name="_Toc228351058"/>
+      <w:bookmarkStart w:id="110" w:name="_Toc228354348"/>
+      <w:bookmarkStart w:id="111" w:name="_Toc228372234"/>
       <w:r>
         <w:rPr>
           <w:rStyle w:val="Titre2Car"/>
@@ -5881,9 +6489,10 @@
         </w:rPr>
         <w:t xml:space="preserve"> 13.56 MHz de manière plus globale</w:t>
       </w:r>
-      <w:bookmarkEnd w:id="86"/>
-      <w:bookmarkEnd w:id="87"/>
-      <w:bookmarkEnd w:id="88"/>
+      <w:bookmarkEnd w:id="108"/>
+      <w:bookmarkEnd w:id="109"/>
+      <w:bookmarkEnd w:id="110"/>
+      <w:bookmarkEnd w:id="111"/>
     </w:p>
     <w:p>
       <w:pPr>
@@ -5907,18 +6516,20 @@
           <w:rStyle w:val="Titre2Car"/>
         </w:rPr>
       </w:pPr>
-      <w:bookmarkStart w:id="89" w:name="_Toc228349938"/>
-      <w:bookmarkStart w:id="90" w:name="_Toc228351059"/>
-      <w:bookmarkStart w:id="91" w:name="_Toc228354349"/>
+      <w:bookmarkStart w:id="112" w:name="_Toc228349938"/>
+      <w:bookmarkStart w:id="113" w:name="_Toc228351059"/>
+      <w:bookmarkStart w:id="114" w:name="_Toc228354349"/>
+      <w:bookmarkStart w:id="115" w:name="_Toc228372235"/>
       <w:r>
         <w:rPr>
           <w:rStyle w:val="Titre2Car"/>
         </w:rPr>
         <w:t>Les normes de Test et de Sécurité</w:t>
       </w:r>
-      <w:bookmarkEnd w:id="89"/>
-      <w:bookmarkEnd w:id="90"/>
-      <w:bookmarkEnd w:id="91"/>
+      <w:bookmarkEnd w:id="112"/>
+      <w:bookmarkEnd w:id="113"/>
+      <w:bookmarkEnd w:id="114"/>
+      <w:bookmarkEnd w:id="115"/>
     </w:p>
     <w:p>
       <w:pPr>
@@ -5933,9 +6544,10 @@
           <w:bCs w:val="0"/>
         </w:rPr>
       </w:pPr>
-      <w:bookmarkStart w:id="92" w:name="_Toc228349939"/>
-      <w:bookmarkStart w:id="93" w:name="_Toc228351060"/>
-      <w:bookmarkStart w:id="94" w:name="_Toc228354350"/>
+      <w:bookmarkStart w:id="116" w:name="_Toc228349939"/>
+      <w:bookmarkStart w:id="117" w:name="_Toc228351060"/>
+      <w:bookmarkStart w:id="118" w:name="_Toc228354350"/>
+      <w:bookmarkStart w:id="119" w:name="_Toc228372236"/>
       <w:r>
         <w:rPr>
           <w:rStyle w:val="Titre2Car"/>
@@ -5944,9 +6556,10 @@
         </w:rPr>
         <w:t>ISO/IEC 22536</w:t>
       </w:r>
-      <w:bookmarkEnd w:id="92"/>
-      <w:bookmarkEnd w:id="93"/>
-      <w:bookmarkEnd w:id="94"/>
+      <w:bookmarkEnd w:id="116"/>
+      <w:bookmarkEnd w:id="117"/>
+      <w:bookmarkEnd w:id="118"/>
+      <w:bookmarkEnd w:id="119"/>
     </w:p>
     <w:p>
       <w:pPr>
@@ -5959,9 +6572,10 @@
           <w:rStyle w:val="Titre2Car"/>
         </w:rPr>
       </w:pPr>
-      <w:bookmarkStart w:id="95" w:name="_Toc228349940"/>
-      <w:bookmarkStart w:id="96" w:name="_Toc228351061"/>
-      <w:bookmarkStart w:id="97" w:name="_Toc228354351"/>
+      <w:bookmarkStart w:id="120" w:name="_Toc228349940"/>
+      <w:bookmarkStart w:id="121" w:name="_Toc228351061"/>
+      <w:bookmarkStart w:id="122" w:name="_Toc228354351"/>
+      <w:bookmarkStart w:id="123" w:name="_Toc228372237"/>
       <w:r>
         <w:rPr>
           <w:rStyle w:val="Titre2Car"/>
@@ -5970,9 +6584,10 @@
         </w:rPr>
         <w:t>Méthodes de test pour</w:t>
       </w:r>
-      <w:bookmarkEnd w:id="95"/>
-      <w:bookmarkEnd w:id="96"/>
-      <w:bookmarkEnd w:id="97"/>
+      <w:bookmarkEnd w:id="120"/>
+      <w:bookmarkEnd w:id="121"/>
+      <w:bookmarkEnd w:id="122"/>
+      <w:bookmarkEnd w:id="123"/>
       <w:r>
         <w:rPr>
           <w:rStyle w:val="Titre2Car"/>
@@ -6021,9 +6636,10 @@
           <w:rStyle w:val="Titre2Car"/>
         </w:rPr>
       </w:pPr>
-      <w:bookmarkStart w:id="98" w:name="_Toc228349941"/>
-      <w:bookmarkStart w:id="99" w:name="_Toc228351062"/>
-      <w:bookmarkStart w:id="100" w:name="_Toc228354352"/>
+      <w:bookmarkStart w:id="124" w:name="_Toc228349941"/>
+      <w:bookmarkStart w:id="125" w:name="_Toc228351062"/>
+      <w:bookmarkStart w:id="126" w:name="_Toc228354352"/>
+      <w:bookmarkStart w:id="127" w:name="_Toc228372238"/>
       <w:r>
         <w:rPr>
           <w:rStyle w:val="Titre2Car"/>
@@ -6032,9 +6648,10 @@
         </w:rPr>
         <w:t>ISO/IEC 2391</w:t>
       </w:r>
-      <w:bookmarkEnd w:id="98"/>
-      <w:bookmarkEnd w:id="99"/>
-      <w:bookmarkEnd w:id="100"/>
+      <w:bookmarkEnd w:id="124"/>
+      <w:bookmarkEnd w:id="125"/>
+      <w:bookmarkEnd w:id="126"/>
+      <w:bookmarkEnd w:id="127"/>
     </w:p>
     <w:p>
       <w:pPr>
@@ -6047,9 +6664,10 @@
           <w:rStyle w:val="Titre2Car"/>
         </w:rPr>
       </w:pPr>
-      <w:bookmarkStart w:id="101" w:name="_Toc228349942"/>
-      <w:bookmarkStart w:id="102" w:name="_Toc228351063"/>
-      <w:bookmarkStart w:id="103" w:name="_Toc228354353"/>
+      <w:bookmarkStart w:id="128" w:name="_Toc228349942"/>
+      <w:bookmarkStart w:id="129" w:name="_Toc228351063"/>
+      <w:bookmarkStart w:id="130" w:name="_Toc228354353"/>
+      <w:bookmarkStart w:id="131" w:name="_Toc228372239"/>
       <w:r>
         <w:rPr>
           <w:rStyle w:val="Titre2Car"/>
@@ -6058,9 +6676,10 @@
         </w:rPr>
         <w:t>Méthodes de test pour les protocoles (NFCIP-1)</w:t>
       </w:r>
-      <w:bookmarkEnd w:id="101"/>
-      <w:bookmarkEnd w:id="102"/>
-      <w:bookmarkEnd w:id="103"/>
+      <w:bookmarkEnd w:id="128"/>
+      <w:bookmarkEnd w:id="129"/>
+      <w:bookmarkEnd w:id="130"/>
+      <w:bookmarkEnd w:id="131"/>
     </w:p>
     <w:p>
       <w:pPr>
@@ -6073,9 +6692,10 @@
           <w:rStyle w:val="Titre2Car"/>
         </w:rPr>
       </w:pPr>
-      <w:bookmarkStart w:id="104" w:name="_Toc228349943"/>
-      <w:bookmarkStart w:id="105" w:name="_Toc228351064"/>
-      <w:bookmarkStart w:id="106" w:name="_Toc228354354"/>
+      <w:bookmarkStart w:id="132" w:name="_Toc228349943"/>
+      <w:bookmarkStart w:id="133" w:name="_Toc228351064"/>
+      <w:bookmarkStart w:id="134" w:name="_Toc228354354"/>
+      <w:bookmarkStart w:id="135" w:name="_Toc228372240"/>
       <w:r>
         <w:rPr>
           <w:rStyle w:val="Titre2Car"/>
@@ -6084,9 +6704,10 @@
         </w:rPr>
         <w:t>ISO/IEC 13157 (Série)</w:t>
       </w:r>
-      <w:bookmarkEnd w:id="104"/>
-      <w:bookmarkEnd w:id="105"/>
-      <w:bookmarkEnd w:id="106"/>
+      <w:bookmarkEnd w:id="132"/>
+      <w:bookmarkEnd w:id="133"/>
+      <w:bookmarkEnd w:id="134"/>
+      <w:bookmarkEnd w:id="135"/>
     </w:p>
     <w:p>
       <w:pPr>
@@ -6099,9 +6720,10 @@
           <w:rStyle w:val="Titre2Car"/>
         </w:rPr>
       </w:pPr>
-      <w:bookmarkStart w:id="107" w:name="_Toc228349944"/>
-      <w:bookmarkStart w:id="108" w:name="_Toc228351065"/>
-      <w:bookmarkStart w:id="109" w:name="_Toc228354355"/>
+      <w:bookmarkStart w:id="136" w:name="_Toc228349944"/>
+      <w:bookmarkStart w:id="137" w:name="_Toc228351065"/>
+      <w:bookmarkStart w:id="138" w:name="_Toc228354355"/>
+      <w:bookmarkStart w:id="139" w:name="_Toc228372241"/>
       <w:r>
         <w:rPr>
           <w:rStyle w:val="Titre2Car"/>
@@ -6110,9 +6732,10 @@
         </w:rPr>
         <w:t>Concerne la sécurité (</w:t>
       </w:r>
-      <w:bookmarkEnd w:id="107"/>
-      <w:bookmarkEnd w:id="108"/>
-      <w:bookmarkEnd w:id="109"/>
+      <w:bookmarkEnd w:id="136"/>
+      <w:bookmarkEnd w:id="137"/>
+      <w:bookmarkEnd w:id="138"/>
+      <w:bookmarkEnd w:id="139"/>
       <w:r>
         <w:rPr>
           <w:rStyle w:val="Titre2Car"/>
@@ -6236,7 +6859,7 @@
           <w:bCs/>
         </w:rPr>
       </w:pPr>
-      <w:bookmarkStart w:id="110" w:name="_Toc228354356"/>
+      <w:bookmarkStart w:id="140" w:name="_Toc228372242"/>
       <w:r>
         <w:rPr>
           <w:rStyle w:val="Titre2Car"/>
@@ -6246,7 +6869,7 @@
         <w:lastRenderedPageBreak/>
         <w:t>Fonctionnement physique du NFC</w:t>
       </w:r>
-      <w:bookmarkEnd w:id="110"/>
+      <w:bookmarkEnd w:id="140"/>
     </w:p>
     <w:p>
       <w:pPr>
@@ -6325,7 +6948,8 @@
       </w:r>
     </w:p>
     <w:p>
-      <w:bookmarkStart w:id="111" w:name="_Toc228354357"/>
+      <w:bookmarkStart w:id="141" w:name="_Toc228354357"/>
+      <w:bookmarkStart w:id="142" w:name="_Toc228372243"/>
       <w:r>
         <w:rPr>
           <w:rStyle w:val="Titre2Car"/>
@@ -6346,7 +6970,8 @@
         </w:rPr>
         <w:t>:</w:t>
       </w:r>
-      <w:bookmarkEnd w:id="111"/>
+      <w:bookmarkEnd w:id="141"/>
+      <w:bookmarkEnd w:id="142"/>
       <w:r>
         <w:rPr>
           <w:rStyle w:val="Titre2Car"/>
@@ -6369,14 +6994,16 @@
           <w:rStyle w:val="Titre2Car"/>
         </w:rPr>
       </w:pPr>
-      <w:bookmarkStart w:id="112" w:name="_Toc228354358"/>
+      <w:bookmarkStart w:id="143" w:name="_Toc228354358"/>
+      <w:bookmarkStart w:id="144" w:name="_Toc228372244"/>
       <w:r>
         <w:rPr>
           <w:rStyle w:val="Titre2Car"/>
         </w:rPr>
         <w:t>Fonctionnement de l’induction électromagnétique</w:t>
       </w:r>
-      <w:bookmarkEnd w:id="112"/>
+      <w:bookmarkEnd w:id="143"/>
+      <w:bookmarkEnd w:id="144"/>
     </w:p>
     <w:p>
       <w:pPr>
@@ -6393,7 +7020,8 @@
           <w:bCs w:val="0"/>
         </w:rPr>
       </w:pPr>
-      <w:bookmarkStart w:id="113" w:name="_Toc228354359"/>
+      <w:bookmarkStart w:id="145" w:name="_Toc228354359"/>
+      <w:bookmarkStart w:id="146" w:name="_Toc228372245"/>
       <w:r>
         <w:rPr>
           <w:rStyle w:val="Titre2Car"/>
@@ -6402,7 +7030,8 @@
         </w:rPr>
         <w:t>Le fonctionnement de l’induction Electromagnétique repose sur le couplage inductif entre deux antennes en forme de bobines</w:t>
       </w:r>
-      <w:bookmarkEnd w:id="113"/>
+      <w:bookmarkEnd w:id="145"/>
+      <w:bookmarkEnd w:id="146"/>
       <w:r>
         <w:rPr>
           <w:rStyle w:val="Titre2Car"/>
@@ -6666,7 +7295,8 @@
           <w:bCs w:val="0"/>
         </w:rPr>
       </w:pPr>
-      <w:bookmarkStart w:id="114" w:name="_Toc228354360"/>
+      <w:bookmarkStart w:id="147" w:name="_Toc228354360"/>
+      <w:bookmarkStart w:id="148" w:name="_Toc228372246"/>
       <w:r>
         <w:rPr>
           <w:rStyle w:val="Titre2Car"/>
@@ -6675,7 +7305,8 @@
         </w:rPr>
         <w:t>L’émetteur primaire fait circuler un courant alternatif dans sa propre bobine. Selon la loi d’Ampère, tout courant circulant dans un conducteur génère un champ magnétique autour de lui.</w:t>
       </w:r>
-      <w:bookmarkEnd w:id="114"/>
+      <w:bookmarkEnd w:id="147"/>
+      <w:bookmarkEnd w:id="148"/>
       <w:r>
         <w:rPr>
           <w:rStyle w:val="Titre2Car"/>
@@ -6702,7 +7333,8 @@
           <w:bCs w:val="0"/>
         </w:rPr>
       </w:pPr>
-      <w:bookmarkStart w:id="115" w:name="_Toc228354361"/>
+      <w:bookmarkStart w:id="149" w:name="_Toc228354361"/>
+      <w:bookmarkStart w:id="150" w:name="_Toc228372247"/>
       <w:r>
         <w:rPr>
           <w:rStyle w:val="Titre2Car"/>
@@ -6711,7 +7343,8 @@
         </w:rPr>
         <w:t>Ce même champ magnétique traverse l’espace et « baigne » l’antenne du tag passif.</w:t>
       </w:r>
-      <w:bookmarkEnd w:id="115"/>
+      <w:bookmarkEnd w:id="149"/>
+      <w:bookmarkEnd w:id="150"/>
     </w:p>
     <w:p>
       <w:pPr>
@@ -6730,7 +7363,8 @@
           <w:bCs w:val="0"/>
         </w:rPr>
       </w:pPr>
-      <w:bookmarkStart w:id="116" w:name="_Toc228354362"/>
+      <w:bookmarkStart w:id="151" w:name="_Toc228354362"/>
+      <w:bookmarkStart w:id="152" w:name="_Toc228372248"/>
       <w:r>
         <w:rPr>
           <w:rStyle w:val="Titre2Car"/>
@@ -6739,7 +7373,8 @@
         </w:rPr>
         <w:t>Le tag secondaire quant a lui est soumis à la loi de Faraday qui dit que : un champ magnétique variable qui traverse une bobine y induit une force électromotrice (tension). C’est ainsi que le tag reçoit son énergie, il « récupère » en quelque sorte l’électricité du champ magnétique du lecteur pour alimenter sa propre puce</w:t>
       </w:r>
-      <w:bookmarkEnd w:id="116"/>
+      <w:bookmarkEnd w:id="151"/>
+      <w:bookmarkEnd w:id="152"/>
     </w:p>
     <w:p>
       <w:pPr>
@@ -6758,7 +7393,8 @@
           <w:bCs w:val="0"/>
         </w:rPr>
       </w:pPr>
-      <w:bookmarkStart w:id="117" w:name="_Toc228354363"/>
+      <w:bookmarkStart w:id="153" w:name="_Toc228354363"/>
+      <w:bookmarkStart w:id="154" w:name="_Toc228372249"/>
       <w:r>
         <w:rPr>
           <w:rStyle w:val="Titre2Car"/>
@@ -6767,7 +7403,8 @@
         </w:rPr>
         <w:t>Une fois alimenté, le tag secondaire modifie sa propre charge électrique, ce qui crée des micro-variations dans le champ magnétique. Le lecteur détecte ces variations et les traduits en données binaires.</w:t>
       </w:r>
-      <w:bookmarkEnd w:id="117"/>
+      <w:bookmarkEnd w:id="153"/>
+      <w:bookmarkEnd w:id="154"/>
     </w:p>
     <w:p>
       <w:pPr>
@@ -6800,7 +7437,8 @@
           <w:bCs w:val="0"/>
         </w:rPr>
       </w:pPr>
-      <w:bookmarkStart w:id="118" w:name="_Toc228354364"/>
+      <w:bookmarkStart w:id="155" w:name="_Toc228354364"/>
+      <w:bookmarkStart w:id="156" w:name="_Toc228372250"/>
       <w:r>
         <w:rPr>
           <w:rStyle w:val="Titre2Car"/>
@@ -6808,7 +7446,8 @@
         <w:lastRenderedPageBreak/>
         <w:t>Pourquoi précisément 13,56 MHz ?</w:t>
       </w:r>
-      <w:bookmarkEnd w:id="118"/>
+      <w:bookmarkEnd w:id="155"/>
+      <w:bookmarkEnd w:id="156"/>
     </w:p>
     <w:p>
       <w:pPr>
@@ -6829,7 +7468,8 @@
           <w:bCs w:val="0"/>
         </w:rPr>
       </w:pPr>
-      <w:bookmarkStart w:id="119" w:name="_Toc228354365"/>
+      <w:bookmarkStart w:id="157" w:name="_Toc228354365"/>
+      <w:bookmarkStart w:id="158" w:name="_Toc228372251"/>
       <w:r>
         <w:rPr>
           <w:rStyle w:val="Titre2Car"/>
@@ -6862,7 +7502,8 @@
         </w:rPr>
         <w:t> :</w:t>
       </w:r>
-      <w:bookmarkEnd w:id="119"/>
+      <w:bookmarkEnd w:id="157"/>
+      <w:bookmarkEnd w:id="158"/>
     </w:p>
     <w:p>
       <w:pPr>
@@ -6881,7 +7522,8 @@
           <w:bCs w:val="0"/>
         </w:rPr>
       </w:pPr>
-      <w:bookmarkStart w:id="120" w:name="_Toc228354366"/>
+      <w:bookmarkStart w:id="159" w:name="_Toc228354366"/>
+      <w:bookmarkStart w:id="160" w:name="_Toc228372252"/>
       <w:r>
         <w:rPr>
           <w:rStyle w:val="Titre2Car"/>
@@ -6890,7 +7532,8 @@
         </w:rPr>
         <w:t>Sur le plan règlementaire, l’union internationale des télécommunications (UIT) réserve des fréquences pour des usages non liés aux télécommunications longue distance (FM/5G). La bande 13,56 MHz est une bande libre de licence mondiale.</w:t>
       </w:r>
-      <w:bookmarkEnd w:id="120"/>
+      <w:bookmarkEnd w:id="159"/>
+      <w:bookmarkEnd w:id="160"/>
     </w:p>
     <w:p>
       <w:pPr>
@@ -6909,7 +7552,8 @@
           <w:bCs w:val="0"/>
         </w:rPr>
       </w:pPr>
-      <w:bookmarkStart w:id="121" w:name="_Toc228354367"/>
+      <w:bookmarkStart w:id="161" w:name="_Toc228354367"/>
+      <w:bookmarkStart w:id="162" w:name="_Toc228372253"/>
       <w:r>
         <w:rPr>
           <w:rStyle w:val="Titre2Car"/>
@@ -6918,7 +7562,8 @@
         </w:rPr>
         <w:t>Sur le plan technique, la fréquence 13,56 MHz offre un excellent équilibre permettant de fabriquer des antennes assez petites pour tenir dans une carte de crédit ou un téléphone, tout en restant très efficaces pour le transfert d’énergie par induction.</w:t>
       </w:r>
-      <w:bookmarkEnd w:id="121"/>
+      <w:bookmarkEnd w:id="161"/>
+      <w:bookmarkEnd w:id="162"/>
     </w:p>
     <w:p>
       <w:pPr>
@@ -6938,6 +7583,7 @@
           <w:bCs/>
         </w:rPr>
       </w:pPr>
+      <w:bookmarkStart w:id="163" w:name="_Toc228372254"/>
       <w:r>
         <w:rPr>
           <w:rStyle w:val="Titre2Car"/>
@@ -6946,6 +7592,7 @@
         </w:rPr>
         <w:t>Code Backend &amp; Frontend</w:t>
       </w:r>
+      <w:bookmarkEnd w:id="163"/>
     </w:p>
     <w:p>
       <w:pPr>
@@ -6965,6 +7612,7 @@
           <w:bCs/>
         </w:rPr>
       </w:pPr>
+      <w:bookmarkStart w:id="164" w:name="_Toc228372255"/>
       <w:r>
         <w:rPr>
           <w:rStyle w:val="Titre2Car"/>
@@ -6973,6 +7621,7 @@
         </w:rPr>
         <w:t>Justification des langages utilisés</w:t>
       </w:r>
+      <w:bookmarkEnd w:id="164"/>
     </w:p>
     <w:p>
       <w:pPr>
@@ -7005,13 +7654,23 @@
           <w:bCs w:val="0"/>
         </w:rPr>
       </w:pPr>
+      <w:bookmarkStart w:id="165" w:name="_Toc228372256"/>
       <w:r>
         <w:rPr>
           <w:rStyle w:val="Titre2Car"/>
           <w:b w:val="0"/>
           <w:bCs w:val="0"/>
         </w:rPr>
-        <w:t xml:space="preserve">Le projet SAC utilise plusieurs langages de programmations avec chacun une fonction précise et une justification de leurs utilisations. </w:t>
+        <w:t>Le projet SAC utilise plusieurs langages de programmations avec chacun une fonction précise et une justification de leurs utilisations.</w:t>
+      </w:r>
+      <w:bookmarkEnd w:id="165"/>
+      <w:r>
+        <w:rPr>
+          <w:rStyle w:val="Titre2Car"/>
+          <w:b w:val="0"/>
+          <w:bCs w:val="0"/>
+        </w:rPr>
+        <w:t xml:space="preserve"> </w:t>
       </w:r>
     </w:p>
     <w:p>
@@ -7053,12 +7712,14 @@
                 <w:rStyle w:val="Titre2Car"/>
               </w:rPr>
             </w:pPr>
+            <w:bookmarkStart w:id="166" w:name="_Toc228372257"/>
             <w:r>
               <w:rPr>
                 <w:rStyle w:val="Titre2Car"/>
               </w:rPr>
               <w:t>Langage</w:t>
             </w:r>
+            <w:bookmarkEnd w:id="166"/>
           </w:p>
         </w:tc>
         <w:tc>
@@ -7076,12 +7737,14 @@
                 <w:rStyle w:val="Titre2Car"/>
               </w:rPr>
             </w:pPr>
+            <w:bookmarkStart w:id="167" w:name="_Toc228372258"/>
             <w:r>
               <w:rPr>
                 <w:rStyle w:val="Titre2Car"/>
               </w:rPr>
               <w:t>Pourcentage d’utilisation dans le projet</w:t>
             </w:r>
+            <w:bookmarkEnd w:id="167"/>
           </w:p>
         </w:tc>
         <w:tc>
@@ -7099,6 +7762,7 @@
                 <w:rStyle w:val="Titre2Car"/>
               </w:rPr>
             </w:pPr>
+            <w:bookmarkStart w:id="168" w:name="_Toc228372259"/>
             <w:r>
               <w:rPr>
                 <w:rStyle w:val="Titre2Car"/>
@@ -7111,6 +7775,7 @@
               </w:rPr>
               <w:t>/Description</w:t>
             </w:r>
+            <w:bookmarkEnd w:id="168"/>
           </w:p>
         </w:tc>
       </w:tr>
@@ -7144,6 +7809,7 @@
                 <w:bCs w:val="0"/>
               </w:rPr>
             </w:pPr>
+            <w:bookmarkStart w:id="169" w:name="_Toc228372260"/>
             <w:r>
               <w:rPr>
                 <w:rStyle w:val="Titre2Car"/>
@@ -7152,6 +7818,7 @@
               </w:rPr>
               <w:t>JavaScript (JS)</w:t>
             </w:r>
+            <w:bookmarkEnd w:id="169"/>
           </w:p>
         </w:tc>
         <w:tc>
@@ -7183,6 +7850,7 @@
                 <w:bCs w:val="0"/>
               </w:rPr>
             </w:pPr>
+            <w:bookmarkStart w:id="170" w:name="_Toc228372261"/>
             <w:r>
               <w:rPr>
                 <w:rStyle w:val="Titre2Car"/>
@@ -7191,6 +7859,7 @@
               </w:rPr>
               <w:t>86.4%</w:t>
             </w:r>
+            <w:bookmarkEnd w:id="170"/>
           </w:p>
         </w:tc>
         <w:tc>
@@ -7209,6 +7878,7 @@
                 <w:bCs w:val="0"/>
               </w:rPr>
             </w:pPr>
+            <w:bookmarkStart w:id="171" w:name="_Toc228372262"/>
             <w:r>
               <w:rPr>
                 <w:rStyle w:val="Titre2Car"/>
@@ -7233,6 +7903,7 @@
               </w:rPr>
               <w:t xml:space="preserve"> la modification</w:t>
             </w:r>
+            <w:bookmarkEnd w:id="171"/>
           </w:p>
         </w:tc>
       </w:tr>
@@ -7266,6 +7937,7 @@
                 <w:bCs w:val="0"/>
               </w:rPr>
             </w:pPr>
+            <w:bookmarkStart w:id="172" w:name="_Toc228372263"/>
             <w:r>
               <w:rPr>
                 <w:rStyle w:val="Titre2Car"/>
@@ -7274,6 +7946,7 @@
               </w:rPr>
               <w:t>HTML</w:t>
             </w:r>
+            <w:bookmarkEnd w:id="172"/>
           </w:p>
         </w:tc>
         <w:tc>
@@ -7305,6 +7978,7 @@
                 <w:bCs w:val="0"/>
               </w:rPr>
             </w:pPr>
+            <w:bookmarkStart w:id="173" w:name="_Toc228372264"/>
             <w:r>
               <w:rPr>
                 <w:rStyle w:val="Titre2Car"/>
@@ -7313,6 +7987,7 @@
               </w:rPr>
               <w:t>13.4%</w:t>
             </w:r>
+            <w:bookmarkEnd w:id="173"/>
           </w:p>
         </w:tc>
         <w:tc>
@@ -7331,6 +8006,7 @@
                 <w:bCs w:val="0"/>
               </w:rPr>
             </w:pPr>
+            <w:bookmarkStart w:id="174" w:name="_Toc228372265"/>
             <w:r>
               <w:rPr>
                 <w:rStyle w:val="Titre2Car"/>
@@ -7339,6 +8015,7 @@
               </w:rPr>
               <w:t>Langage de balisage servant à structurer de façon basique des pages web</w:t>
             </w:r>
+            <w:bookmarkEnd w:id="174"/>
           </w:p>
         </w:tc>
       </w:tr>
@@ -7372,6 +8049,7 @@
                 <w:bCs w:val="0"/>
               </w:rPr>
             </w:pPr>
+            <w:bookmarkStart w:id="175" w:name="_Toc228372266"/>
             <w:r>
               <w:rPr>
                 <w:rStyle w:val="Titre2Car"/>
@@ -7380,6 +8058,7 @@
               </w:rPr>
               <w:t>Dockerfile</w:t>
             </w:r>
+            <w:bookmarkEnd w:id="175"/>
           </w:p>
         </w:tc>
         <w:tc>
@@ -7411,6 +8090,7 @@
                 <w:bCs w:val="0"/>
               </w:rPr>
             </w:pPr>
+            <w:bookmarkStart w:id="176" w:name="_Toc228372267"/>
             <w:r>
               <w:rPr>
                 <w:rStyle w:val="Titre2Car"/>
@@ -7419,6 +8099,7 @@
               </w:rPr>
               <w:t>0.2%</w:t>
             </w:r>
+            <w:bookmarkEnd w:id="176"/>
           </w:p>
         </w:tc>
         <w:tc>
@@ -7437,6 +8118,7 @@
                 <w:bCs w:val="0"/>
               </w:rPr>
             </w:pPr>
+            <w:bookmarkStart w:id="177" w:name="_Toc228372268"/>
             <w:r>
               <w:rPr>
                 <w:rStyle w:val="Titre2Car"/>
@@ -7445,6 +8127,7 @@
               </w:rPr>
               <w:t>Fichiers centralisant tous les éléments relatifs aux conteneurs Docker</w:t>
             </w:r>
+            <w:bookmarkEnd w:id="177"/>
           </w:p>
         </w:tc>
       </w:tr>
@@ -7462,6 +8145,7 @@
           <w:iCs/>
         </w:rPr>
       </w:pPr>
+      <w:bookmarkStart w:id="178" w:name="_Toc228372269"/>
       <w:r>
         <w:rPr>
           <w:rStyle w:val="Titre2Car"/>
@@ -7472,6 +8156,7 @@
         </w:rPr>
         <w:t>Source des pourcentages : repo GitHub SAC</w:t>
       </w:r>
+      <w:bookmarkEnd w:id="178"/>
     </w:p>
     <w:p>
       <w:pPr>
@@ -7494,13 +8179,23 @@
           <w:bCs/>
         </w:rPr>
       </w:pPr>
+      <w:bookmarkStart w:id="179" w:name="_Toc228372270"/>
       <w:r>
         <w:rPr>
           <w:rStyle w:val="Titre2Car"/>
           <w:b/>
           <w:bCs/>
         </w:rPr>
-        <w:t xml:space="preserve">Structure du projet </w:t>
+        <w:t>Structure du projet</w:t>
+      </w:r>
+      <w:bookmarkEnd w:id="179"/>
+      <w:r>
+        <w:rPr>
+          <w:rStyle w:val="Titre2Car"/>
+          <w:b/>
+          <w:bCs/>
+        </w:rPr>
+        <w:t xml:space="preserve"> </w:t>
       </w:r>
     </w:p>
     <w:p/>
@@ -7792,9 +8487,11 @@
       <w:pPr>
         <w:pStyle w:val="Titre2"/>
       </w:pPr>
+      <w:bookmarkStart w:id="180" w:name="_Toc228372271"/>
       <w:r>
         <w:t>App.js, la fondation du projet</w:t>
       </w:r>
+      <w:bookmarkEnd w:id="180"/>
     </w:p>
     <w:p/>
     <w:p>
@@ -7936,9 +8633,11 @@
       <w:pPr>
         <w:pStyle w:val="Titre2"/>
       </w:pPr>
+      <w:bookmarkStart w:id="181" w:name="_Toc228372272"/>
       <w:r>
         <w:t>O365.js – La gestion de la connexion avec Office 365</w:t>
       </w:r>
+      <w:bookmarkEnd w:id="181"/>
     </w:p>
     <w:p/>
     <w:p>
@@ -8142,9 +8841,11 @@
       <w:pPr>
         <w:pStyle w:val="Titre2"/>
       </w:pPr>
+      <w:bookmarkStart w:id="182" w:name="_Toc228372273"/>
       <w:r>
         <w:t>Match_office_to_ED.js – La gestion des rôles utilisateurs sur la PWA</w:t>
       </w:r>
+      <w:bookmarkEnd w:id="182"/>
     </w:p>
     <w:p>
       <w:r>
@@ -8286,7 +8987,7 @@
           <w:bCs/>
         </w:rPr>
       </w:pPr>
-      <w:bookmarkStart w:id="122" w:name="_Toc228354368"/>
+      <w:bookmarkStart w:id="183" w:name="_Toc228372274"/>
       <w:r>
         <w:rPr>
           <w:rStyle w:val="Titre2Car"/>
@@ -8295,7 +8996,7 @@
         </w:rPr>
         <w:t>Avancement du projet</w:t>
       </w:r>
-      <w:bookmarkEnd w:id="122"/>
+      <w:bookmarkEnd w:id="183"/>
       <w:r>
         <w:rPr>
           <w:rStyle w:val="Titre2Car"/>
@@ -8310,11 +9011,11 @@
       <w:pPr>
         <w:pStyle w:val="Titre2"/>
       </w:pPr>
-      <w:bookmarkStart w:id="123" w:name="_Toc228354369"/>
+      <w:bookmarkStart w:id="184" w:name="_Toc228372275"/>
       <w:r>
         <w:t>Récapitulatif des tâches réalisées</w:t>
       </w:r>
-      <w:bookmarkEnd w:id="123"/>
+      <w:bookmarkEnd w:id="184"/>
     </w:p>
     <w:p/>
     <w:p>
@@ -8852,11 +9553,11 @@
       <w:pPr>
         <w:pStyle w:val="Titre2"/>
       </w:pPr>
-      <w:bookmarkStart w:id="124" w:name="_Toc228354370"/>
+      <w:bookmarkStart w:id="185" w:name="_Toc228372276"/>
       <w:r>
         <w:t>Tâches restantes à réaliser</w:t>
       </w:r>
-      <w:bookmarkEnd w:id="124"/>
+      <w:bookmarkEnd w:id="185"/>
     </w:p>
     <w:p/>
     <w:p>
@@ -9229,11 +9930,11 @@
       <w:pPr>
         <w:pStyle w:val="Titre1"/>
       </w:pPr>
-      <w:bookmarkStart w:id="125" w:name="_Toc228354371"/>
+      <w:bookmarkStart w:id="186" w:name="_Toc228372277"/>
       <w:r>
         <w:t>Tableau récapitulatif d'avancement</w:t>
       </w:r>
-      <w:bookmarkEnd w:id="125"/>
+      <w:bookmarkEnd w:id="186"/>
     </w:p>
     <w:p/>
     <w:tbl>
@@ -9759,7 +10460,6 @@
           </w:tcPr>
           <w:p>
             <w:r>
-              <w:lastRenderedPageBreak/>
               <w:t>PWA Frontend (élève)</w:t>
             </w:r>
           </w:p>
@@ -10125,11 +10825,11 @@
       <w:pPr>
         <w:pStyle w:val="Titre1"/>
       </w:pPr>
-      <w:bookmarkStart w:id="126" w:name="_Toc228354372"/>
+      <w:bookmarkStart w:id="187" w:name="_Toc228372278"/>
       <w:r>
         <w:t>Diagramme de Gantt</w:t>
       </w:r>
-      <w:bookmarkEnd w:id="126"/>
+      <w:bookmarkEnd w:id="187"/>
     </w:p>
     <w:p>
       <w:r>
@@ -10218,27 +10918,27 @@
       <w:pPr>
         <w:pStyle w:val="Titre1"/>
       </w:pPr>
-      <w:bookmarkStart w:id="127" w:name="_Lexique"/>
-      <w:bookmarkStart w:id="128" w:name="_Toc228354373"/>
-      <w:bookmarkEnd w:id="127"/>
+      <w:bookmarkStart w:id="188" w:name="_Lexique"/>
+      <w:bookmarkStart w:id="189" w:name="_Toc228372279"/>
+      <w:bookmarkEnd w:id="188"/>
       <w:r>
         <w:lastRenderedPageBreak/>
         <w:t>Lexique</w:t>
       </w:r>
-      <w:bookmarkEnd w:id="128"/>
+      <w:bookmarkEnd w:id="189"/>
     </w:p>
     <w:p/>
     <w:p>
       <w:pPr>
         <w:pStyle w:val="Titre2"/>
       </w:pPr>
-      <w:bookmarkStart w:id="129" w:name="_Lexique_matériel_physique"/>
-      <w:bookmarkStart w:id="130" w:name="_Toc228354374"/>
-      <w:bookmarkEnd w:id="129"/>
+      <w:bookmarkStart w:id="190" w:name="_Lexique_matériel_physique"/>
+      <w:bookmarkStart w:id="191" w:name="_Toc228372280"/>
+      <w:bookmarkEnd w:id="190"/>
       <w:r>
         <w:t>Lexique matériel physique</w:t>
       </w:r>
-      <w:bookmarkEnd w:id="130"/>
+      <w:bookmarkEnd w:id="191"/>
     </w:p>
     <w:p/>
     <w:p>
@@ -10482,13 +11182,13 @@
       <w:pPr>
         <w:pStyle w:val="Titre2"/>
       </w:pPr>
-      <w:bookmarkStart w:id="131" w:name="_Lexique_Dev"/>
-      <w:bookmarkStart w:id="132" w:name="_Toc228354375"/>
-      <w:bookmarkEnd w:id="131"/>
+      <w:bookmarkStart w:id="192" w:name="_Lexique_Dev"/>
+      <w:bookmarkStart w:id="193" w:name="_Toc228372281"/>
+      <w:bookmarkEnd w:id="192"/>
       <w:r>
         <w:t>Lexique Dev</w:t>
       </w:r>
-      <w:bookmarkEnd w:id="132"/>
+      <w:bookmarkEnd w:id="193"/>
     </w:p>
     <w:p/>
     <w:p>
@@ -11045,13 +11745,13 @@
       <w:pPr>
         <w:pStyle w:val="Titre2"/>
       </w:pPr>
-      <w:bookmarkStart w:id="133" w:name="_Lexique_NFC"/>
-      <w:bookmarkStart w:id="134" w:name="_Toc228354376"/>
-      <w:bookmarkEnd w:id="133"/>
+      <w:bookmarkStart w:id="194" w:name="_Lexique_NFC"/>
+      <w:bookmarkStart w:id="195" w:name="_Toc228372282"/>
+      <w:bookmarkEnd w:id="194"/>
       <w:r>
         <w:t>Lexique NFC</w:t>
       </w:r>
-      <w:bookmarkEnd w:id="134"/>
+      <w:bookmarkEnd w:id="195"/>
     </w:p>
     <w:p/>
     <w:p>
@@ -17426,6 +18126,160 @@
       <w:lang w:val="fr-FR"/>
     </w:rPr>
   </w:style>
+  <w:style w:type="paragraph" w:styleId="TM3">
+    <w:name w:val="toc 3"/>
+    <w:basedOn w:val="Normal"/>
+    <w:next w:val="Normal"/>
+    <w:autoRedefine/>
+    <w:uiPriority w:val="39"/>
+    <w:unhideWhenUsed/>
+    <w:rsid w:val="004F0286"/>
+    <w:pPr>
+      <w:widowControl/>
+      <w:spacing w:after="100" w:line="278" w:lineRule="auto"/>
+      <w:ind w:left="480"/>
+    </w:pPr>
+    <w:rPr>
+      <w:rFonts w:asciiTheme="minorHAnsi" w:eastAsiaTheme="minorEastAsia" w:hAnsiTheme="minorHAnsi" w:cstheme="minorBidi"/>
+      <w:kern w:val="2"/>
+      <w:sz w:val="24"/>
+      <w:szCs w:val="24"/>
+      <w:lang w:eastAsia="fr-FR"/>
+      <w14:ligatures w14:val="standardContextual"/>
+    </w:rPr>
+  </w:style>
+  <w:style w:type="paragraph" w:styleId="TM4">
+    <w:name w:val="toc 4"/>
+    <w:basedOn w:val="Normal"/>
+    <w:next w:val="Normal"/>
+    <w:autoRedefine/>
+    <w:uiPriority w:val="39"/>
+    <w:unhideWhenUsed/>
+    <w:rsid w:val="004F0286"/>
+    <w:pPr>
+      <w:widowControl/>
+      <w:spacing w:after="100" w:line="278" w:lineRule="auto"/>
+      <w:ind w:left="720"/>
+    </w:pPr>
+    <w:rPr>
+      <w:rFonts w:asciiTheme="minorHAnsi" w:eastAsiaTheme="minorEastAsia" w:hAnsiTheme="minorHAnsi" w:cstheme="minorBidi"/>
+      <w:kern w:val="2"/>
+      <w:sz w:val="24"/>
+      <w:szCs w:val="24"/>
+      <w:lang w:eastAsia="fr-FR"/>
+      <w14:ligatures w14:val="standardContextual"/>
+    </w:rPr>
+  </w:style>
+  <w:style w:type="paragraph" w:styleId="TM5">
+    <w:name w:val="toc 5"/>
+    <w:basedOn w:val="Normal"/>
+    <w:next w:val="Normal"/>
+    <w:autoRedefine/>
+    <w:uiPriority w:val="39"/>
+    <w:unhideWhenUsed/>
+    <w:rsid w:val="004F0286"/>
+    <w:pPr>
+      <w:widowControl/>
+      <w:spacing w:after="100" w:line="278" w:lineRule="auto"/>
+      <w:ind w:left="960"/>
+    </w:pPr>
+    <w:rPr>
+      <w:rFonts w:asciiTheme="minorHAnsi" w:eastAsiaTheme="minorEastAsia" w:hAnsiTheme="minorHAnsi" w:cstheme="minorBidi"/>
+      <w:kern w:val="2"/>
+      <w:sz w:val="24"/>
+      <w:szCs w:val="24"/>
+      <w:lang w:eastAsia="fr-FR"/>
+      <w14:ligatures w14:val="standardContextual"/>
+    </w:rPr>
+  </w:style>
+  <w:style w:type="paragraph" w:styleId="TM6">
+    <w:name w:val="toc 6"/>
+    <w:basedOn w:val="Normal"/>
+    <w:next w:val="Normal"/>
+    <w:autoRedefine/>
+    <w:uiPriority w:val="39"/>
+    <w:unhideWhenUsed/>
+    <w:rsid w:val="004F0286"/>
+    <w:pPr>
+      <w:widowControl/>
+      <w:spacing w:after="100" w:line="278" w:lineRule="auto"/>
+      <w:ind w:left="1200"/>
+    </w:pPr>
+    <w:rPr>
+      <w:rFonts w:asciiTheme="minorHAnsi" w:eastAsiaTheme="minorEastAsia" w:hAnsiTheme="minorHAnsi" w:cstheme="minorBidi"/>
+      <w:kern w:val="2"/>
+      <w:sz w:val="24"/>
+      <w:szCs w:val="24"/>
+      <w:lang w:eastAsia="fr-FR"/>
+      <w14:ligatures w14:val="standardContextual"/>
+    </w:rPr>
+  </w:style>
+  <w:style w:type="paragraph" w:styleId="TM7">
+    <w:name w:val="toc 7"/>
+    <w:basedOn w:val="Normal"/>
+    <w:next w:val="Normal"/>
+    <w:autoRedefine/>
+    <w:uiPriority w:val="39"/>
+    <w:unhideWhenUsed/>
+    <w:rsid w:val="004F0286"/>
+    <w:pPr>
+      <w:widowControl/>
+      <w:spacing w:after="100" w:line="278" w:lineRule="auto"/>
+      <w:ind w:left="1440"/>
+    </w:pPr>
+    <w:rPr>
+      <w:rFonts w:asciiTheme="minorHAnsi" w:eastAsiaTheme="minorEastAsia" w:hAnsiTheme="minorHAnsi" w:cstheme="minorBidi"/>
+      <w:kern w:val="2"/>
+      <w:sz w:val="24"/>
+      <w:szCs w:val="24"/>
+      <w:lang w:eastAsia="fr-FR"/>
+      <w14:ligatures w14:val="standardContextual"/>
+    </w:rPr>
+  </w:style>
+  <w:style w:type="paragraph" w:styleId="TM8">
+    <w:name w:val="toc 8"/>
+    <w:basedOn w:val="Normal"/>
+    <w:next w:val="Normal"/>
+    <w:autoRedefine/>
+    <w:uiPriority w:val="39"/>
+    <w:unhideWhenUsed/>
+    <w:rsid w:val="004F0286"/>
+    <w:pPr>
+      <w:widowControl/>
+      <w:spacing w:after="100" w:line="278" w:lineRule="auto"/>
+      <w:ind w:left="1680"/>
+    </w:pPr>
+    <w:rPr>
+      <w:rFonts w:asciiTheme="minorHAnsi" w:eastAsiaTheme="minorEastAsia" w:hAnsiTheme="minorHAnsi" w:cstheme="minorBidi"/>
+      <w:kern w:val="2"/>
+      <w:sz w:val="24"/>
+      <w:szCs w:val="24"/>
+      <w:lang w:eastAsia="fr-FR"/>
+      <w14:ligatures w14:val="standardContextual"/>
+    </w:rPr>
+  </w:style>
+  <w:style w:type="paragraph" w:styleId="TM9">
+    <w:name w:val="toc 9"/>
+    <w:basedOn w:val="Normal"/>
+    <w:next w:val="Normal"/>
+    <w:autoRedefine/>
+    <w:uiPriority w:val="39"/>
+    <w:unhideWhenUsed/>
+    <w:rsid w:val="004F0286"/>
+    <w:pPr>
+      <w:widowControl/>
+      <w:spacing w:after="100" w:line="278" w:lineRule="auto"/>
+      <w:ind w:left="1920"/>
+    </w:pPr>
+    <w:rPr>
+      <w:rFonts w:asciiTheme="minorHAnsi" w:eastAsiaTheme="minorEastAsia" w:hAnsiTheme="minorHAnsi" w:cstheme="minorBidi"/>
+      <w:kern w:val="2"/>
+      <w:sz w:val="24"/>
+      <w:szCs w:val="24"/>
+      <w:lang w:eastAsia="fr-FR"/>
+      <w14:ligatures w14:val="standardContextual"/>
+    </w:rPr>
+  </w:style>
 </w:styles>
 </file>
 

</xml_diff>

<commit_message>
docs: update v10 project sheet
</commit_message>
<xml_diff>
--- a/Documentation/Fiche_suivi_projet_v10.docx
+++ b/Documentation/Fiche_suivi_projet_v10.docx
@@ -973,7 +973,7 @@
           <w:r>
             <w:fldChar w:fldCharType="separate"/>
           </w:r>
-          <w:hyperlink w:anchor="_Toc228372199" w:history="1">
+          <w:hyperlink w:anchor="_Toc228373007" w:history="1">
             <w:r>
               <w:rPr>
                 <w:rStyle w:val="Lienhypertexte"/>
@@ -1020,7 +1020,7 @@
                 <w:noProof/>
                 <w:webHidden/>
               </w:rPr>
-              <w:instrText xml:space="preserve"> PAGEREF _Toc228372199 \h </w:instrText>
+              <w:instrText xml:space="preserve"> PAGEREF _Toc228373007 \h </w:instrText>
             </w:r>
             <w:r>
               <w:rPr>
@@ -1040,7 +1040,7 @@
                 <w:noProof/>
                 <w:webHidden/>
               </w:rPr>
-              <w:t>4</w:t>
+              <w:t>5</w:t>
             </w:r>
             <w:r>
               <w:rPr>
@@ -1068,7 +1068,7 @@
               <w14:ligatures w14:val="standardContextual"/>
             </w:rPr>
           </w:pPr>
-          <w:hyperlink w:anchor="_Toc228372200" w:history="1">
+          <w:hyperlink w:anchor="_Toc228373008" w:history="1">
             <w:r>
               <w:rPr>
                 <w:rStyle w:val="Lienhypertexte"/>
@@ -1114,7 +1114,7 @@
                 <w:noProof/>
                 <w:webHidden/>
               </w:rPr>
-              <w:instrText xml:space="preserve"> PAGEREF _Toc228372200 \h </w:instrText>
+              <w:instrText xml:space="preserve"> PAGEREF _Toc228373008 \h </w:instrText>
             </w:r>
             <w:r>
               <w:rPr>
@@ -1162,7 +1162,7 @@
               <w14:ligatures w14:val="standardContextual"/>
             </w:rPr>
           </w:pPr>
-          <w:hyperlink w:anchor="_Toc228372201" w:history="1">
+          <w:hyperlink w:anchor="_Toc228373009" w:history="1">
             <w:r>
               <w:rPr>
                 <w:rStyle w:val="Lienhypertexte"/>
@@ -1208,7 +1208,7 @@
                 <w:noProof/>
                 <w:webHidden/>
               </w:rPr>
-              <w:instrText xml:space="preserve"> PAGEREF _Toc228372201 \h </w:instrText>
+              <w:instrText xml:space="preserve"> PAGEREF _Toc228373009 \h </w:instrText>
             </w:r>
             <w:r>
               <w:rPr>
@@ -1256,7 +1256,7 @@
               <w14:ligatures w14:val="standardContextual"/>
             </w:rPr>
           </w:pPr>
-          <w:hyperlink w:anchor="_Toc228372202" w:history="1">
+          <w:hyperlink w:anchor="_Toc228373010" w:history="1">
             <w:r>
               <w:rPr>
                 <w:rStyle w:val="Lienhypertexte"/>
@@ -1302,7 +1302,7 @@
                 <w:noProof/>
                 <w:webHidden/>
               </w:rPr>
-              <w:instrText xml:space="preserve"> PAGEREF _Toc228372202 \h </w:instrText>
+              <w:instrText xml:space="preserve"> PAGEREF _Toc228373010 \h </w:instrText>
             </w:r>
             <w:r>
               <w:rPr>
@@ -1349,7 +1349,7 @@
               <w14:ligatures w14:val="standardContextual"/>
             </w:rPr>
           </w:pPr>
-          <w:hyperlink w:anchor="_Toc228372203" w:history="1">
+          <w:hyperlink w:anchor="_Toc228373011" w:history="1">
             <w:r>
               <w:rPr>
                 <w:noProof/>
@@ -1369,7 +1369,7 @@
                 <w:noProof/>
                 <w:webHidden/>
               </w:rPr>
-              <w:instrText xml:space="preserve"> PAGEREF _Toc228372203 \h </w:instrText>
+              <w:instrText xml:space="preserve"> PAGEREF _Toc228373011 \h </w:instrText>
             </w:r>
             <w:r>
               <w:rPr>
@@ -1417,7 +1417,7 @@
               <w14:ligatures w14:val="standardContextual"/>
             </w:rPr>
           </w:pPr>
-          <w:hyperlink w:anchor="_Toc228372204" w:history="1">
+          <w:hyperlink w:anchor="_Toc228373012" w:history="1">
             <w:r>
               <w:rPr>
                 <w:rStyle w:val="Lienhypertexte"/>
@@ -1463,7 +1463,7 @@
                 <w:noProof/>
                 <w:webHidden/>
               </w:rPr>
-              <w:instrText xml:space="preserve"> PAGEREF _Toc228372204 \h </w:instrText>
+              <w:instrText xml:space="preserve"> PAGEREF _Toc228373012 \h </w:instrText>
             </w:r>
             <w:r>
               <w:rPr>
@@ -1511,7 +1511,7 @@
               <w14:ligatures w14:val="standardContextual"/>
             </w:rPr>
           </w:pPr>
-          <w:hyperlink w:anchor="_Toc228372205" w:history="1">
+          <w:hyperlink w:anchor="_Toc228373013" w:history="1">
             <w:r>
               <w:rPr>
                 <w:rStyle w:val="Lienhypertexte"/>
@@ -1557,7 +1557,7 @@
                 <w:noProof/>
                 <w:webHidden/>
               </w:rPr>
-              <w:instrText xml:space="preserve"> PAGEREF _Toc228372205 \h </w:instrText>
+              <w:instrText xml:space="preserve"> PAGEREF _Toc228373013 \h </w:instrText>
             </w:r>
             <w:r>
               <w:rPr>
@@ -1605,7 +1605,7 @@
               <w14:ligatures w14:val="standardContextual"/>
             </w:rPr>
           </w:pPr>
-          <w:hyperlink w:anchor="_Toc228372206" w:history="1">
+          <w:hyperlink w:anchor="_Toc228373014" w:history="1">
             <w:r>
               <w:rPr>
                 <w:rStyle w:val="Lienhypertexte"/>
@@ -1651,7 +1651,7 @@
                 <w:noProof/>
                 <w:webHidden/>
               </w:rPr>
-              <w:instrText xml:space="preserve"> PAGEREF _Toc228372206 \h </w:instrText>
+              <w:instrText xml:space="preserve"> PAGEREF _Toc228373014 \h </w:instrText>
             </w:r>
             <w:r>
               <w:rPr>
@@ -1699,7 +1699,7 @@
               <w14:ligatures w14:val="standardContextual"/>
             </w:rPr>
           </w:pPr>
-          <w:hyperlink w:anchor="_Toc228372207" w:history="1">
+          <w:hyperlink w:anchor="_Toc228373015" w:history="1">
             <w:r>
               <w:rPr>
                 <w:rStyle w:val="Lienhypertexte"/>
@@ -1745,7 +1745,7 @@
                 <w:noProof/>
                 <w:webHidden/>
               </w:rPr>
-              <w:instrText xml:space="preserve"> PAGEREF _Toc228372207 \h </w:instrText>
+              <w:instrText xml:space="preserve"> PAGEREF _Toc228373015 \h </w:instrText>
             </w:r>
             <w:r>
               <w:rPr>
@@ -1792,7 +1792,7 @@
               <w14:ligatures w14:val="standardContextual"/>
             </w:rPr>
           </w:pPr>
-          <w:hyperlink w:anchor="_Toc228372208" w:history="1">
+          <w:hyperlink w:anchor="_Toc228373016" w:history="1">
             <w:r>
               <w:rPr>
                 <w:noProof/>
@@ -1812,7 +1812,7 @@
                 <w:noProof/>
                 <w:webHidden/>
               </w:rPr>
-              <w:instrText xml:space="preserve"> PAGEREF _Toc228372208 \h </w:instrText>
+              <w:instrText xml:space="preserve"> PAGEREF _Toc228373016 \h </w:instrText>
             </w:r>
             <w:r>
               <w:rPr>
@@ -1860,7 +1860,7 @@
               <w14:ligatures w14:val="standardContextual"/>
             </w:rPr>
           </w:pPr>
-          <w:hyperlink w:anchor="_Toc228372209" w:history="1">
+          <w:hyperlink w:anchor="_Toc228373017" w:history="1">
             <w:r>
               <w:rPr>
                 <w:rStyle w:val="Lienhypertexte"/>
@@ -1906,7 +1906,7 @@
                 <w:noProof/>
                 <w:webHidden/>
               </w:rPr>
-              <w:instrText xml:space="preserve"> PAGEREF _Toc228372209 \h </w:instrText>
+              <w:instrText xml:space="preserve"> PAGEREF _Toc228373017 \h </w:instrText>
             </w:r>
             <w:r>
               <w:rPr>
@@ -1954,7 +1954,7 @@
               <w14:ligatures w14:val="standardContextual"/>
             </w:rPr>
           </w:pPr>
-          <w:hyperlink w:anchor="_Toc228372213" w:history="1">
+          <w:hyperlink w:anchor="_Toc228373021" w:history="1">
             <w:r>
               <w:rPr>
                 <w:rStyle w:val="Lienhypertexte"/>
@@ -2000,7 +2000,7 @@
                 <w:noProof/>
                 <w:webHidden/>
               </w:rPr>
-              <w:instrText xml:space="preserve"> PAGEREF _Toc228372213 \h </w:instrText>
+              <w:instrText xml:space="preserve"> PAGEREF _Toc228373021 \h </w:instrText>
             </w:r>
             <w:r>
               <w:rPr>
@@ -2048,7 +2048,7 @@
               <w14:ligatures w14:val="standardContextual"/>
             </w:rPr>
           </w:pPr>
-          <w:hyperlink w:anchor="_Toc228372227" w:history="1">
+          <w:hyperlink w:anchor="_Toc228373035" w:history="1">
             <w:r>
               <w:rPr>
                 <w:rStyle w:val="Lienhypertexte"/>
@@ -2094,7 +2094,7 @@
                 <w:noProof/>
                 <w:webHidden/>
               </w:rPr>
-              <w:instrText xml:space="preserve"> PAGEREF _Toc228372227 \h </w:instrText>
+              <w:instrText xml:space="preserve"> PAGEREF _Toc228373035 \h </w:instrText>
             </w:r>
             <w:r>
               <w:rPr>
@@ -2115,6 +2115,100 @@
                 <w:webHidden/>
               </w:rPr>
               <w:t>10</w:t>
+            </w:r>
+            <w:r>
+              <w:rPr>
+                <w:noProof/>
+                <w:webHidden/>
+              </w:rPr>
+              <w:fldChar w:fldCharType="end"/>
+            </w:r>
+          </w:hyperlink>
+        </w:p>
+        <w:p>
+          <w:pPr>
+            <w:pStyle w:val="TM1"/>
+            <w:tabs>
+              <w:tab w:val="left" w:pos="480"/>
+              <w:tab w:val="right" w:leader="dot" w:pos="9970"/>
+            </w:tabs>
+            <w:rPr>
+              <w:rFonts w:asciiTheme="minorHAnsi" w:eastAsiaTheme="minorEastAsia" w:hAnsiTheme="minorHAnsi" w:cstheme="minorBidi"/>
+              <w:noProof/>
+              <w:kern w:val="2"/>
+              <w:sz w:val="24"/>
+              <w:szCs w:val="24"/>
+              <w:lang w:eastAsia="fr-FR"/>
+              <w14:ligatures w14:val="standardContextual"/>
+            </w:rPr>
+          </w:pPr>
+          <w:hyperlink w:anchor="_Toc228373062" w:history="1">
+            <w:r>
+              <w:rPr>
+                <w:rStyle w:val="Lienhypertexte"/>
+                <w:noProof/>
+              </w:rPr>
+              <w:t>4.</w:t>
+            </w:r>
+            <w:r>
+              <w:rPr>
+                <w:rFonts w:asciiTheme="minorHAnsi" w:eastAsiaTheme="minorEastAsia" w:hAnsiTheme="minorHAnsi" w:cstheme="minorBidi"/>
+                <w:noProof/>
+                <w:kern w:val="2"/>
+                <w:sz w:val="24"/>
+                <w:szCs w:val="24"/>
+                <w:lang w:eastAsia="fr-FR"/>
+                <w14:ligatures w14:val="standardContextual"/>
+              </w:rPr>
+              <w:tab/>
+            </w:r>
+            <w:r>
+              <w:rPr>
+                <w:rStyle w:val="Lienhypertexte"/>
+                <w:noProof/>
+              </w:rPr>
+              <w:t>Code Backend &amp; Frontend</w:t>
+            </w:r>
+            <w:r>
+              <w:rPr>
+                <w:noProof/>
+                <w:webHidden/>
+              </w:rPr>
+              <w:tab/>
+            </w:r>
+            <w:r>
+              <w:rPr>
+                <w:noProof/>
+                <w:webHidden/>
+              </w:rPr>
+              <w:fldChar w:fldCharType="begin"/>
+            </w:r>
+            <w:r>
+              <w:rPr>
+                <w:noProof/>
+                <w:webHidden/>
+              </w:rPr>
+              <w:instrText xml:space="preserve"> PAGEREF _Toc228373062 \h </w:instrText>
+            </w:r>
+            <w:r>
+              <w:rPr>
+                <w:noProof/>
+                <w:webHidden/>
+              </w:rPr>
+            </w:r>
+            <w:r>
+              <w:rPr>
+                <w:noProof/>
+                <w:webHidden/>
+              </w:rPr>
+              <w:fldChar w:fldCharType="separate"/>
+            </w:r>
+            <w:r>
+              <w:rPr>
+                <w:noProof/>
+                <w:webHidden/>
+              </w:rPr>
+              <w:t>12</w:t>
             </w:r>
             <w:r>
               <w:rPr>
@@ -2142,13 +2236,13 @@
               <w14:ligatures w14:val="standardContextual"/>
             </w:rPr>
           </w:pPr>
-          <w:hyperlink w:anchor="_Toc228372242" w:history="1">
+          <w:hyperlink w:anchor="_Toc228373063" w:history="1">
             <w:r>
               <w:rPr>
                 <w:rStyle w:val="Lienhypertexte"/>
                 <w:noProof/>
               </w:rPr>
-              <w:t>3.3.</w:t>
+              <w:t>4.1.</w:t>
             </w:r>
             <w:r>
               <w:rPr>
@@ -2167,7 +2261,7 @@
                 <w:rStyle w:val="Lienhypertexte"/>
                 <w:noProof/>
               </w:rPr>
-              <w:t>Fonctionnement physique du NFC</w:t>
+              <w:t>Justification des langages utilisés</w:t>
             </w:r>
             <w:r>
               <w:rPr>
@@ -2188,7 +2282,7 @@
                 <w:noProof/>
                 <w:webHidden/>
               </w:rPr>
-              <w:instrText xml:space="preserve"> PAGEREF _Toc228372242 \h </w:instrText>
+              <w:instrText xml:space="preserve"> PAGEREF _Toc228373063 \h </w:instrText>
             </w:r>
             <w:r>
               <w:rPr>
@@ -2208,7 +2302,383 @@
                 <w:noProof/>
                 <w:webHidden/>
               </w:rPr>
-              <w:t>11</w:t>
+              <w:t>12</w:t>
+            </w:r>
+            <w:r>
+              <w:rPr>
+                <w:noProof/>
+                <w:webHidden/>
+              </w:rPr>
+              <w:fldChar w:fldCharType="end"/>
+            </w:r>
+          </w:hyperlink>
+        </w:p>
+        <w:p>
+          <w:pPr>
+            <w:pStyle w:val="TM2"/>
+            <w:tabs>
+              <w:tab w:val="left" w:pos="960"/>
+              <w:tab w:val="right" w:leader="dot" w:pos="9970"/>
+            </w:tabs>
+            <w:rPr>
+              <w:rFonts w:asciiTheme="minorHAnsi" w:eastAsiaTheme="minorEastAsia" w:hAnsiTheme="minorHAnsi" w:cstheme="minorBidi"/>
+              <w:noProof/>
+              <w:kern w:val="2"/>
+              <w:sz w:val="24"/>
+              <w:szCs w:val="24"/>
+              <w:lang w:eastAsia="fr-FR"/>
+              <w14:ligatures w14:val="standardContextual"/>
+            </w:rPr>
+          </w:pPr>
+          <w:hyperlink w:anchor="_Toc228373078" w:history="1">
+            <w:r>
+              <w:rPr>
+                <w:rStyle w:val="Lienhypertexte"/>
+                <w:noProof/>
+              </w:rPr>
+              <w:t>4.2.</w:t>
+            </w:r>
+            <w:r>
+              <w:rPr>
+                <w:rFonts w:asciiTheme="minorHAnsi" w:eastAsiaTheme="minorEastAsia" w:hAnsiTheme="minorHAnsi" w:cstheme="minorBidi"/>
+                <w:noProof/>
+                <w:kern w:val="2"/>
+                <w:sz w:val="24"/>
+                <w:szCs w:val="24"/>
+                <w:lang w:eastAsia="fr-FR"/>
+                <w14:ligatures w14:val="standardContextual"/>
+              </w:rPr>
+              <w:tab/>
+            </w:r>
+            <w:r>
+              <w:rPr>
+                <w:rStyle w:val="Lienhypertexte"/>
+                <w:noProof/>
+              </w:rPr>
+              <w:t>Structure du projet</w:t>
+            </w:r>
+            <w:r>
+              <w:rPr>
+                <w:noProof/>
+                <w:webHidden/>
+              </w:rPr>
+              <w:tab/>
+            </w:r>
+            <w:r>
+              <w:rPr>
+                <w:noProof/>
+                <w:webHidden/>
+              </w:rPr>
+              <w:fldChar w:fldCharType="begin"/>
+            </w:r>
+            <w:r>
+              <w:rPr>
+                <w:noProof/>
+                <w:webHidden/>
+              </w:rPr>
+              <w:instrText xml:space="preserve"> PAGEREF _Toc228373078 \h </w:instrText>
+            </w:r>
+            <w:r>
+              <w:rPr>
+                <w:noProof/>
+                <w:webHidden/>
+              </w:rPr>
+            </w:r>
+            <w:r>
+              <w:rPr>
+                <w:noProof/>
+                <w:webHidden/>
+              </w:rPr>
+              <w:fldChar w:fldCharType="separate"/>
+            </w:r>
+            <w:r>
+              <w:rPr>
+                <w:noProof/>
+                <w:webHidden/>
+              </w:rPr>
+              <w:t>12</w:t>
+            </w:r>
+            <w:r>
+              <w:rPr>
+                <w:noProof/>
+                <w:webHidden/>
+              </w:rPr>
+              <w:fldChar w:fldCharType="end"/>
+            </w:r>
+          </w:hyperlink>
+        </w:p>
+        <w:p>
+          <w:pPr>
+            <w:pStyle w:val="TM2"/>
+            <w:tabs>
+              <w:tab w:val="left" w:pos="960"/>
+              <w:tab w:val="right" w:leader="dot" w:pos="9970"/>
+            </w:tabs>
+            <w:rPr>
+              <w:rFonts w:asciiTheme="minorHAnsi" w:eastAsiaTheme="minorEastAsia" w:hAnsiTheme="minorHAnsi" w:cstheme="minorBidi"/>
+              <w:noProof/>
+              <w:kern w:val="2"/>
+              <w:sz w:val="24"/>
+              <w:szCs w:val="24"/>
+              <w:lang w:eastAsia="fr-FR"/>
+              <w14:ligatures w14:val="standardContextual"/>
+            </w:rPr>
+          </w:pPr>
+          <w:hyperlink w:anchor="_Toc228373079" w:history="1">
+            <w:r>
+              <w:rPr>
+                <w:rStyle w:val="Lienhypertexte"/>
+                <w:noProof/>
+              </w:rPr>
+              <w:t>4.3.</w:t>
+            </w:r>
+            <w:r>
+              <w:rPr>
+                <w:rFonts w:asciiTheme="minorHAnsi" w:eastAsiaTheme="minorEastAsia" w:hAnsiTheme="minorHAnsi" w:cstheme="minorBidi"/>
+                <w:noProof/>
+                <w:kern w:val="2"/>
+                <w:sz w:val="24"/>
+                <w:szCs w:val="24"/>
+                <w:lang w:eastAsia="fr-FR"/>
+                <w14:ligatures w14:val="standardContextual"/>
+              </w:rPr>
+              <w:tab/>
+            </w:r>
+            <w:r>
+              <w:rPr>
+                <w:rStyle w:val="Lienhypertexte"/>
+                <w:noProof/>
+              </w:rPr>
+              <w:t>App.js, la fondation du projet</w:t>
+            </w:r>
+            <w:r>
+              <w:rPr>
+                <w:noProof/>
+                <w:webHidden/>
+              </w:rPr>
+              <w:tab/>
+            </w:r>
+            <w:r>
+              <w:rPr>
+                <w:noProof/>
+                <w:webHidden/>
+              </w:rPr>
+              <w:fldChar w:fldCharType="begin"/>
+            </w:r>
+            <w:r>
+              <w:rPr>
+                <w:noProof/>
+                <w:webHidden/>
+              </w:rPr>
+              <w:instrText xml:space="preserve"> PAGEREF _Toc228373079 \h </w:instrText>
+            </w:r>
+            <w:r>
+              <w:rPr>
+                <w:noProof/>
+                <w:webHidden/>
+              </w:rPr>
+            </w:r>
+            <w:r>
+              <w:rPr>
+                <w:noProof/>
+                <w:webHidden/>
+              </w:rPr>
+              <w:fldChar w:fldCharType="separate"/>
+            </w:r>
+            <w:r>
+              <w:rPr>
+                <w:noProof/>
+                <w:webHidden/>
+              </w:rPr>
+              <w:t>13</w:t>
+            </w:r>
+            <w:r>
+              <w:rPr>
+                <w:noProof/>
+                <w:webHidden/>
+              </w:rPr>
+              <w:fldChar w:fldCharType="end"/>
+            </w:r>
+          </w:hyperlink>
+        </w:p>
+        <w:p>
+          <w:pPr>
+            <w:pStyle w:val="TM2"/>
+            <w:tabs>
+              <w:tab w:val="left" w:pos="960"/>
+              <w:tab w:val="right" w:leader="dot" w:pos="9970"/>
+            </w:tabs>
+            <w:rPr>
+              <w:rFonts w:asciiTheme="minorHAnsi" w:eastAsiaTheme="minorEastAsia" w:hAnsiTheme="minorHAnsi" w:cstheme="minorBidi"/>
+              <w:noProof/>
+              <w:kern w:val="2"/>
+              <w:sz w:val="24"/>
+              <w:szCs w:val="24"/>
+              <w:lang w:eastAsia="fr-FR"/>
+              <w14:ligatures w14:val="standardContextual"/>
+            </w:rPr>
+          </w:pPr>
+          <w:hyperlink w:anchor="_Toc228373080" w:history="1">
+            <w:r>
+              <w:rPr>
+                <w:rStyle w:val="Lienhypertexte"/>
+                <w:noProof/>
+              </w:rPr>
+              <w:t>4.4.</w:t>
+            </w:r>
+            <w:r>
+              <w:rPr>
+                <w:rFonts w:asciiTheme="minorHAnsi" w:eastAsiaTheme="minorEastAsia" w:hAnsiTheme="minorHAnsi" w:cstheme="minorBidi"/>
+                <w:noProof/>
+                <w:kern w:val="2"/>
+                <w:sz w:val="24"/>
+                <w:szCs w:val="24"/>
+                <w:lang w:eastAsia="fr-FR"/>
+                <w14:ligatures w14:val="standardContextual"/>
+              </w:rPr>
+              <w:tab/>
+            </w:r>
+            <w:r>
+              <w:rPr>
+                <w:rStyle w:val="Lienhypertexte"/>
+                <w:noProof/>
+              </w:rPr>
+              <w:t>O365.js – La gestion de la connexion avec Office 365</w:t>
+            </w:r>
+            <w:r>
+              <w:rPr>
+                <w:noProof/>
+                <w:webHidden/>
+              </w:rPr>
+              <w:tab/>
+            </w:r>
+            <w:r>
+              <w:rPr>
+                <w:noProof/>
+                <w:webHidden/>
+              </w:rPr>
+              <w:fldChar w:fldCharType="begin"/>
+            </w:r>
+            <w:r>
+              <w:rPr>
+                <w:noProof/>
+                <w:webHidden/>
+              </w:rPr>
+              <w:instrText xml:space="preserve"> PAGEREF _Toc228373080 \h </w:instrText>
+            </w:r>
+            <w:r>
+              <w:rPr>
+                <w:noProof/>
+                <w:webHidden/>
+              </w:rPr>
+            </w:r>
+            <w:r>
+              <w:rPr>
+                <w:noProof/>
+                <w:webHidden/>
+              </w:rPr>
+              <w:fldChar w:fldCharType="separate"/>
+            </w:r>
+            <w:r>
+              <w:rPr>
+                <w:noProof/>
+                <w:webHidden/>
+              </w:rPr>
+              <w:t>14</w:t>
+            </w:r>
+            <w:r>
+              <w:rPr>
+                <w:noProof/>
+                <w:webHidden/>
+              </w:rPr>
+              <w:fldChar w:fldCharType="end"/>
+            </w:r>
+          </w:hyperlink>
+        </w:p>
+        <w:p>
+          <w:pPr>
+            <w:pStyle w:val="TM2"/>
+            <w:tabs>
+              <w:tab w:val="left" w:pos="960"/>
+              <w:tab w:val="right" w:leader="dot" w:pos="9970"/>
+            </w:tabs>
+            <w:rPr>
+              <w:rFonts w:asciiTheme="minorHAnsi" w:eastAsiaTheme="minorEastAsia" w:hAnsiTheme="minorHAnsi" w:cstheme="minorBidi"/>
+              <w:noProof/>
+              <w:kern w:val="2"/>
+              <w:sz w:val="24"/>
+              <w:szCs w:val="24"/>
+              <w:lang w:eastAsia="fr-FR"/>
+              <w14:ligatures w14:val="standardContextual"/>
+            </w:rPr>
+          </w:pPr>
+          <w:hyperlink w:anchor="_Toc228373081" w:history="1">
+            <w:r>
+              <w:rPr>
+                <w:rStyle w:val="Lienhypertexte"/>
+                <w:noProof/>
+              </w:rPr>
+              <w:t>4.5.</w:t>
+            </w:r>
+            <w:r>
+              <w:rPr>
+                <w:rFonts w:asciiTheme="minorHAnsi" w:eastAsiaTheme="minorEastAsia" w:hAnsiTheme="minorHAnsi" w:cstheme="minorBidi"/>
+                <w:noProof/>
+                <w:kern w:val="2"/>
+                <w:sz w:val="24"/>
+                <w:szCs w:val="24"/>
+                <w:lang w:eastAsia="fr-FR"/>
+                <w14:ligatures w14:val="standardContextual"/>
+              </w:rPr>
+              <w:tab/>
+            </w:r>
+            <w:r>
+              <w:rPr>
+                <w:rStyle w:val="Lienhypertexte"/>
+                <w:noProof/>
+              </w:rPr>
+              <w:t>Match_office_to_ED.js – La gestion des rôles utilisateurs sur la PWA</w:t>
+            </w:r>
+            <w:r>
+              <w:rPr>
+                <w:noProof/>
+                <w:webHidden/>
+              </w:rPr>
+              <w:tab/>
+            </w:r>
+            <w:r>
+              <w:rPr>
+                <w:noProof/>
+                <w:webHidden/>
+              </w:rPr>
+              <w:fldChar w:fldCharType="begin"/>
+            </w:r>
+            <w:r>
+              <w:rPr>
+                <w:noProof/>
+                <w:webHidden/>
+              </w:rPr>
+              <w:instrText xml:space="preserve"> PAGEREF _Toc228373081 \h </w:instrText>
+            </w:r>
+            <w:r>
+              <w:rPr>
+                <w:noProof/>
+                <w:webHidden/>
+              </w:rPr>
+            </w:r>
+            <w:r>
+              <w:rPr>
+                <w:noProof/>
+                <w:webHidden/>
+              </w:rPr>
+              <w:fldChar w:fldCharType="separate"/>
+            </w:r>
+            <w:r>
+              <w:rPr>
+                <w:noProof/>
+                <w:webHidden/>
+              </w:rPr>
+              <w:t>15</w:t>
             </w:r>
             <w:r>
               <w:rPr>
@@ -2236,13 +2706,13 @@
               <w14:ligatures w14:val="standardContextual"/>
             </w:rPr>
           </w:pPr>
-          <w:hyperlink w:anchor="_Toc228372254" w:history="1">
+          <w:hyperlink w:anchor="_Toc228373082" w:history="1">
             <w:r>
               <w:rPr>
                 <w:rStyle w:val="Lienhypertexte"/>
                 <w:noProof/>
               </w:rPr>
-              <w:t>4.</w:t>
+              <w:t>5.</w:t>
             </w:r>
             <w:r>
               <w:rPr>
@@ -2261,7 +2731,7 @@
                 <w:rStyle w:val="Lienhypertexte"/>
                 <w:noProof/>
               </w:rPr>
-              <w:t>Code Backend &amp; Frontend</w:t>
+              <w:t>Avancement du projet</w:t>
             </w:r>
             <w:r>
               <w:rPr>
@@ -2282,7 +2752,7 @@
                 <w:noProof/>
                 <w:webHidden/>
               </w:rPr>
-              <w:instrText xml:space="preserve"> PAGEREF _Toc228372254 \h </w:instrText>
+              <w:instrText xml:space="preserve"> PAGEREF _Toc228373082 \h </w:instrText>
             </w:r>
             <w:r>
               <w:rPr>
@@ -2302,7 +2772,7 @@
                 <w:noProof/>
                 <w:webHidden/>
               </w:rPr>
-              <w:t>12</w:t>
+              <w:t>16</w:t>
             </w:r>
             <w:r>
               <w:rPr>
@@ -2330,13 +2800,13 @@
               <w14:ligatures w14:val="standardContextual"/>
             </w:rPr>
           </w:pPr>
-          <w:hyperlink w:anchor="_Toc228372255" w:history="1">
+          <w:hyperlink w:anchor="_Toc228373083" w:history="1">
             <w:r>
               <w:rPr>
                 <w:rStyle w:val="Lienhypertexte"/>
                 <w:noProof/>
               </w:rPr>
-              <w:t>4.1.</w:t>
+              <w:t>5.1.</w:t>
             </w:r>
             <w:r>
               <w:rPr>
@@ -2355,7 +2825,7 @@
                 <w:rStyle w:val="Lienhypertexte"/>
                 <w:noProof/>
               </w:rPr>
-              <w:t>Justification des langages utilisés</w:t>
+              <w:t>Récapitulatif des tâches réalisées</w:t>
             </w:r>
             <w:r>
               <w:rPr>
@@ -2376,7 +2846,7 @@
                 <w:noProof/>
                 <w:webHidden/>
               </w:rPr>
-              <w:instrText xml:space="preserve"> PAGEREF _Toc228372255 \h </w:instrText>
+              <w:instrText xml:space="preserve"> PAGEREF _Toc228373083 \h </w:instrText>
             </w:r>
             <w:r>
               <w:rPr>
@@ -2396,7 +2866,7 @@
                 <w:noProof/>
                 <w:webHidden/>
               </w:rPr>
-              <w:t>12</w:t>
+              <w:t>16</w:t>
             </w:r>
             <w:r>
               <w:rPr>
@@ -2424,13 +2894,13 @@
               <w14:ligatures w14:val="standardContextual"/>
             </w:rPr>
           </w:pPr>
-          <w:hyperlink w:anchor="_Toc228372270" w:history="1">
+          <w:hyperlink w:anchor="_Toc228373084" w:history="1">
             <w:r>
               <w:rPr>
                 <w:rStyle w:val="Lienhypertexte"/>
                 <w:noProof/>
               </w:rPr>
-              <w:t>4.2.</w:t>
+              <w:t>5.2.</w:t>
             </w:r>
             <w:r>
               <w:rPr>
@@ -2449,7 +2919,7 @@
                 <w:rStyle w:val="Lienhypertexte"/>
                 <w:noProof/>
               </w:rPr>
-              <w:t>Structure du projet</w:t>
+              <w:t>Tâches restantes à réaliser</w:t>
             </w:r>
             <w:r>
               <w:rPr>
@@ -2470,7 +2940,7 @@
                 <w:noProof/>
                 <w:webHidden/>
               </w:rPr>
-              <w:instrText xml:space="preserve"> PAGEREF _Toc228372270 \h </w:instrText>
+              <w:instrText xml:space="preserve"> PAGEREF _Toc228373084 \h </w:instrText>
             </w:r>
             <w:r>
               <w:rPr>
@@ -2490,7 +2960,571 @@
                 <w:noProof/>
                 <w:webHidden/>
               </w:rPr>
-              <w:t>12</w:t>
+              <w:t>17</w:t>
+            </w:r>
+            <w:r>
+              <w:rPr>
+                <w:noProof/>
+                <w:webHidden/>
+              </w:rPr>
+              <w:fldChar w:fldCharType="end"/>
+            </w:r>
+          </w:hyperlink>
+        </w:p>
+        <w:p>
+          <w:pPr>
+            <w:pStyle w:val="TM1"/>
+            <w:tabs>
+              <w:tab w:val="left" w:pos="480"/>
+              <w:tab w:val="right" w:leader="dot" w:pos="9970"/>
+            </w:tabs>
+            <w:rPr>
+              <w:rFonts w:asciiTheme="minorHAnsi" w:eastAsiaTheme="minorEastAsia" w:hAnsiTheme="minorHAnsi" w:cstheme="minorBidi"/>
+              <w:noProof/>
+              <w:kern w:val="2"/>
+              <w:sz w:val="24"/>
+              <w:szCs w:val="24"/>
+              <w:lang w:eastAsia="fr-FR"/>
+              <w14:ligatures w14:val="standardContextual"/>
+            </w:rPr>
+          </w:pPr>
+          <w:hyperlink w:anchor="_Toc228373085" w:history="1">
+            <w:r>
+              <w:rPr>
+                <w:rStyle w:val="Lienhypertexte"/>
+                <w:noProof/>
+              </w:rPr>
+              <w:t>6.</w:t>
+            </w:r>
+            <w:r>
+              <w:rPr>
+                <w:rFonts w:asciiTheme="minorHAnsi" w:eastAsiaTheme="minorEastAsia" w:hAnsiTheme="minorHAnsi" w:cstheme="minorBidi"/>
+                <w:noProof/>
+                <w:kern w:val="2"/>
+                <w:sz w:val="24"/>
+                <w:szCs w:val="24"/>
+                <w:lang w:eastAsia="fr-FR"/>
+                <w14:ligatures w14:val="standardContextual"/>
+              </w:rPr>
+              <w:tab/>
+            </w:r>
+            <w:r>
+              <w:rPr>
+                <w:rStyle w:val="Lienhypertexte"/>
+                <w:noProof/>
+              </w:rPr>
+              <w:t>Cahier de recette</w:t>
+            </w:r>
+            <w:r>
+              <w:rPr>
+                <w:noProof/>
+                <w:webHidden/>
+              </w:rPr>
+              <w:tab/>
+            </w:r>
+            <w:r>
+              <w:rPr>
+                <w:noProof/>
+                <w:webHidden/>
+              </w:rPr>
+              <w:fldChar w:fldCharType="begin"/>
+            </w:r>
+            <w:r>
+              <w:rPr>
+                <w:noProof/>
+                <w:webHidden/>
+              </w:rPr>
+              <w:instrText xml:space="preserve"> PAGEREF _Toc228373085 \h </w:instrText>
+            </w:r>
+            <w:r>
+              <w:rPr>
+                <w:noProof/>
+                <w:webHidden/>
+              </w:rPr>
+            </w:r>
+            <w:r>
+              <w:rPr>
+                <w:noProof/>
+                <w:webHidden/>
+              </w:rPr>
+              <w:fldChar w:fldCharType="separate"/>
+            </w:r>
+            <w:r>
+              <w:rPr>
+                <w:noProof/>
+                <w:webHidden/>
+              </w:rPr>
+              <w:t>18</w:t>
+            </w:r>
+            <w:r>
+              <w:rPr>
+                <w:noProof/>
+                <w:webHidden/>
+              </w:rPr>
+              <w:fldChar w:fldCharType="end"/>
+            </w:r>
+          </w:hyperlink>
+        </w:p>
+        <w:p>
+          <w:pPr>
+            <w:pStyle w:val="TM1"/>
+            <w:tabs>
+              <w:tab w:val="left" w:pos="480"/>
+              <w:tab w:val="right" w:leader="dot" w:pos="9970"/>
+            </w:tabs>
+            <w:rPr>
+              <w:rFonts w:asciiTheme="minorHAnsi" w:eastAsiaTheme="minorEastAsia" w:hAnsiTheme="minorHAnsi" w:cstheme="minorBidi"/>
+              <w:noProof/>
+              <w:kern w:val="2"/>
+              <w:sz w:val="24"/>
+              <w:szCs w:val="24"/>
+              <w:lang w:eastAsia="fr-FR"/>
+              <w14:ligatures w14:val="standardContextual"/>
+            </w:rPr>
+          </w:pPr>
+          <w:hyperlink w:anchor="_Toc228373086" w:history="1">
+            <w:r>
+              <w:rPr>
+                <w:rStyle w:val="Lienhypertexte"/>
+                <w:noProof/>
+              </w:rPr>
+              <w:t>7.</w:t>
+            </w:r>
+            <w:r>
+              <w:rPr>
+                <w:rFonts w:asciiTheme="minorHAnsi" w:eastAsiaTheme="minorEastAsia" w:hAnsiTheme="minorHAnsi" w:cstheme="minorBidi"/>
+                <w:noProof/>
+                <w:kern w:val="2"/>
+                <w:sz w:val="24"/>
+                <w:szCs w:val="24"/>
+                <w:lang w:eastAsia="fr-FR"/>
+                <w14:ligatures w14:val="standardContextual"/>
+              </w:rPr>
+              <w:tab/>
+            </w:r>
+            <w:r>
+              <w:rPr>
+                <w:rStyle w:val="Lienhypertexte"/>
+                <w:noProof/>
+              </w:rPr>
+              <w:t>Diagramme de Gantt</w:t>
+            </w:r>
+            <w:r>
+              <w:rPr>
+                <w:noProof/>
+                <w:webHidden/>
+              </w:rPr>
+              <w:tab/>
+            </w:r>
+            <w:r>
+              <w:rPr>
+                <w:noProof/>
+                <w:webHidden/>
+              </w:rPr>
+              <w:fldChar w:fldCharType="begin"/>
+            </w:r>
+            <w:r>
+              <w:rPr>
+                <w:noProof/>
+                <w:webHidden/>
+              </w:rPr>
+              <w:instrText xml:space="preserve"> PAGEREF _Toc228373086 \h </w:instrText>
+            </w:r>
+            <w:r>
+              <w:rPr>
+                <w:noProof/>
+                <w:webHidden/>
+              </w:rPr>
+            </w:r>
+            <w:r>
+              <w:rPr>
+                <w:noProof/>
+                <w:webHidden/>
+              </w:rPr>
+              <w:fldChar w:fldCharType="separate"/>
+            </w:r>
+            <w:r>
+              <w:rPr>
+                <w:noProof/>
+                <w:webHidden/>
+              </w:rPr>
+              <w:t>19</w:t>
+            </w:r>
+            <w:r>
+              <w:rPr>
+                <w:noProof/>
+                <w:webHidden/>
+              </w:rPr>
+              <w:fldChar w:fldCharType="end"/>
+            </w:r>
+          </w:hyperlink>
+        </w:p>
+        <w:p>
+          <w:pPr>
+            <w:pStyle w:val="TM1"/>
+            <w:tabs>
+              <w:tab w:val="left" w:pos="480"/>
+              <w:tab w:val="right" w:leader="dot" w:pos="9970"/>
+            </w:tabs>
+            <w:rPr>
+              <w:rFonts w:asciiTheme="minorHAnsi" w:eastAsiaTheme="minorEastAsia" w:hAnsiTheme="minorHAnsi" w:cstheme="minorBidi"/>
+              <w:noProof/>
+              <w:kern w:val="2"/>
+              <w:sz w:val="24"/>
+              <w:szCs w:val="24"/>
+              <w:lang w:eastAsia="fr-FR"/>
+              <w14:ligatures w14:val="standardContextual"/>
+            </w:rPr>
+          </w:pPr>
+          <w:hyperlink w:anchor="_Toc228373087" w:history="1">
+            <w:r>
+              <w:rPr>
+                <w:rStyle w:val="Lienhypertexte"/>
+                <w:noProof/>
+              </w:rPr>
+              <w:t>8.</w:t>
+            </w:r>
+            <w:r>
+              <w:rPr>
+                <w:rFonts w:asciiTheme="minorHAnsi" w:eastAsiaTheme="minorEastAsia" w:hAnsiTheme="minorHAnsi" w:cstheme="minorBidi"/>
+                <w:noProof/>
+                <w:kern w:val="2"/>
+                <w:sz w:val="24"/>
+                <w:szCs w:val="24"/>
+                <w:lang w:eastAsia="fr-FR"/>
+                <w14:ligatures w14:val="standardContextual"/>
+              </w:rPr>
+              <w:tab/>
+            </w:r>
+            <w:r>
+              <w:rPr>
+                <w:rStyle w:val="Lienhypertexte"/>
+                <w:noProof/>
+              </w:rPr>
+              <w:t>Analyse budgetaire</w:t>
+            </w:r>
+            <w:r>
+              <w:rPr>
+                <w:noProof/>
+                <w:webHidden/>
+              </w:rPr>
+              <w:tab/>
+            </w:r>
+            <w:r>
+              <w:rPr>
+                <w:noProof/>
+                <w:webHidden/>
+              </w:rPr>
+              <w:fldChar w:fldCharType="begin"/>
+            </w:r>
+            <w:r>
+              <w:rPr>
+                <w:noProof/>
+                <w:webHidden/>
+              </w:rPr>
+              <w:instrText xml:space="preserve"> PAGEREF _Toc228373087 \h </w:instrText>
+            </w:r>
+            <w:r>
+              <w:rPr>
+                <w:noProof/>
+                <w:webHidden/>
+              </w:rPr>
+            </w:r>
+            <w:r>
+              <w:rPr>
+                <w:noProof/>
+                <w:webHidden/>
+              </w:rPr>
+              <w:fldChar w:fldCharType="separate"/>
+            </w:r>
+            <w:r>
+              <w:rPr>
+                <w:noProof/>
+                <w:webHidden/>
+              </w:rPr>
+              <w:t>20</w:t>
+            </w:r>
+            <w:r>
+              <w:rPr>
+                <w:noProof/>
+                <w:webHidden/>
+              </w:rPr>
+              <w:fldChar w:fldCharType="end"/>
+            </w:r>
+          </w:hyperlink>
+        </w:p>
+        <w:p>
+          <w:pPr>
+            <w:pStyle w:val="TM1"/>
+            <w:tabs>
+              <w:tab w:val="left" w:pos="480"/>
+              <w:tab w:val="right" w:leader="dot" w:pos="9970"/>
+            </w:tabs>
+            <w:rPr>
+              <w:rFonts w:asciiTheme="minorHAnsi" w:eastAsiaTheme="minorEastAsia" w:hAnsiTheme="minorHAnsi" w:cstheme="minorBidi"/>
+              <w:noProof/>
+              <w:kern w:val="2"/>
+              <w:sz w:val="24"/>
+              <w:szCs w:val="24"/>
+              <w:lang w:eastAsia="fr-FR"/>
+              <w14:ligatures w14:val="standardContextual"/>
+            </w:rPr>
+          </w:pPr>
+          <w:hyperlink w:anchor="_Toc228373088" w:history="1">
+            <w:r>
+              <w:rPr>
+                <w:rStyle w:val="Lienhypertexte"/>
+                <w:noProof/>
+              </w:rPr>
+              <w:t>9.</w:t>
+            </w:r>
+            <w:r>
+              <w:rPr>
+                <w:rFonts w:asciiTheme="minorHAnsi" w:eastAsiaTheme="minorEastAsia" w:hAnsiTheme="minorHAnsi" w:cstheme="minorBidi"/>
+                <w:noProof/>
+                <w:kern w:val="2"/>
+                <w:sz w:val="24"/>
+                <w:szCs w:val="24"/>
+                <w:lang w:eastAsia="fr-FR"/>
+                <w14:ligatures w14:val="standardContextual"/>
+              </w:rPr>
+              <w:tab/>
+            </w:r>
+            <w:r>
+              <w:rPr>
+                <w:rStyle w:val="Lienhypertexte"/>
+                <w:noProof/>
+              </w:rPr>
+              <w:t>Ameliorations futures</w:t>
+            </w:r>
+            <w:r>
+              <w:rPr>
+                <w:noProof/>
+                <w:webHidden/>
+              </w:rPr>
+              <w:tab/>
+            </w:r>
+            <w:r>
+              <w:rPr>
+                <w:noProof/>
+                <w:webHidden/>
+              </w:rPr>
+              <w:fldChar w:fldCharType="begin"/>
+            </w:r>
+            <w:r>
+              <w:rPr>
+                <w:noProof/>
+                <w:webHidden/>
+              </w:rPr>
+              <w:instrText xml:space="preserve"> PAGEREF _Toc228373088 \h </w:instrText>
+            </w:r>
+            <w:r>
+              <w:rPr>
+                <w:noProof/>
+                <w:webHidden/>
+              </w:rPr>
+            </w:r>
+            <w:r>
+              <w:rPr>
+                <w:noProof/>
+                <w:webHidden/>
+              </w:rPr>
+              <w:fldChar w:fldCharType="separate"/>
+            </w:r>
+            <w:r>
+              <w:rPr>
+                <w:noProof/>
+                <w:webHidden/>
+              </w:rPr>
+              <w:t>20</w:t>
+            </w:r>
+            <w:r>
+              <w:rPr>
+                <w:noProof/>
+                <w:webHidden/>
+              </w:rPr>
+              <w:fldChar w:fldCharType="end"/>
+            </w:r>
+          </w:hyperlink>
+        </w:p>
+        <w:p>
+          <w:pPr>
+            <w:pStyle w:val="TM1"/>
+            <w:tabs>
+              <w:tab w:val="left" w:pos="720"/>
+              <w:tab w:val="right" w:leader="dot" w:pos="9970"/>
+            </w:tabs>
+            <w:rPr>
+              <w:rFonts w:asciiTheme="minorHAnsi" w:eastAsiaTheme="minorEastAsia" w:hAnsiTheme="minorHAnsi" w:cstheme="minorBidi"/>
+              <w:noProof/>
+              <w:kern w:val="2"/>
+              <w:sz w:val="24"/>
+              <w:szCs w:val="24"/>
+              <w:lang w:eastAsia="fr-FR"/>
+              <w14:ligatures w14:val="standardContextual"/>
+            </w:rPr>
+          </w:pPr>
+          <w:hyperlink w:anchor="_Toc228373089" w:history="1">
+            <w:r>
+              <w:rPr>
+                <w:rStyle w:val="Lienhypertexte"/>
+                <w:noProof/>
+              </w:rPr>
+              <w:t>10.</w:t>
+            </w:r>
+            <w:r>
+              <w:rPr>
+                <w:rFonts w:asciiTheme="minorHAnsi" w:eastAsiaTheme="minorEastAsia" w:hAnsiTheme="minorHAnsi" w:cstheme="minorBidi"/>
+                <w:noProof/>
+                <w:kern w:val="2"/>
+                <w:sz w:val="24"/>
+                <w:szCs w:val="24"/>
+                <w:lang w:eastAsia="fr-FR"/>
+                <w14:ligatures w14:val="standardContextual"/>
+              </w:rPr>
+              <w:tab/>
+            </w:r>
+            <w:r>
+              <w:rPr>
+                <w:rStyle w:val="Lienhypertexte"/>
+                <w:noProof/>
+              </w:rPr>
+              <w:t>Ce que cela m’a apporté</w:t>
+            </w:r>
+            <w:r>
+              <w:rPr>
+                <w:noProof/>
+                <w:webHidden/>
+              </w:rPr>
+              <w:tab/>
+            </w:r>
+            <w:r>
+              <w:rPr>
+                <w:noProof/>
+                <w:webHidden/>
+              </w:rPr>
+              <w:fldChar w:fldCharType="begin"/>
+            </w:r>
+            <w:r>
+              <w:rPr>
+                <w:noProof/>
+                <w:webHidden/>
+              </w:rPr>
+              <w:instrText xml:space="preserve"> PAGEREF _Toc228373089 \h </w:instrText>
+            </w:r>
+            <w:r>
+              <w:rPr>
+                <w:noProof/>
+                <w:webHidden/>
+              </w:rPr>
+            </w:r>
+            <w:r>
+              <w:rPr>
+                <w:noProof/>
+                <w:webHidden/>
+              </w:rPr>
+              <w:fldChar w:fldCharType="separate"/>
+            </w:r>
+            <w:r>
+              <w:rPr>
+                <w:noProof/>
+                <w:webHidden/>
+              </w:rPr>
+              <w:t>20</w:t>
+            </w:r>
+            <w:r>
+              <w:rPr>
+                <w:noProof/>
+                <w:webHidden/>
+              </w:rPr>
+              <w:fldChar w:fldCharType="end"/>
+            </w:r>
+          </w:hyperlink>
+        </w:p>
+        <w:p>
+          <w:pPr>
+            <w:pStyle w:val="TM1"/>
+            <w:tabs>
+              <w:tab w:val="left" w:pos="720"/>
+              <w:tab w:val="right" w:leader="dot" w:pos="9970"/>
+            </w:tabs>
+            <w:rPr>
+              <w:rFonts w:asciiTheme="minorHAnsi" w:eastAsiaTheme="minorEastAsia" w:hAnsiTheme="minorHAnsi" w:cstheme="minorBidi"/>
+              <w:noProof/>
+              <w:kern w:val="2"/>
+              <w:sz w:val="24"/>
+              <w:szCs w:val="24"/>
+              <w:lang w:eastAsia="fr-FR"/>
+              <w14:ligatures w14:val="standardContextual"/>
+            </w:rPr>
+          </w:pPr>
+          <w:hyperlink w:anchor="_Toc228373090" w:history="1">
+            <w:r>
+              <w:rPr>
+                <w:rStyle w:val="Lienhypertexte"/>
+                <w:noProof/>
+              </w:rPr>
+              <w:t>11.</w:t>
+            </w:r>
+            <w:r>
+              <w:rPr>
+                <w:rFonts w:asciiTheme="minorHAnsi" w:eastAsiaTheme="minorEastAsia" w:hAnsiTheme="minorHAnsi" w:cstheme="minorBidi"/>
+                <w:noProof/>
+                <w:kern w:val="2"/>
+                <w:sz w:val="24"/>
+                <w:szCs w:val="24"/>
+                <w:lang w:eastAsia="fr-FR"/>
+                <w14:ligatures w14:val="standardContextual"/>
+              </w:rPr>
+              <w:tab/>
+            </w:r>
+            <w:r>
+              <w:rPr>
+                <w:rStyle w:val="Lienhypertexte"/>
+                <w:noProof/>
+              </w:rPr>
+              <w:t>Lexique</w:t>
+            </w:r>
+            <w:r>
+              <w:rPr>
+                <w:noProof/>
+                <w:webHidden/>
+              </w:rPr>
+              <w:tab/>
+            </w:r>
+            <w:r>
+              <w:rPr>
+                <w:noProof/>
+                <w:webHidden/>
+              </w:rPr>
+              <w:fldChar w:fldCharType="begin"/>
+            </w:r>
+            <w:r>
+              <w:rPr>
+                <w:noProof/>
+                <w:webHidden/>
+              </w:rPr>
+              <w:instrText xml:space="preserve"> PAGEREF _Toc228373090 \h </w:instrText>
+            </w:r>
+            <w:r>
+              <w:rPr>
+                <w:noProof/>
+                <w:webHidden/>
+              </w:rPr>
+            </w:r>
+            <w:r>
+              <w:rPr>
+                <w:noProof/>
+                <w:webHidden/>
+              </w:rPr>
+              <w:fldChar w:fldCharType="separate"/>
+            </w:r>
+            <w:r>
+              <w:rPr>
+                <w:noProof/>
+                <w:webHidden/>
+              </w:rPr>
+              <w:t>20</w:t>
             </w:r>
             <w:r>
               <w:rPr>
@@ -2518,13 +3552,13 @@
               <w14:ligatures w14:val="standardContextual"/>
             </w:rPr>
           </w:pPr>
-          <w:hyperlink w:anchor="_Toc228372271" w:history="1">
+          <w:hyperlink w:anchor="_Toc228373091" w:history="1">
             <w:r>
               <w:rPr>
                 <w:rStyle w:val="Lienhypertexte"/>
                 <w:noProof/>
               </w:rPr>
-              <w:t>4.3.</w:t>
+              <w:t>11.1.</w:t>
             </w:r>
             <w:r>
               <w:rPr>
@@ -2543,7 +3577,7 @@
                 <w:rStyle w:val="Lienhypertexte"/>
                 <w:noProof/>
               </w:rPr>
-              <w:t>App.js, la fondation du projet</w:t>
+              <w:t>Lexique matériel physique</w:t>
             </w:r>
             <w:r>
               <w:rPr>
@@ -2564,7 +3598,7 @@
                 <w:noProof/>
                 <w:webHidden/>
               </w:rPr>
-              <w:instrText xml:space="preserve"> PAGEREF _Toc228372271 \h </w:instrText>
+              <w:instrText xml:space="preserve"> PAGEREF _Toc228373091 \h </w:instrText>
             </w:r>
             <w:r>
               <w:rPr>
@@ -2584,7 +3618,7 @@
                 <w:noProof/>
                 <w:webHidden/>
               </w:rPr>
-              <w:t>13</w:t>
+              <w:t>20</w:t>
             </w:r>
             <w:r>
               <w:rPr>
@@ -2612,13 +3646,13 @@
               <w14:ligatures w14:val="standardContextual"/>
             </w:rPr>
           </w:pPr>
-          <w:hyperlink w:anchor="_Toc228372272" w:history="1">
+          <w:hyperlink w:anchor="_Toc228373092" w:history="1">
             <w:r>
               <w:rPr>
                 <w:rStyle w:val="Lienhypertexte"/>
                 <w:noProof/>
               </w:rPr>
-              <w:t>4.4.</w:t>
+              <w:t>11.2.</w:t>
             </w:r>
             <w:r>
               <w:rPr>
@@ -2637,7 +3671,7 @@
                 <w:rStyle w:val="Lienhypertexte"/>
                 <w:noProof/>
               </w:rPr>
-              <w:t>O365.js – La gestion de la connexion avec Office 365</w:t>
+              <w:t>Lexique Dev</w:t>
             </w:r>
             <w:r>
               <w:rPr>
@@ -2658,7 +3692,7 @@
                 <w:noProof/>
                 <w:webHidden/>
               </w:rPr>
-              <w:instrText xml:space="preserve"> PAGEREF _Toc228372272 \h </w:instrText>
+              <w:instrText xml:space="preserve"> PAGEREF _Toc228373092 \h </w:instrText>
             </w:r>
             <w:r>
               <w:rPr>
@@ -2678,7 +3712,7 @@
                 <w:noProof/>
                 <w:webHidden/>
               </w:rPr>
-              <w:t>14</w:t>
+              <w:t>20</w:t>
             </w:r>
             <w:r>
               <w:rPr>
@@ -2706,13 +3740,13 @@
               <w14:ligatures w14:val="standardContextual"/>
             </w:rPr>
           </w:pPr>
-          <w:hyperlink w:anchor="_Toc228372273" w:history="1">
+          <w:hyperlink w:anchor="_Toc228373093" w:history="1">
             <w:r>
               <w:rPr>
                 <w:rStyle w:val="Lienhypertexte"/>
                 <w:noProof/>
               </w:rPr>
-              <w:t>4.5.</w:t>
+              <w:t>11.3.</w:t>
             </w:r>
             <w:r>
               <w:rPr>
@@ -2731,7 +3765,7 @@
                 <w:rStyle w:val="Lienhypertexte"/>
                 <w:noProof/>
               </w:rPr>
-              <w:t>Match_office_to_ED.js – La gestion des rôles utilisateurs sur la PWA</w:t>
+              <w:t>Lexique NFC</w:t>
             </w:r>
             <w:r>
               <w:rPr>
@@ -2752,853 +3786,7 @@
                 <w:noProof/>
                 <w:webHidden/>
               </w:rPr>
-              <w:instrText xml:space="preserve"> PAGEREF _Toc228372273 \h </w:instrText>
-            </w:r>
-            <w:r>
-              <w:rPr>
-                <w:noProof/>
-                <w:webHidden/>
-              </w:rPr>
-            </w:r>
-            <w:r>
-              <w:rPr>
-                <w:noProof/>
-                <w:webHidden/>
-              </w:rPr>
-              <w:fldChar w:fldCharType="separate"/>
-            </w:r>
-            <w:r>
-              <w:rPr>
-                <w:noProof/>
-                <w:webHidden/>
-              </w:rPr>
-              <w:t>15</w:t>
-            </w:r>
-            <w:r>
-              <w:rPr>
-                <w:noProof/>
-                <w:webHidden/>
-              </w:rPr>
-              <w:fldChar w:fldCharType="end"/>
-            </w:r>
-          </w:hyperlink>
-        </w:p>
-        <w:p>
-          <w:pPr>
-            <w:pStyle w:val="TM1"/>
-            <w:tabs>
-              <w:tab w:val="left" w:pos="480"/>
-              <w:tab w:val="right" w:leader="dot" w:pos="9970"/>
-            </w:tabs>
-            <w:rPr>
-              <w:rFonts w:asciiTheme="minorHAnsi" w:eastAsiaTheme="minorEastAsia" w:hAnsiTheme="minorHAnsi" w:cstheme="minorBidi"/>
-              <w:noProof/>
-              <w:kern w:val="2"/>
-              <w:sz w:val="24"/>
-              <w:szCs w:val="24"/>
-              <w:lang w:eastAsia="fr-FR"/>
-              <w14:ligatures w14:val="standardContextual"/>
-            </w:rPr>
-          </w:pPr>
-          <w:hyperlink w:anchor="_Toc228372274" w:history="1">
-            <w:r>
-              <w:rPr>
-                <w:rStyle w:val="Lienhypertexte"/>
-                <w:noProof/>
-              </w:rPr>
-              <w:t>5.</w:t>
-            </w:r>
-            <w:r>
-              <w:rPr>
-                <w:rFonts w:asciiTheme="minorHAnsi" w:eastAsiaTheme="minorEastAsia" w:hAnsiTheme="minorHAnsi" w:cstheme="minorBidi"/>
-                <w:noProof/>
-                <w:kern w:val="2"/>
-                <w:sz w:val="24"/>
-                <w:szCs w:val="24"/>
-                <w:lang w:eastAsia="fr-FR"/>
-                <w14:ligatures w14:val="standardContextual"/>
-              </w:rPr>
-              <w:tab/>
-            </w:r>
-            <w:r>
-              <w:rPr>
-                <w:rStyle w:val="Lienhypertexte"/>
-                <w:noProof/>
-              </w:rPr>
-              <w:t>Avancement du projet</w:t>
-            </w:r>
-            <w:r>
-              <w:rPr>
-                <w:noProof/>
-                <w:webHidden/>
-              </w:rPr>
-              <w:tab/>
-            </w:r>
-            <w:r>
-              <w:rPr>
-                <w:noProof/>
-                <w:webHidden/>
-              </w:rPr>
-              <w:fldChar w:fldCharType="begin"/>
-            </w:r>
-            <w:r>
-              <w:rPr>
-                <w:noProof/>
-                <w:webHidden/>
-              </w:rPr>
-              <w:instrText xml:space="preserve"> PAGEREF _Toc228372274 \h </w:instrText>
-            </w:r>
-            <w:r>
-              <w:rPr>
-                <w:noProof/>
-                <w:webHidden/>
-              </w:rPr>
-            </w:r>
-            <w:r>
-              <w:rPr>
-                <w:noProof/>
-                <w:webHidden/>
-              </w:rPr>
-              <w:fldChar w:fldCharType="separate"/>
-            </w:r>
-            <w:r>
-              <w:rPr>
-                <w:noProof/>
-                <w:webHidden/>
-              </w:rPr>
-              <w:t>16</w:t>
-            </w:r>
-            <w:r>
-              <w:rPr>
-                <w:noProof/>
-                <w:webHidden/>
-              </w:rPr>
-              <w:fldChar w:fldCharType="end"/>
-            </w:r>
-          </w:hyperlink>
-        </w:p>
-        <w:p>
-          <w:pPr>
-            <w:pStyle w:val="TM2"/>
-            <w:tabs>
-              <w:tab w:val="left" w:pos="960"/>
-              <w:tab w:val="right" w:leader="dot" w:pos="9970"/>
-            </w:tabs>
-            <w:rPr>
-              <w:rFonts w:asciiTheme="minorHAnsi" w:eastAsiaTheme="minorEastAsia" w:hAnsiTheme="minorHAnsi" w:cstheme="minorBidi"/>
-              <w:noProof/>
-              <w:kern w:val="2"/>
-              <w:sz w:val="24"/>
-              <w:szCs w:val="24"/>
-              <w:lang w:eastAsia="fr-FR"/>
-              <w14:ligatures w14:val="standardContextual"/>
-            </w:rPr>
-          </w:pPr>
-          <w:hyperlink w:anchor="_Toc228372275" w:history="1">
-            <w:r>
-              <w:rPr>
-                <w:rStyle w:val="Lienhypertexte"/>
-                <w:noProof/>
-              </w:rPr>
-              <w:t>5.1.</w:t>
-            </w:r>
-            <w:r>
-              <w:rPr>
-                <w:rFonts w:asciiTheme="minorHAnsi" w:eastAsiaTheme="minorEastAsia" w:hAnsiTheme="minorHAnsi" w:cstheme="minorBidi"/>
-                <w:noProof/>
-                <w:kern w:val="2"/>
-                <w:sz w:val="24"/>
-                <w:szCs w:val="24"/>
-                <w:lang w:eastAsia="fr-FR"/>
-                <w14:ligatures w14:val="standardContextual"/>
-              </w:rPr>
-              <w:tab/>
-            </w:r>
-            <w:r>
-              <w:rPr>
-                <w:rStyle w:val="Lienhypertexte"/>
-                <w:noProof/>
-              </w:rPr>
-              <w:t>Récapitulatif des tâches réalisées</w:t>
-            </w:r>
-            <w:r>
-              <w:rPr>
-                <w:noProof/>
-                <w:webHidden/>
-              </w:rPr>
-              <w:tab/>
-            </w:r>
-            <w:r>
-              <w:rPr>
-                <w:noProof/>
-                <w:webHidden/>
-              </w:rPr>
-              <w:fldChar w:fldCharType="begin"/>
-            </w:r>
-            <w:r>
-              <w:rPr>
-                <w:noProof/>
-                <w:webHidden/>
-              </w:rPr>
-              <w:instrText xml:space="preserve"> PAGEREF _Toc228372275 \h </w:instrText>
-            </w:r>
-            <w:r>
-              <w:rPr>
-                <w:noProof/>
-                <w:webHidden/>
-              </w:rPr>
-            </w:r>
-            <w:r>
-              <w:rPr>
-                <w:noProof/>
-                <w:webHidden/>
-              </w:rPr>
-              <w:fldChar w:fldCharType="separate"/>
-            </w:r>
-            <w:r>
-              <w:rPr>
-                <w:noProof/>
-                <w:webHidden/>
-              </w:rPr>
-              <w:t>16</w:t>
-            </w:r>
-            <w:r>
-              <w:rPr>
-                <w:noProof/>
-                <w:webHidden/>
-              </w:rPr>
-              <w:fldChar w:fldCharType="end"/>
-            </w:r>
-          </w:hyperlink>
-        </w:p>
-        <w:p>
-          <w:pPr>
-            <w:pStyle w:val="TM2"/>
-            <w:tabs>
-              <w:tab w:val="left" w:pos="960"/>
-              <w:tab w:val="right" w:leader="dot" w:pos="9970"/>
-            </w:tabs>
-            <w:rPr>
-              <w:rFonts w:asciiTheme="minorHAnsi" w:eastAsiaTheme="minorEastAsia" w:hAnsiTheme="minorHAnsi" w:cstheme="minorBidi"/>
-              <w:noProof/>
-              <w:kern w:val="2"/>
-              <w:sz w:val="24"/>
-              <w:szCs w:val="24"/>
-              <w:lang w:eastAsia="fr-FR"/>
-              <w14:ligatures w14:val="standardContextual"/>
-            </w:rPr>
-          </w:pPr>
-          <w:hyperlink w:anchor="_Toc228372276" w:history="1">
-            <w:r>
-              <w:rPr>
-                <w:rStyle w:val="Lienhypertexte"/>
-                <w:noProof/>
-              </w:rPr>
-              <w:t>5.2.</w:t>
-            </w:r>
-            <w:r>
-              <w:rPr>
-                <w:rFonts w:asciiTheme="minorHAnsi" w:eastAsiaTheme="minorEastAsia" w:hAnsiTheme="minorHAnsi" w:cstheme="minorBidi"/>
-                <w:noProof/>
-                <w:kern w:val="2"/>
-                <w:sz w:val="24"/>
-                <w:szCs w:val="24"/>
-                <w:lang w:eastAsia="fr-FR"/>
-                <w14:ligatures w14:val="standardContextual"/>
-              </w:rPr>
-              <w:tab/>
-            </w:r>
-            <w:r>
-              <w:rPr>
-                <w:rStyle w:val="Lienhypertexte"/>
-                <w:noProof/>
-              </w:rPr>
-              <w:t>Tâches restantes à réaliser</w:t>
-            </w:r>
-            <w:r>
-              <w:rPr>
-                <w:noProof/>
-                <w:webHidden/>
-              </w:rPr>
-              <w:tab/>
-            </w:r>
-            <w:r>
-              <w:rPr>
-                <w:noProof/>
-                <w:webHidden/>
-              </w:rPr>
-              <w:fldChar w:fldCharType="begin"/>
-            </w:r>
-            <w:r>
-              <w:rPr>
-                <w:noProof/>
-                <w:webHidden/>
-              </w:rPr>
-              <w:instrText xml:space="preserve"> PAGEREF _Toc228372276 \h </w:instrText>
-            </w:r>
-            <w:r>
-              <w:rPr>
-                <w:noProof/>
-                <w:webHidden/>
-              </w:rPr>
-            </w:r>
-            <w:r>
-              <w:rPr>
-                <w:noProof/>
-                <w:webHidden/>
-              </w:rPr>
-              <w:fldChar w:fldCharType="separate"/>
-            </w:r>
-            <w:r>
-              <w:rPr>
-                <w:noProof/>
-                <w:webHidden/>
-              </w:rPr>
-              <w:t>17</w:t>
-            </w:r>
-            <w:r>
-              <w:rPr>
-                <w:noProof/>
-                <w:webHidden/>
-              </w:rPr>
-              <w:fldChar w:fldCharType="end"/>
-            </w:r>
-          </w:hyperlink>
-        </w:p>
-        <w:p>
-          <w:pPr>
-            <w:pStyle w:val="TM1"/>
-            <w:tabs>
-              <w:tab w:val="left" w:pos="480"/>
-              <w:tab w:val="right" w:leader="dot" w:pos="9970"/>
-            </w:tabs>
-            <w:rPr>
-              <w:rFonts w:asciiTheme="minorHAnsi" w:eastAsiaTheme="minorEastAsia" w:hAnsiTheme="minorHAnsi" w:cstheme="minorBidi"/>
-              <w:noProof/>
-              <w:kern w:val="2"/>
-              <w:sz w:val="24"/>
-              <w:szCs w:val="24"/>
-              <w:lang w:eastAsia="fr-FR"/>
-              <w14:ligatures w14:val="standardContextual"/>
-            </w:rPr>
-          </w:pPr>
-          <w:hyperlink w:anchor="_Toc228372277" w:history="1">
-            <w:r>
-              <w:rPr>
-                <w:rStyle w:val="Lienhypertexte"/>
-                <w:noProof/>
-              </w:rPr>
-              <w:t>6.</w:t>
-            </w:r>
-            <w:r>
-              <w:rPr>
-                <w:rFonts w:asciiTheme="minorHAnsi" w:eastAsiaTheme="minorEastAsia" w:hAnsiTheme="minorHAnsi" w:cstheme="minorBidi"/>
-                <w:noProof/>
-                <w:kern w:val="2"/>
-                <w:sz w:val="24"/>
-                <w:szCs w:val="24"/>
-                <w:lang w:eastAsia="fr-FR"/>
-                <w14:ligatures w14:val="standardContextual"/>
-              </w:rPr>
-              <w:tab/>
-            </w:r>
-            <w:r>
-              <w:rPr>
-                <w:rStyle w:val="Lienhypertexte"/>
-                <w:noProof/>
-              </w:rPr>
-              <w:t>Tableau récapitulatif d'avancement</w:t>
-            </w:r>
-            <w:r>
-              <w:rPr>
-                <w:noProof/>
-                <w:webHidden/>
-              </w:rPr>
-              <w:tab/>
-            </w:r>
-            <w:r>
-              <w:rPr>
-                <w:noProof/>
-                <w:webHidden/>
-              </w:rPr>
-              <w:fldChar w:fldCharType="begin"/>
-            </w:r>
-            <w:r>
-              <w:rPr>
-                <w:noProof/>
-                <w:webHidden/>
-              </w:rPr>
-              <w:instrText xml:space="preserve"> PAGEREF _Toc228372277 \h </w:instrText>
-            </w:r>
-            <w:r>
-              <w:rPr>
-                <w:noProof/>
-                <w:webHidden/>
-              </w:rPr>
-            </w:r>
-            <w:r>
-              <w:rPr>
-                <w:noProof/>
-                <w:webHidden/>
-              </w:rPr>
-              <w:fldChar w:fldCharType="separate"/>
-            </w:r>
-            <w:r>
-              <w:rPr>
-                <w:noProof/>
-                <w:webHidden/>
-              </w:rPr>
-              <w:t>18</w:t>
-            </w:r>
-            <w:r>
-              <w:rPr>
-                <w:noProof/>
-                <w:webHidden/>
-              </w:rPr>
-              <w:fldChar w:fldCharType="end"/>
-            </w:r>
-          </w:hyperlink>
-        </w:p>
-        <w:p>
-          <w:pPr>
-            <w:pStyle w:val="TM1"/>
-            <w:tabs>
-              <w:tab w:val="left" w:pos="480"/>
-              <w:tab w:val="right" w:leader="dot" w:pos="9970"/>
-            </w:tabs>
-            <w:rPr>
-              <w:rFonts w:asciiTheme="minorHAnsi" w:eastAsiaTheme="minorEastAsia" w:hAnsiTheme="minorHAnsi" w:cstheme="minorBidi"/>
-              <w:noProof/>
-              <w:kern w:val="2"/>
-              <w:sz w:val="24"/>
-              <w:szCs w:val="24"/>
-              <w:lang w:eastAsia="fr-FR"/>
-              <w14:ligatures w14:val="standardContextual"/>
-            </w:rPr>
-          </w:pPr>
-          <w:hyperlink w:anchor="_Toc228372278" w:history="1">
-            <w:r>
-              <w:rPr>
-                <w:rStyle w:val="Lienhypertexte"/>
-                <w:noProof/>
-              </w:rPr>
-              <w:t>7.</w:t>
-            </w:r>
-            <w:r>
-              <w:rPr>
-                <w:rFonts w:asciiTheme="minorHAnsi" w:eastAsiaTheme="minorEastAsia" w:hAnsiTheme="minorHAnsi" w:cstheme="minorBidi"/>
-                <w:noProof/>
-                <w:kern w:val="2"/>
-                <w:sz w:val="24"/>
-                <w:szCs w:val="24"/>
-                <w:lang w:eastAsia="fr-FR"/>
-                <w14:ligatures w14:val="standardContextual"/>
-              </w:rPr>
-              <w:tab/>
-            </w:r>
-            <w:r>
-              <w:rPr>
-                <w:rStyle w:val="Lienhypertexte"/>
-                <w:noProof/>
-              </w:rPr>
-              <w:t>Diagramme de Gantt</w:t>
-            </w:r>
-            <w:r>
-              <w:rPr>
-                <w:noProof/>
-                <w:webHidden/>
-              </w:rPr>
-              <w:tab/>
-            </w:r>
-            <w:r>
-              <w:rPr>
-                <w:noProof/>
-                <w:webHidden/>
-              </w:rPr>
-              <w:fldChar w:fldCharType="begin"/>
-            </w:r>
-            <w:r>
-              <w:rPr>
-                <w:noProof/>
-                <w:webHidden/>
-              </w:rPr>
-              <w:instrText xml:space="preserve"> PAGEREF _Toc228372278 \h </w:instrText>
-            </w:r>
-            <w:r>
-              <w:rPr>
-                <w:noProof/>
-                <w:webHidden/>
-              </w:rPr>
-            </w:r>
-            <w:r>
-              <w:rPr>
-                <w:noProof/>
-                <w:webHidden/>
-              </w:rPr>
-              <w:fldChar w:fldCharType="separate"/>
-            </w:r>
-            <w:r>
-              <w:rPr>
-                <w:noProof/>
-                <w:webHidden/>
-              </w:rPr>
-              <w:t>19</w:t>
-            </w:r>
-            <w:r>
-              <w:rPr>
-                <w:noProof/>
-                <w:webHidden/>
-              </w:rPr>
-              <w:fldChar w:fldCharType="end"/>
-            </w:r>
-          </w:hyperlink>
-        </w:p>
-        <w:p>
-          <w:pPr>
-            <w:pStyle w:val="TM1"/>
-            <w:tabs>
-              <w:tab w:val="left" w:pos="480"/>
-              <w:tab w:val="right" w:leader="dot" w:pos="9970"/>
-            </w:tabs>
-            <w:rPr>
-              <w:rFonts w:asciiTheme="minorHAnsi" w:eastAsiaTheme="minorEastAsia" w:hAnsiTheme="minorHAnsi" w:cstheme="minorBidi"/>
-              <w:noProof/>
-              <w:kern w:val="2"/>
-              <w:sz w:val="24"/>
-              <w:szCs w:val="24"/>
-              <w:lang w:eastAsia="fr-FR"/>
-              <w14:ligatures w14:val="standardContextual"/>
-            </w:rPr>
-          </w:pPr>
-          <w:hyperlink w:anchor="_Toc228372279" w:history="1">
-            <w:r>
-              <w:rPr>
-                <w:rStyle w:val="Lienhypertexte"/>
-                <w:noProof/>
-              </w:rPr>
-              <w:t>8.</w:t>
-            </w:r>
-            <w:r>
-              <w:rPr>
-                <w:rFonts w:asciiTheme="minorHAnsi" w:eastAsiaTheme="minorEastAsia" w:hAnsiTheme="minorHAnsi" w:cstheme="minorBidi"/>
-                <w:noProof/>
-                <w:kern w:val="2"/>
-                <w:sz w:val="24"/>
-                <w:szCs w:val="24"/>
-                <w:lang w:eastAsia="fr-FR"/>
-                <w14:ligatures w14:val="standardContextual"/>
-              </w:rPr>
-              <w:tab/>
-            </w:r>
-            <w:r>
-              <w:rPr>
-                <w:rStyle w:val="Lienhypertexte"/>
-                <w:noProof/>
-              </w:rPr>
-              <w:t>Lexique</w:t>
-            </w:r>
-            <w:r>
-              <w:rPr>
-                <w:noProof/>
-                <w:webHidden/>
-              </w:rPr>
-              <w:tab/>
-            </w:r>
-            <w:r>
-              <w:rPr>
-                <w:noProof/>
-                <w:webHidden/>
-              </w:rPr>
-              <w:fldChar w:fldCharType="begin"/>
-            </w:r>
-            <w:r>
-              <w:rPr>
-                <w:noProof/>
-                <w:webHidden/>
-              </w:rPr>
-              <w:instrText xml:space="preserve"> PAGEREF _Toc228372279 \h </w:instrText>
-            </w:r>
-            <w:r>
-              <w:rPr>
-                <w:noProof/>
-                <w:webHidden/>
-              </w:rPr>
-            </w:r>
-            <w:r>
-              <w:rPr>
-                <w:noProof/>
-                <w:webHidden/>
-              </w:rPr>
-              <w:fldChar w:fldCharType="separate"/>
-            </w:r>
-            <w:r>
-              <w:rPr>
-                <w:noProof/>
-                <w:webHidden/>
-              </w:rPr>
-              <w:t>20</w:t>
-            </w:r>
-            <w:r>
-              <w:rPr>
-                <w:noProof/>
-                <w:webHidden/>
-              </w:rPr>
-              <w:fldChar w:fldCharType="end"/>
-            </w:r>
-          </w:hyperlink>
-        </w:p>
-        <w:p>
-          <w:pPr>
-            <w:pStyle w:val="TM2"/>
-            <w:tabs>
-              <w:tab w:val="left" w:pos="960"/>
-              <w:tab w:val="right" w:leader="dot" w:pos="9970"/>
-            </w:tabs>
-            <w:rPr>
-              <w:rFonts w:asciiTheme="minorHAnsi" w:eastAsiaTheme="minorEastAsia" w:hAnsiTheme="minorHAnsi" w:cstheme="minorBidi"/>
-              <w:noProof/>
-              <w:kern w:val="2"/>
-              <w:sz w:val="24"/>
-              <w:szCs w:val="24"/>
-              <w:lang w:eastAsia="fr-FR"/>
-              <w14:ligatures w14:val="standardContextual"/>
-            </w:rPr>
-          </w:pPr>
-          <w:hyperlink w:anchor="_Toc228372280" w:history="1">
-            <w:r>
-              <w:rPr>
-                <w:rStyle w:val="Lienhypertexte"/>
-                <w:noProof/>
-              </w:rPr>
-              <w:t>8.1.</w:t>
-            </w:r>
-            <w:r>
-              <w:rPr>
-                <w:rFonts w:asciiTheme="minorHAnsi" w:eastAsiaTheme="minorEastAsia" w:hAnsiTheme="minorHAnsi" w:cstheme="minorBidi"/>
-                <w:noProof/>
-                <w:kern w:val="2"/>
-                <w:sz w:val="24"/>
-                <w:szCs w:val="24"/>
-                <w:lang w:eastAsia="fr-FR"/>
-                <w14:ligatures w14:val="standardContextual"/>
-              </w:rPr>
-              <w:tab/>
-            </w:r>
-            <w:r>
-              <w:rPr>
-                <w:rStyle w:val="Lienhypertexte"/>
-                <w:noProof/>
-              </w:rPr>
-              <w:t>Lexique matériel physique</w:t>
-            </w:r>
-            <w:r>
-              <w:rPr>
-                <w:noProof/>
-                <w:webHidden/>
-              </w:rPr>
-              <w:tab/>
-            </w:r>
-            <w:r>
-              <w:rPr>
-                <w:noProof/>
-                <w:webHidden/>
-              </w:rPr>
-              <w:fldChar w:fldCharType="begin"/>
-            </w:r>
-            <w:r>
-              <w:rPr>
-                <w:noProof/>
-                <w:webHidden/>
-              </w:rPr>
-              <w:instrText xml:space="preserve"> PAGEREF _Toc228372280 \h </w:instrText>
-            </w:r>
-            <w:r>
-              <w:rPr>
-                <w:noProof/>
-                <w:webHidden/>
-              </w:rPr>
-            </w:r>
-            <w:r>
-              <w:rPr>
-                <w:noProof/>
-                <w:webHidden/>
-              </w:rPr>
-              <w:fldChar w:fldCharType="separate"/>
-            </w:r>
-            <w:r>
-              <w:rPr>
-                <w:noProof/>
-                <w:webHidden/>
-              </w:rPr>
-              <w:t>20</w:t>
-            </w:r>
-            <w:r>
-              <w:rPr>
-                <w:noProof/>
-                <w:webHidden/>
-              </w:rPr>
-              <w:fldChar w:fldCharType="end"/>
-            </w:r>
-          </w:hyperlink>
-        </w:p>
-        <w:p>
-          <w:pPr>
-            <w:pStyle w:val="TM2"/>
-            <w:tabs>
-              <w:tab w:val="left" w:pos="960"/>
-              <w:tab w:val="right" w:leader="dot" w:pos="9970"/>
-            </w:tabs>
-            <w:rPr>
-              <w:rFonts w:asciiTheme="minorHAnsi" w:eastAsiaTheme="minorEastAsia" w:hAnsiTheme="minorHAnsi" w:cstheme="minorBidi"/>
-              <w:noProof/>
-              <w:kern w:val="2"/>
-              <w:sz w:val="24"/>
-              <w:szCs w:val="24"/>
-              <w:lang w:eastAsia="fr-FR"/>
-              <w14:ligatures w14:val="standardContextual"/>
-            </w:rPr>
-          </w:pPr>
-          <w:hyperlink w:anchor="_Toc228372281" w:history="1">
-            <w:r>
-              <w:rPr>
-                <w:rStyle w:val="Lienhypertexte"/>
-                <w:noProof/>
-              </w:rPr>
-              <w:t>8.2.</w:t>
-            </w:r>
-            <w:r>
-              <w:rPr>
-                <w:rFonts w:asciiTheme="minorHAnsi" w:eastAsiaTheme="minorEastAsia" w:hAnsiTheme="minorHAnsi" w:cstheme="minorBidi"/>
-                <w:noProof/>
-                <w:kern w:val="2"/>
-                <w:sz w:val="24"/>
-                <w:szCs w:val="24"/>
-                <w:lang w:eastAsia="fr-FR"/>
-                <w14:ligatures w14:val="standardContextual"/>
-              </w:rPr>
-              <w:tab/>
-            </w:r>
-            <w:r>
-              <w:rPr>
-                <w:rStyle w:val="Lienhypertexte"/>
-                <w:noProof/>
-              </w:rPr>
-              <w:t>Lexique Dev</w:t>
-            </w:r>
-            <w:r>
-              <w:rPr>
-                <w:noProof/>
-                <w:webHidden/>
-              </w:rPr>
-              <w:tab/>
-            </w:r>
-            <w:r>
-              <w:rPr>
-                <w:noProof/>
-                <w:webHidden/>
-              </w:rPr>
-              <w:fldChar w:fldCharType="begin"/>
-            </w:r>
-            <w:r>
-              <w:rPr>
-                <w:noProof/>
-                <w:webHidden/>
-              </w:rPr>
-              <w:instrText xml:space="preserve"> PAGEREF _Toc228372281 \h </w:instrText>
-            </w:r>
-            <w:r>
-              <w:rPr>
-                <w:noProof/>
-                <w:webHidden/>
-              </w:rPr>
-            </w:r>
-            <w:r>
-              <w:rPr>
-                <w:noProof/>
-                <w:webHidden/>
-              </w:rPr>
-              <w:fldChar w:fldCharType="separate"/>
-            </w:r>
-            <w:r>
-              <w:rPr>
-                <w:noProof/>
-                <w:webHidden/>
-              </w:rPr>
-              <w:t>20</w:t>
-            </w:r>
-            <w:r>
-              <w:rPr>
-                <w:noProof/>
-                <w:webHidden/>
-              </w:rPr>
-              <w:fldChar w:fldCharType="end"/>
-            </w:r>
-          </w:hyperlink>
-        </w:p>
-        <w:p>
-          <w:pPr>
-            <w:pStyle w:val="TM2"/>
-            <w:tabs>
-              <w:tab w:val="left" w:pos="960"/>
-              <w:tab w:val="right" w:leader="dot" w:pos="9970"/>
-            </w:tabs>
-            <w:rPr>
-              <w:rFonts w:asciiTheme="minorHAnsi" w:eastAsiaTheme="minorEastAsia" w:hAnsiTheme="minorHAnsi" w:cstheme="minorBidi"/>
-              <w:noProof/>
-              <w:kern w:val="2"/>
-              <w:sz w:val="24"/>
-              <w:szCs w:val="24"/>
-              <w:lang w:eastAsia="fr-FR"/>
-              <w14:ligatures w14:val="standardContextual"/>
-            </w:rPr>
-          </w:pPr>
-          <w:hyperlink w:anchor="_Toc228372282" w:history="1">
-            <w:r>
-              <w:rPr>
-                <w:rStyle w:val="Lienhypertexte"/>
-                <w:noProof/>
-              </w:rPr>
-              <w:t>8.3.</w:t>
-            </w:r>
-            <w:r>
-              <w:rPr>
-                <w:rFonts w:asciiTheme="minorHAnsi" w:eastAsiaTheme="minorEastAsia" w:hAnsiTheme="minorHAnsi" w:cstheme="minorBidi"/>
-                <w:noProof/>
-                <w:kern w:val="2"/>
-                <w:sz w:val="24"/>
-                <w:szCs w:val="24"/>
-                <w:lang w:eastAsia="fr-FR"/>
-                <w14:ligatures w14:val="standardContextual"/>
-              </w:rPr>
-              <w:tab/>
-            </w:r>
-            <w:r>
-              <w:rPr>
-                <w:rStyle w:val="Lienhypertexte"/>
-                <w:noProof/>
-              </w:rPr>
-              <w:t>Lexique NFC</w:t>
-            </w:r>
-            <w:r>
-              <w:rPr>
-                <w:noProof/>
-                <w:webHidden/>
-              </w:rPr>
-              <w:tab/>
-            </w:r>
-            <w:r>
-              <w:rPr>
-                <w:noProof/>
-                <w:webHidden/>
-              </w:rPr>
-              <w:fldChar w:fldCharType="begin"/>
-            </w:r>
-            <w:r>
-              <w:rPr>
-                <w:noProof/>
-                <w:webHidden/>
-              </w:rPr>
-              <w:instrText xml:space="preserve"> PAGEREF _Toc228372282 \h </w:instrText>
+              <w:instrText xml:space="preserve"> PAGEREF _Toc228373093 \h </w:instrText>
             </w:r>
             <w:r>
               <w:rPr>
@@ -3802,7 +3990,7 @@
         </w:rPr>
       </w:pPr>
       <w:bookmarkStart w:id="1" w:name="_Toc183509429"/>
-      <w:bookmarkStart w:id="2" w:name="_Toc228372199"/>
+      <w:bookmarkStart w:id="2" w:name="_Toc228373007"/>
       <w:r>
         <w:t>Présentation Générale du Système Supportant le Proj</w:t>
       </w:r>
@@ -3994,7 +4182,7 @@
       <w:pPr>
         <w:pStyle w:val="Titre1"/>
       </w:pPr>
-      <w:bookmarkStart w:id="3" w:name="_Toc228372200"/>
+      <w:bookmarkStart w:id="3" w:name="_Toc228373008"/>
       <w:r>
         <w:t>Cahier des charges</w:t>
       </w:r>
@@ -4006,7 +4194,7 @@
         <w:pStyle w:val="Titre2"/>
       </w:pPr>
       <w:bookmarkStart w:id="4" w:name="_Toc183509430"/>
-      <w:bookmarkStart w:id="5" w:name="_Toc228372201"/>
+      <w:bookmarkStart w:id="5" w:name="_Toc228373009"/>
       <w:r>
         <w:t xml:space="preserve">Cahier des charges - </w:t>
       </w:r>
@@ -4110,7 +4298,7 @@
       <w:pPr>
         <w:pStyle w:val="Titre2"/>
       </w:pPr>
-      <w:bookmarkStart w:id="6" w:name="_Toc228372202"/>
+      <w:bookmarkStart w:id="6" w:name="_Toc228373010"/>
       <w:r>
         <w:lastRenderedPageBreak/>
         <w:t>Diagramme des cas d’utilisation (UML)</w:t>
@@ -4126,7 +4314,7 @@
         </w:numPr>
         <w:ind w:left="360" w:hanging="360"/>
       </w:pPr>
-      <w:bookmarkStart w:id="7" w:name="_Toc228372203"/>
+      <w:bookmarkStart w:id="7" w:name="_Toc228373011"/>
       <w:r>
         <w:rPr>
           <w:noProof/>
@@ -4202,7 +4390,7 @@
         <w:pStyle w:val="Titre2"/>
       </w:pPr>
       <w:bookmarkStart w:id="8" w:name="_Toc183509431"/>
-      <w:bookmarkStart w:id="9" w:name="_Toc228372204"/>
+      <w:bookmarkStart w:id="9" w:name="_Toc228373012"/>
       <w:r>
         <w:t xml:space="preserve">Cahier des charges - </w:t>
       </w:r>
@@ -4466,7 +4654,7 @@
       <w:pPr>
         <w:pStyle w:val="Titre2"/>
       </w:pPr>
-      <w:bookmarkStart w:id="10" w:name="_Toc228372205"/>
+      <w:bookmarkStart w:id="10" w:name="_Toc228373013"/>
       <w:r>
         <w:lastRenderedPageBreak/>
         <w:t>Cahier des charges – Analyse fonctionnelle</w:t>
@@ -4660,7 +4848,7 @@
       <w:pPr>
         <w:pStyle w:val="Titre2"/>
       </w:pPr>
-      <w:bookmarkStart w:id="11" w:name="_Toc228372206"/>
+      <w:bookmarkStart w:id="11" w:name="_Toc228373014"/>
       <w:r>
         <w:rPr>
           <w:noProof/>
@@ -4867,7 +5055,7 @@
         <w:pStyle w:val="Titre2"/>
       </w:pPr>
       <w:bookmarkStart w:id="13" w:name="_Toc183509436"/>
-      <w:bookmarkStart w:id="14" w:name="_Toc228372207"/>
+      <w:bookmarkStart w:id="14" w:name="_Toc228373015"/>
       <w:bookmarkEnd w:id="12"/>
       <w:r>
         <w:t xml:space="preserve">Cahier des charges – </w:t>
@@ -4892,7 +5080,7 @@
           <w:rFonts w:eastAsia="Arial"/>
         </w:rPr>
       </w:pPr>
-      <w:bookmarkStart w:id="15" w:name="_Toc228372208"/>
+      <w:bookmarkStart w:id="15" w:name="_Toc228373016"/>
       <w:r>
         <w:rPr>
           <w:noProof/>
@@ -4976,7 +5164,7 @@
           <w:bCs/>
         </w:rPr>
       </w:pPr>
-      <w:bookmarkStart w:id="16" w:name="_Toc228372209"/>
+      <w:bookmarkStart w:id="16" w:name="_Toc228373017"/>
       <w:r>
         <w:rPr>
           <w:rStyle w:val="Titre2Car"/>
@@ -5234,6 +5422,7 @@
       <w:bookmarkStart w:id="18" w:name="_Toc228351034"/>
       <w:bookmarkStart w:id="19" w:name="_Toc228354324"/>
       <w:bookmarkStart w:id="20" w:name="_Toc228372210"/>
+      <w:bookmarkStart w:id="21" w:name="_Toc228373018"/>
       <w:r>
         <w:rPr>
           <w:rStyle w:val="Titre2Car"/>
@@ -5246,6 +5435,7 @@
       <w:bookmarkEnd w:id="18"/>
       <w:bookmarkEnd w:id="19"/>
       <w:bookmarkEnd w:id="20"/>
+      <w:bookmarkEnd w:id="21"/>
       <w:r>
         <w:rPr>
           <w:rStyle w:val="Titre2Car"/>
@@ -5347,10 +5537,11 @@
           </wp:anchor>
         </w:drawing>
       </w:r>
-      <w:bookmarkStart w:id="21" w:name="_Toc228349914"/>
-      <w:bookmarkStart w:id="22" w:name="_Toc228351035"/>
-      <w:bookmarkStart w:id="23" w:name="_Toc228354325"/>
-      <w:bookmarkStart w:id="24" w:name="_Toc228372211"/>
+      <w:bookmarkStart w:id="22" w:name="_Toc228349914"/>
+      <w:bookmarkStart w:id="23" w:name="_Toc228351035"/>
+      <w:bookmarkStart w:id="24" w:name="_Toc228354325"/>
+      <w:bookmarkStart w:id="25" w:name="_Toc228372211"/>
+      <w:bookmarkStart w:id="26" w:name="_Toc228373019"/>
       <w:r>
         <w:rPr>
           <w:rStyle w:val="Titre2Car"/>
@@ -5375,10 +5566,11 @@
         </w:rPr>
         <w:t>.</w:t>
       </w:r>
-      <w:bookmarkEnd w:id="21"/>
       <w:bookmarkEnd w:id="22"/>
       <w:bookmarkEnd w:id="23"/>
       <w:bookmarkEnd w:id="24"/>
+      <w:bookmarkEnd w:id="25"/>
+      <w:bookmarkEnd w:id="26"/>
       <w:r>
         <w:rPr>
           <w:rStyle w:val="Titre2Car"/>
@@ -5405,10 +5597,11 @@
           <w:bCs w:val="0"/>
         </w:rPr>
       </w:pPr>
-      <w:bookmarkStart w:id="25" w:name="_Toc228349915"/>
-      <w:bookmarkStart w:id="26" w:name="_Toc228351036"/>
-      <w:bookmarkStart w:id="27" w:name="_Toc228354326"/>
-      <w:bookmarkStart w:id="28" w:name="_Toc228372212"/>
+      <w:bookmarkStart w:id="27" w:name="_Toc228349915"/>
+      <w:bookmarkStart w:id="28" w:name="_Toc228351036"/>
+      <w:bookmarkStart w:id="29" w:name="_Toc228354326"/>
+      <w:bookmarkStart w:id="30" w:name="_Toc228372212"/>
+      <w:bookmarkStart w:id="31" w:name="_Toc228373020"/>
       <w:r>
         <w:rPr>
           <w:rStyle w:val="Titre2Car"/>
@@ -5423,10 +5616,11 @@
         </w:rPr>
         <w:t> : Il ne faut surtout pas confondre le NFC et le RFID, le NFC découle du RFID par la norme ISO/CEI 14443. Malgré leur proximité technique, ce ne sont pas les mêmes technologies !</w:t>
       </w:r>
-      <w:bookmarkEnd w:id="25"/>
-      <w:bookmarkEnd w:id="26"/>
       <w:bookmarkEnd w:id="27"/>
       <w:bookmarkEnd w:id="28"/>
+      <w:bookmarkEnd w:id="29"/>
+      <w:bookmarkEnd w:id="30"/>
+      <w:bookmarkEnd w:id="31"/>
     </w:p>
     <w:p>
       <w:pPr>
@@ -5455,7 +5649,7 @@
           <w:bCs/>
         </w:rPr>
       </w:pPr>
-      <w:bookmarkStart w:id="29" w:name="_Toc228372213"/>
+      <w:bookmarkStart w:id="32" w:name="_Toc228373021"/>
       <w:r>
         <w:rPr>
           <w:rStyle w:val="Titre2Car"/>
@@ -5464,7 +5658,7 @@
         </w:rPr>
         <w:t>Différence entre le RFID et le NFC</w:t>
       </w:r>
-      <w:bookmarkEnd w:id="29"/>
+      <w:bookmarkEnd w:id="32"/>
     </w:p>
     <w:p>
       <w:pPr>
@@ -5483,10 +5677,11 @@
           <w:bCs w:val="0"/>
         </w:rPr>
       </w:pPr>
-      <w:bookmarkStart w:id="30" w:name="_Toc228349917"/>
-      <w:bookmarkStart w:id="31" w:name="_Toc228351038"/>
-      <w:bookmarkStart w:id="32" w:name="_Toc228354328"/>
-      <w:bookmarkStart w:id="33" w:name="_Toc228372214"/>
+      <w:bookmarkStart w:id="33" w:name="_Toc228349917"/>
+      <w:bookmarkStart w:id="34" w:name="_Toc228351038"/>
+      <w:bookmarkStart w:id="35" w:name="_Toc228354328"/>
+      <w:bookmarkStart w:id="36" w:name="_Toc228372214"/>
+      <w:bookmarkStart w:id="37" w:name="_Toc228373022"/>
       <w:r>
         <w:rPr>
           <w:rStyle w:val="Titre2Car"/>
@@ -5495,58 +5690,7 @@
         </w:rPr>
         <w:t>Malgré leur proximité technique, ces technologies sont différentes, le NFC est une technologie de communication de très courte portée (généralement 10cm maximum selon le type de norme utilisé.</w:t>
       </w:r>
-      <w:bookmarkEnd w:id="30"/>
-      <w:bookmarkEnd w:id="31"/>
-      <w:bookmarkEnd w:id="32"/>
       <w:bookmarkEnd w:id="33"/>
-    </w:p>
-    <w:p>
-      <w:pPr>
-        <w:rPr>
-          <w:rStyle w:val="Titre2Car"/>
-          <w:b w:val="0"/>
-          <w:bCs w:val="0"/>
-        </w:rPr>
-      </w:pPr>
-    </w:p>
-    <w:p>
-      <w:pPr>
-        <w:rPr>
-          <w:rStyle w:val="Titre2Car"/>
-          <w:b w:val="0"/>
-          <w:bCs w:val="0"/>
-        </w:rPr>
-      </w:pPr>
-      <w:bookmarkStart w:id="34" w:name="_Toc228349918"/>
-      <w:bookmarkStart w:id="35" w:name="_Toc228351039"/>
-      <w:bookmarkStart w:id="36" w:name="_Toc228354329"/>
-      <w:bookmarkStart w:id="37" w:name="_Toc228372215"/>
-      <w:r>
-        <w:rPr>
-          <w:rStyle w:val="Titre2Car"/>
-          <w:b w:val="0"/>
-          <w:bCs w:val="0"/>
-        </w:rPr>
-        <w:t xml:space="preserve">C’est également une technologie dite « bidirectionnelle », un appareil NFC peut agir </w:t>
-      </w:r>
-      <w:proofErr w:type="gramStart"/>
-      <w:r>
-        <w:rPr>
-          <w:rStyle w:val="Titre2Car"/>
-          <w:b w:val="0"/>
-          <w:bCs w:val="0"/>
-        </w:rPr>
-        <w:t>a</w:t>
-      </w:r>
-      <w:proofErr w:type="gramEnd"/>
-      <w:r>
-        <w:rPr>
-          <w:rStyle w:val="Titre2Car"/>
-          <w:b w:val="0"/>
-          <w:bCs w:val="0"/>
-        </w:rPr>
-        <w:t xml:space="preserve"> la fois comme un lecteur et comme une étiquette. Dans le cadre de la téléphonie, cela permet l’échange de données entre 2 téléphones (envoie de fichiers, partage de contacts…)</w:t>
-      </w:r>
       <w:bookmarkEnd w:id="34"/>
       <w:bookmarkEnd w:id="35"/>
       <w:bookmarkEnd w:id="36"/>
@@ -5569,22 +5713,42 @@
           <w:bCs w:val="0"/>
         </w:rPr>
       </w:pPr>
-      <w:bookmarkStart w:id="38" w:name="_Toc228349919"/>
-      <w:bookmarkStart w:id="39" w:name="_Toc228351040"/>
-      <w:bookmarkStart w:id="40" w:name="_Toc228354330"/>
-      <w:bookmarkStart w:id="41" w:name="_Toc228372216"/>
+      <w:bookmarkStart w:id="38" w:name="_Toc228349918"/>
+      <w:bookmarkStart w:id="39" w:name="_Toc228351039"/>
+      <w:bookmarkStart w:id="40" w:name="_Toc228354329"/>
+      <w:bookmarkStart w:id="41" w:name="_Toc228372215"/>
+      <w:bookmarkStart w:id="42" w:name="_Toc228373023"/>
       <w:r>
         <w:rPr>
           <w:rStyle w:val="Titre2Car"/>
           <w:b w:val="0"/>
           <w:bCs w:val="0"/>
         </w:rPr>
-        <w:t>Le RFID quand a lui est une technologie de communication a longue portée, selon sa fréquence (basse, haute ou ultra-haute), il peut fonctionner de quelques centimètres a plus de 100 mètres.</w:t>
+        <w:t xml:space="preserve">C’est également une technologie dite « bidirectionnelle », un appareil NFC peut agir </w:t>
+      </w:r>
+      <w:proofErr w:type="gramStart"/>
+      <w:r>
+        <w:rPr>
+          <w:rStyle w:val="Titre2Car"/>
+          <w:b w:val="0"/>
+          <w:bCs w:val="0"/>
+        </w:rPr>
+        <w:t>a</w:t>
+      </w:r>
+      <w:proofErr w:type="gramEnd"/>
+      <w:r>
+        <w:rPr>
+          <w:rStyle w:val="Titre2Car"/>
+          <w:b w:val="0"/>
+          <w:bCs w:val="0"/>
+        </w:rPr>
+        <w:t xml:space="preserve"> la fois comme un lecteur et comme une étiquette. Dans le cadre de la téléphonie, cela permet l’échange de données entre 2 téléphones (envoie de fichiers, partage de contacts…)</w:t>
       </w:r>
       <w:bookmarkEnd w:id="38"/>
       <w:bookmarkEnd w:id="39"/>
       <w:bookmarkEnd w:id="40"/>
       <w:bookmarkEnd w:id="41"/>
+      <w:bookmarkEnd w:id="42"/>
     </w:p>
     <w:p>
       <w:pPr>
@@ -5603,70 +5767,24 @@
           <w:bCs w:val="0"/>
         </w:rPr>
       </w:pPr>
-      <w:bookmarkStart w:id="42" w:name="_Toc228349920"/>
-      <w:bookmarkStart w:id="43" w:name="_Toc228351041"/>
-      <w:bookmarkStart w:id="44" w:name="_Toc228354331"/>
-      <w:bookmarkStart w:id="45" w:name="_Toc228372217"/>
+      <w:bookmarkStart w:id="43" w:name="_Toc228349919"/>
+      <w:bookmarkStart w:id="44" w:name="_Toc228351040"/>
+      <w:bookmarkStart w:id="45" w:name="_Toc228354330"/>
+      <w:bookmarkStart w:id="46" w:name="_Toc228372216"/>
+      <w:bookmarkStart w:id="47" w:name="_Toc228373024"/>
       <w:r>
         <w:rPr>
           <w:rStyle w:val="Titre2Car"/>
           <w:b w:val="0"/>
           <w:bCs w:val="0"/>
         </w:rPr>
-        <w:t xml:space="preserve">Contrairement au NFC qui est une technologie de communication bidirectionnelle, le RFID est une technologie de communication « unidirectionnelle ». Le RFID est un système « Maître/Esclave ». Un lecteur envoie un signal a une </w:t>
-      </w:r>
-      <w:r>
-        <w:rPr>
-          <w:rStyle w:val="Titre2Car"/>
-          <w:b w:val="0"/>
-          <w:bCs w:val="0"/>
-        </w:rPr>
-        <w:t>étiquette</w:t>
-      </w:r>
-      <w:r>
-        <w:rPr>
-          <w:rStyle w:val="Titre2Car"/>
-          <w:b w:val="0"/>
-          <w:bCs w:val="0"/>
-        </w:rPr>
-        <w:t xml:space="preserve"> (un tag) passive. Le tag ne </w:t>
-      </w:r>
-      <w:r>
-        <w:rPr>
-          <w:rStyle w:val="Titre2Car"/>
-          <w:b w:val="0"/>
-          <w:bCs w:val="0"/>
-        </w:rPr>
-        <w:t>peut</w:t>
-      </w:r>
-      <w:r>
-        <w:rPr>
-          <w:rStyle w:val="Titre2Car"/>
-          <w:b w:val="0"/>
-          <w:bCs w:val="0"/>
-        </w:rPr>
-        <w:t xml:space="preserve"> pas lire le lecteur. Dans le cadre de la vie courante, le RFID est très utilisé par exemple avec les badges pour rentrer dans une </w:t>
-      </w:r>
-      <w:r>
-        <w:rPr>
-          <w:rStyle w:val="Titre2Car"/>
-          <w:b w:val="0"/>
-          <w:bCs w:val="0"/>
-        </w:rPr>
-        <w:t>résidence</w:t>
-      </w:r>
-      <w:r>
-        <w:rPr>
-          <w:rStyle w:val="Titre2Car"/>
-          <w:b w:val="0"/>
-          <w:bCs w:val="0"/>
-        </w:rPr>
-        <w:t>, le tag (qui est la borne ou on pose son badge) est passif dans le système</w:t>
-      </w:r>
-      <w:bookmarkEnd w:id="42"/>
+        <w:t>Le RFID quand a lui est une technologie de communication a longue portée, selon sa fréquence (basse, haute ou ultra-haute), il peut fonctionner de quelques centimètres a plus de 100 mètres.</w:t>
+      </w:r>
       <w:bookmarkEnd w:id="43"/>
       <w:bookmarkEnd w:id="44"/>
       <w:bookmarkEnd w:id="45"/>
+      <w:bookmarkEnd w:id="46"/>
+      <w:bookmarkEnd w:id="47"/>
     </w:p>
     <w:p>
       <w:pPr>
@@ -5685,56 +5803,144 @@
           <w:bCs w:val="0"/>
         </w:rPr>
       </w:pPr>
-      <w:bookmarkStart w:id="46" w:name="_Toc228349921"/>
-      <w:bookmarkStart w:id="47" w:name="_Toc228351042"/>
-      <w:bookmarkStart w:id="48" w:name="_Toc228354332"/>
-      <w:bookmarkStart w:id="49" w:name="_Toc228372218"/>
+      <w:bookmarkStart w:id="48" w:name="_Toc228349920"/>
+      <w:bookmarkStart w:id="49" w:name="_Toc228351041"/>
+      <w:bookmarkStart w:id="50" w:name="_Toc228354331"/>
+      <w:bookmarkStart w:id="51" w:name="_Toc228372217"/>
+      <w:bookmarkStart w:id="52" w:name="_Toc228373025"/>
       <w:r>
         <w:rPr>
           <w:rStyle w:val="Titre2Car"/>
           <w:b w:val="0"/>
           <w:bCs w:val="0"/>
         </w:rPr>
-        <w:t>Pour résumer :</w:t>
-      </w:r>
-      <w:bookmarkEnd w:id="46"/>
-      <w:bookmarkEnd w:id="47"/>
+        <w:t xml:space="preserve">Contrairement au NFC qui est une technologie de communication bidirectionnelle, le RFID est une technologie de communication « unidirectionnelle ». Le RFID est un système « Maître/Esclave ». Un lecteur envoie un signal a une </w:t>
+      </w:r>
+      <w:r>
+        <w:rPr>
+          <w:rStyle w:val="Titre2Car"/>
+          <w:b w:val="0"/>
+          <w:bCs w:val="0"/>
+        </w:rPr>
+        <w:t>étiquette</w:t>
+      </w:r>
+      <w:r>
+        <w:rPr>
+          <w:rStyle w:val="Titre2Car"/>
+          <w:b w:val="0"/>
+          <w:bCs w:val="0"/>
+        </w:rPr>
+        <w:t xml:space="preserve"> (un tag) passive. Le tag ne </w:t>
+      </w:r>
+      <w:r>
+        <w:rPr>
+          <w:rStyle w:val="Titre2Car"/>
+          <w:b w:val="0"/>
+          <w:bCs w:val="0"/>
+        </w:rPr>
+        <w:t>peut</w:t>
+      </w:r>
+      <w:r>
+        <w:rPr>
+          <w:rStyle w:val="Titre2Car"/>
+          <w:b w:val="0"/>
+          <w:bCs w:val="0"/>
+        </w:rPr>
+        <w:t xml:space="preserve"> pas lire le lecteur. Dans le cadre de la vie courante, le RFID est très utilisé par exemple avec les badges pour rentrer dans une </w:t>
+      </w:r>
+      <w:r>
+        <w:rPr>
+          <w:rStyle w:val="Titre2Car"/>
+          <w:b w:val="0"/>
+          <w:bCs w:val="0"/>
+        </w:rPr>
+        <w:t>résidence</w:t>
+      </w:r>
+      <w:r>
+        <w:rPr>
+          <w:rStyle w:val="Titre2Car"/>
+          <w:b w:val="0"/>
+          <w:bCs w:val="0"/>
+        </w:rPr>
+        <w:t>, le tag (qui est la borne ou on pose son badge) est passif dans le système</w:t>
+      </w:r>
       <w:bookmarkEnd w:id="48"/>
       <w:bookmarkEnd w:id="49"/>
-    </w:p>
-    <w:p>
-      <w:pPr>
-        <w:rPr>
-          <w:rStyle w:val="Titre2Car"/>
-          <w:b w:val="0"/>
-          <w:bCs w:val="0"/>
-        </w:rPr>
-      </w:pPr>
-    </w:p>
-    <w:p>
-      <w:pPr>
-        <w:rPr>
-          <w:rStyle w:val="Titre2Car"/>
-          <w:b w:val="0"/>
-          <w:bCs w:val="0"/>
-        </w:rPr>
-      </w:pPr>
-      <w:bookmarkStart w:id="50" w:name="_Toc228349922"/>
-      <w:bookmarkStart w:id="51" w:name="_Toc228351043"/>
-      <w:bookmarkStart w:id="52" w:name="_Toc228354333"/>
-      <w:bookmarkStart w:id="53" w:name="_Toc228372219"/>
-      <w:r>
-        <w:rPr>
-          <w:rStyle w:val="Titre2Car"/>
-          <w:b w:val="0"/>
-          <w:bCs w:val="0"/>
-        </w:rPr>
-        <w:t>Le RFID sert à :</w:t>
-      </w:r>
       <w:bookmarkEnd w:id="50"/>
       <w:bookmarkEnd w:id="51"/>
       <w:bookmarkEnd w:id="52"/>
+    </w:p>
+    <w:p>
+      <w:pPr>
+        <w:rPr>
+          <w:rStyle w:val="Titre2Car"/>
+          <w:b w:val="0"/>
+          <w:bCs w:val="0"/>
+        </w:rPr>
+      </w:pPr>
+    </w:p>
+    <w:p>
+      <w:pPr>
+        <w:rPr>
+          <w:rStyle w:val="Titre2Car"/>
+          <w:b w:val="0"/>
+          <w:bCs w:val="0"/>
+        </w:rPr>
+      </w:pPr>
+      <w:bookmarkStart w:id="53" w:name="_Toc228349921"/>
+      <w:bookmarkStart w:id="54" w:name="_Toc228351042"/>
+      <w:bookmarkStart w:id="55" w:name="_Toc228354332"/>
+      <w:bookmarkStart w:id="56" w:name="_Toc228372218"/>
+      <w:bookmarkStart w:id="57" w:name="_Toc228373026"/>
+      <w:r>
+        <w:rPr>
+          <w:rStyle w:val="Titre2Car"/>
+          <w:b w:val="0"/>
+          <w:bCs w:val="0"/>
+        </w:rPr>
+        <w:t>Pour résumer :</w:t>
+      </w:r>
       <w:bookmarkEnd w:id="53"/>
+      <w:bookmarkEnd w:id="54"/>
+      <w:bookmarkEnd w:id="55"/>
+      <w:bookmarkEnd w:id="56"/>
+      <w:bookmarkEnd w:id="57"/>
+    </w:p>
+    <w:p>
+      <w:pPr>
+        <w:rPr>
+          <w:rStyle w:val="Titre2Car"/>
+          <w:b w:val="0"/>
+          <w:bCs w:val="0"/>
+        </w:rPr>
+      </w:pPr>
+    </w:p>
+    <w:p>
+      <w:pPr>
+        <w:rPr>
+          <w:rStyle w:val="Titre2Car"/>
+          <w:b w:val="0"/>
+          <w:bCs w:val="0"/>
+        </w:rPr>
+      </w:pPr>
+      <w:bookmarkStart w:id="58" w:name="_Toc228349922"/>
+      <w:bookmarkStart w:id="59" w:name="_Toc228351043"/>
+      <w:bookmarkStart w:id="60" w:name="_Toc228354333"/>
+      <w:bookmarkStart w:id="61" w:name="_Toc228372219"/>
+      <w:bookmarkStart w:id="62" w:name="_Toc228373027"/>
+      <w:r>
+        <w:rPr>
+          <w:rStyle w:val="Titre2Car"/>
+          <w:b w:val="0"/>
+          <w:bCs w:val="0"/>
+        </w:rPr>
+        <w:t>Le RFID sert à :</w:t>
+      </w:r>
+      <w:bookmarkEnd w:id="58"/>
+      <w:bookmarkEnd w:id="59"/>
+      <w:bookmarkEnd w:id="60"/>
+      <w:bookmarkEnd w:id="61"/>
+      <w:bookmarkEnd w:id="62"/>
       <w:r>
         <w:rPr>
           <w:rStyle w:val="Titre2Car"/>
@@ -5766,10 +5972,11 @@
           <w:bCs w:val="0"/>
         </w:rPr>
       </w:pPr>
-      <w:bookmarkStart w:id="54" w:name="_Toc228349923"/>
-      <w:bookmarkStart w:id="55" w:name="_Toc228351044"/>
-      <w:bookmarkStart w:id="56" w:name="_Toc228354334"/>
-      <w:bookmarkStart w:id="57" w:name="_Toc228372220"/>
+      <w:bookmarkStart w:id="63" w:name="_Toc228349923"/>
+      <w:bookmarkStart w:id="64" w:name="_Toc228351044"/>
+      <w:bookmarkStart w:id="65" w:name="_Toc228354334"/>
+      <w:bookmarkStart w:id="66" w:name="_Toc228372220"/>
+      <w:bookmarkStart w:id="67" w:name="_Toc228373028"/>
       <w:r>
         <w:rPr>
           <w:rStyle w:val="Titre2Car"/>
@@ -5778,10 +5985,11 @@
         </w:rPr>
         <w:t>Logistique : suivi des palettes dans un entrepôt</w:t>
       </w:r>
-      <w:bookmarkEnd w:id="54"/>
-      <w:bookmarkEnd w:id="55"/>
-      <w:bookmarkEnd w:id="56"/>
-      <w:bookmarkEnd w:id="57"/>
+      <w:bookmarkEnd w:id="63"/>
+      <w:bookmarkEnd w:id="64"/>
+      <w:bookmarkEnd w:id="65"/>
+      <w:bookmarkEnd w:id="66"/>
+      <w:bookmarkEnd w:id="67"/>
       <w:r>
         <w:rPr>
           <w:rStyle w:val="Titre2Car"/>
@@ -5804,10 +6012,11 @@
           <w:bCs w:val="0"/>
         </w:rPr>
       </w:pPr>
-      <w:bookmarkStart w:id="58" w:name="_Toc228349924"/>
-      <w:bookmarkStart w:id="59" w:name="_Toc228351045"/>
-      <w:bookmarkStart w:id="60" w:name="_Toc228354335"/>
-      <w:bookmarkStart w:id="61" w:name="_Toc228372221"/>
+      <w:bookmarkStart w:id="68" w:name="_Toc228349924"/>
+      <w:bookmarkStart w:id="69" w:name="_Toc228351045"/>
+      <w:bookmarkStart w:id="70" w:name="_Toc228354335"/>
+      <w:bookmarkStart w:id="71" w:name="_Toc228372221"/>
+      <w:bookmarkStart w:id="72" w:name="_Toc228373029"/>
       <w:r>
         <w:rPr>
           <w:rStyle w:val="Titre2Car"/>
@@ -5816,10 +6025,11 @@
         </w:rPr>
         <w:t>Péages : Badges de télépéage</w:t>
       </w:r>
-      <w:bookmarkEnd w:id="58"/>
-      <w:bookmarkEnd w:id="59"/>
-      <w:bookmarkEnd w:id="60"/>
-      <w:bookmarkEnd w:id="61"/>
+      <w:bookmarkEnd w:id="68"/>
+      <w:bookmarkEnd w:id="69"/>
+      <w:bookmarkEnd w:id="70"/>
+      <w:bookmarkEnd w:id="71"/>
+      <w:bookmarkEnd w:id="72"/>
       <w:r>
         <w:rPr>
           <w:rStyle w:val="Titre2Car"/>
@@ -5842,10 +6052,11 @@
           <w:bCs w:val="0"/>
         </w:rPr>
       </w:pPr>
-      <w:bookmarkStart w:id="62" w:name="_Toc228349925"/>
-      <w:bookmarkStart w:id="63" w:name="_Toc228351046"/>
-      <w:bookmarkStart w:id="64" w:name="_Toc228354336"/>
-      <w:bookmarkStart w:id="65" w:name="_Toc228372222"/>
+      <w:bookmarkStart w:id="73" w:name="_Toc228349925"/>
+      <w:bookmarkStart w:id="74" w:name="_Toc228351046"/>
+      <w:bookmarkStart w:id="75" w:name="_Toc228354336"/>
+      <w:bookmarkStart w:id="76" w:name="_Toc228372222"/>
+      <w:bookmarkStart w:id="77" w:name="_Toc228373030"/>
       <w:r>
         <w:rPr>
           <w:rStyle w:val="Titre2Car"/>
@@ -5880,10 +6091,11 @@
         </w:rPr>
         <w:t>.</w:t>
       </w:r>
-      <w:bookmarkEnd w:id="62"/>
-      <w:bookmarkEnd w:id="63"/>
-      <w:bookmarkEnd w:id="64"/>
-      <w:bookmarkEnd w:id="65"/>
+      <w:bookmarkEnd w:id="73"/>
+      <w:bookmarkEnd w:id="74"/>
+      <w:bookmarkEnd w:id="75"/>
+      <w:bookmarkEnd w:id="76"/>
+      <w:bookmarkEnd w:id="77"/>
       <w:r>
         <w:rPr>
           <w:rStyle w:val="Titre2Car"/>
@@ -5923,10 +6135,11 @@
           <w:bCs w:val="0"/>
         </w:rPr>
       </w:pPr>
-      <w:bookmarkStart w:id="66" w:name="_Toc228349926"/>
-      <w:bookmarkStart w:id="67" w:name="_Toc228351047"/>
-      <w:bookmarkStart w:id="68" w:name="_Toc228354337"/>
-      <w:bookmarkStart w:id="69" w:name="_Toc228372223"/>
+      <w:bookmarkStart w:id="78" w:name="_Toc228349926"/>
+      <w:bookmarkStart w:id="79" w:name="_Toc228351047"/>
+      <w:bookmarkStart w:id="80" w:name="_Toc228354337"/>
+      <w:bookmarkStart w:id="81" w:name="_Toc228372223"/>
+      <w:bookmarkStart w:id="82" w:name="_Toc228373031"/>
       <w:r>
         <w:rPr>
           <w:rStyle w:val="Titre2Car"/>
@@ -5936,10 +6149,11 @@
         <w:lastRenderedPageBreak/>
         <w:t>Le NFC sert à :</w:t>
       </w:r>
-      <w:bookmarkEnd w:id="66"/>
-      <w:bookmarkEnd w:id="67"/>
-      <w:bookmarkEnd w:id="68"/>
-      <w:bookmarkEnd w:id="69"/>
+      <w:bookmarkEnd w:id="78"/>
+      <w:bookmarkEnd w:id="79"/>
+      <w:bookmarkEnd w:id="80"/>
+      <w:bookmarkEnd w:id="81"/>
+      <w:bookmarkEnd w:id="82"/>
     </w:p>
     <w:p>
       <w:pPr>
@@ -5963,10 +6177,11 @@
           <w:bCs w:val="0"/>
         </w:rPr>
       </w:pPr>
-      <w:bookmarkStart w:id="70" w:name="_Toc228349927"/>
-      <w:bookmarkStart w:id="71" w:name="_Toc228351048"/>
-      <w:bookmarkStart w:id="72" w:name="_Toc228354338"/>
-      <w:bookmarkStart w:id="73" w:name="_Toc228372224"/>
+      <w:bookmarkStart w:id="83" w:name="_Toc228349927"/>
+      <w:bookmarkStart w:id="84" w:name="_Toc228351048"/>
+      <w:bookmarkStart w:id="85" w:name="_Toc228354338"/>
+      <w:bookmarkStart w:id="86" w:name="_Toc228372224"/>
+      <w:bookmarkStart w:id="87" w:name="_Toc228373032"/>
       <w:r>
         <w:rPr>
           <w:rStyle w:val="Titre2Car"/>
@@ -5975,10 +6190,11 @@
         </w:rPr>
         <w:t>Paiement mobile : Apple Pay, Google Pay, cartes bancaires sans contact</w:t>
       </w:r>
-      <w:bookmarkEnd w:id="70"/>
-      <w:bookmarkEnd w:id="71"/>
-      <w:bookmarkEnd w:id="72"/>
-      <w:bookmarkEnd w:id="73"/>
+      <w:bookmarkEnd w:id="83"/>
+      <w:bookmarkEnd w:id="84"/>
+      <w:bookmarkEnd w:id="85"/>
+      <w:bookmarkEnd w:id="86"/>
+      <w:bookmarkEnd w:id="87"/>
     </w:p>
     <w:p>
       <w:pPr>
@@ -5993,10 +6209,11 @@
           <w:bCs w:val="0"/>
         </w:rPr>
       </w:pPr>
-      <w:bookmarkStart w:id="74" w:name="_Toc228349928"/>
-      <w:bookmarkStart w:id="75" w:name="_Toc228351049"/>
-      <w:bookmarkStart w:id="76" w:name="_Toc228354339"/>
-      <w:bookmarkStart w:id="77" w:name="_Toc228372225"/>
+      <w:bookmarkStart w:id="88" w:name="_Toc228349928"/>
+      <w:bookmarkStart w:id="89" w:name="_Toc228351049"/>
+      <w:bookmarkStart w:id="90" w:name="_Toc228354339"/>
+      <w:bookmarkStart w:id="91" w:name="_Toc228372225"/>
+      <w:bookmarkStart w:id="92" w:name="_Toc228373033"/>
       <w:r>
         <w:rPr>
           <w:rStyle w:val="Titre2Car"/>
@@ -6005,10 +6222,11 @@
         </w:rPr>
         <w:t>Contrôle d’accès : Badge de bureau, carte de transport</w:t>
       </w:r>
-      <w:bookmarkEnd w:id="74"/>
-      <w:bookmarkEnd w:id="75"/>
-      <w:bookmarkEnd w:id="76"/>
-      <w:bookmarkEnd w:id="77"/>
+      <w:bookmarkEnd w:id="88"/>
+      <w:bookmarkEnd w:id="89"/>
+      <w:bookmarkEnd w:id="90"/>
+      <w:bookmarkEnd w:id="91"/>
+      <w:bookmarkEnd w:id="92"/>
       <w:r>
         <w:rPr>
           <w:rStyle w:val="Titre2Car"/>
@@ -6031,10 +6249,11 @@
           <w:bCs w:val="0"/>
         </w:rPr>
       </w:pPr>
-      <w:bookmarkStart w:id="78" w:name="_Toc228349929"/>
-      <w:bookmarkStart w:id="79" w:name="_Toc228351050"/>
-      <w:bookmarkStart w:id="80" w:name="_Toc228354340"/>
-      <w:bookmarkStart w:id="81" w:name="_Toc228372226"/>
+      <w:bookmarkStart w:id="93" w:name="_Toc228349929"/>
+      <w:bookmarkStart w:id="94" w:name="_Toc228351050"/>
+      <w:bookmarkStart w:id="95" w:name="_Toc228354340"/>
+      <w:bookmarkStart w:id="96" w:name="_Toc228372226"/>
+      <w:bookmarkStart w:id="97" w:name="_Toc228373034"/>
       <w:r>
         <w:rPr>
           <w:rStyle w:val="Titre2Car"/>
@@ -6043,10 +6262,11 @@
         </w:rPr>
         <w:t>Appairage rapide : Connecter un casque Bluetooth a son téléphone sans le brancher</w:t>
       </w:r>
-      <w:bookmarkEnd w:id="78"/>
-      <w:bookmarkEnd w:id="79"/>
-      <w:bookmarkEnd w:id="80"/>
-      <w:bookmarkEnd w:id="81"/>
+      <w:bookmarkEnd w:id="93"/>
+      <w:bookmarkEnd w:id="94"/>
+      <w:bookmarkEnd w:id="95"/>
+      <w:bookmarkEnd w:id="96"/>
+      <w:bookmarkEnd w:id="97"/>
     </w:p>
     <w:p>
       <w:pPr>
@@ -6066,8 +6286,8 @@
           <w:bCs/>
         </w:rPr>
       </w:pPr>
-      <w:bookmarkStart w:id="82" w:name="_Toc228349930"/>
-      <w:bookmarkStart w:id="83" w:name="_Toc228372227"/>
+      <w:bookmarkStart w:id="98" w:name="_Toc228349930"/>
+      <w:bookmarkStart w:id="99" w:name="_Toc228373035"/>
       <w:r>
         <w:rPr>
           <w:rStyle w:val="Titre2Car"/>
@@ -6076,8 +6296,8 @@
         </w:rPr>
         <w:t>Les différentes normes de la technologie NFC</w:t>
       </w:r>
-      <w:bookmarkEnd w:id="82"/>
-      <w:bookmarkEnd w:id="83"/>
+      <w:bookmarkEnd w:id="98"/>
+      <w:bookmarkEnd w:id="99"/>
     </w:p>
     <w:p/>
     <w:p>
@@ -6243,20 +6463,22 @@
           <w:rStyle w:val="Titre2Car"/>
         </w:rPr>
       </w:pPr>
-      <w:bookmarkStart w:id="84" w:name="_Toc228349931"/>
-      <w:bookmarkStart w:id="85" w:name="_Toc228351052"/>
-      <w:bookmarkStart w:id="86" w:name="_Toc228354342"/>
-      <w:bookmarkStart w:id="87" w:name="_Toc228372228"/>
+      <w:bookmarkStart w:id="100" w:name="_Toc228349931"/>
+      <w:bookmarkStart w:id="101" w:name="_Toc228351052"/>
+      <w:bookmarkStart w:id="102" w:name="_Toc228354342"/>
+      <w:bookmarkStart w:id="103" w:name="_Toc228372228"/>
+      <w:bookmarkStart w:id="104" w:name="_Toc228373036"/>
       <w:r>
         <w:rPr>
           <w:rStyle w:val="Titre2Car"/>
         </w:rPr>
         <w:t>Les Normes de Compatibilité (Héritage RFID)</w:t>
       </w:r>
-      <w:bookmarkEnd w:id="84"/>
-      <w:bookmarkEnd w:id="85"/>
-      <w:bookmarkEnd w:id="86"/>
-      <w:bookmarkEnd w:id="87"/>
+      <w:bookmarkEnd w:id="100"/>
+      <w:bookmarkEnd w:id="101"/>
+      <w:bookmarkEnd w:id="102"/>
+      <w:bookmarkEnd w:id="103"/>
+      <w:bookmarkEnd w:id="104"/>
     </w:p>
     <w:p>
       <w:pPr>
@@ -6271,10 +6493,11 @@
           <w:bCs w:val="0"/>
         </w:rPr>
       </w:pPr>
-      <w:bookmarkStart w:id="88" w:name="_Toc228349932"/>
-      <w:bookmarkStart w:id="89" w:name="_Toc228351053"/>
-      <w:bookmarkStart w:id="90" w:name="_Toc228354343"/>
-      <w:bookmarkStart w:id="91" w:name="_Toc228372229"/>
+      <w:bookmarkStart w:id="105" w:name="_Toc228349932"/>
+      <w:bookmarkStart w:id="106" w:name="_Toc228351053"/>
+      <w:bookmarkStart w:id="107" w:name="_Toc228354343"/>
+      <w:bookmarkStart w:id="108" w:name="_Toc228372229"/>
+      <w:bookmarkStart w:id="109" w:name="_Toc228373037"/>
       <w:r>
         <w:rPr>
           <w:rStyle w:val="Titre2Car"/>
@@ -6283,10 +6506,11 @@
         </w:rPr>
         <w:t>ISO/IEC 14443 (Type A &amp; B)</w:t>
       </w:r>
-      <w:bookmarkEnd w:id="88"/>
-      <w:bookmarkEnd w:id="89"/>
-      <w:bookmarkEnd w:id="90"/>
-      <w:bookmarkEnd w:id="91"/>
+      <w:bookmarkEnd w:id="105"/>
+      <w:bookmarkEnd w:id="106"/>
+      <w:bookmarkEnd w:id="107"/>
+      <w:bookmarkEnd w:id="108"/>
+      <w:bookmarkEnd w:id="109"/>
     </w:p>
     <w:p>
       <w:pPr>
@@ -6301,10 +6525,11 @@
           <w:bCs w:val="0"/>
         </w:rPr>
       </w:pPr>
-      <w:bookmarkStart w:id="92" w:name="_Toc228349933"/>
-      <w:bookmarkStart w:id="93" w:name="_Toc228351054"/>
-      <w:bookmarkStart w:id="94" w:name="_Toc228354344"/>
-      <w:bookmarkStart w:id="95" w:name="_Toc228372230"/>
+      <w:bookmarkStart w:id="110" w:name="_Toc228349933"/>
+      <w:bookmarkStart w:id="111" w:name="_Toc228351054"/>
+      <w:bookmarkStart w:id="112" w:name="_Toc228354344"/>
+      <w:bookmarkStart w:id="113" w:name="_Toc228372230"/>
+      <w:bookmarkStart w:id="114" w:name="_Toc228373038"/>
       <w:r>
         <w:rPr>
           <w:rStyle w:val="Titre2Car"/>
@@ -6313,10 +6538,11 @@
         </w:rPr>
         <w:t>Norme utilisée par les cartes de transports et cartes de paiement. Elle est la base de la plupart des tags</w:t>
       </w:r>
-      <w:bookmarkEnd w:id="92"/>
-      <w:bookmarkEnd w:id="93"/>
-      <w:bookmarkEnd w:id="94"/>
-      <w:bookmarkEnd w:id="95"/>
+      <w:bookmarkEnd w:id="110"/>
+      <w:bookmarkEnd w:id="111"/>
+      <w:bookmarkEnd w:id="112"/>
+      <w:bookmarkEnd w:id="113"/>
+      <w:bookmarkEnd w:id="114"/>
       <w:r>
         <w:rPr>
           <w:rStyle w:val="Titre2Car"/>
@@ -6347,10 +6573,11 @@
           <w:bCs w:val="0"/>
         </w:rPr>
       </w:pPr>
-      <w:bookmarkStart w:id="96" w:name="_Toc228349934"/>
-      <w:bookmarkStart w:id="97" w:name="_Toc228351055"/>
-      <w:bookmarkStart w:id="98" w:name="_Toc228354345"/>
-      <w:bookmarkStart w:id="99" w:name="_Toc228372231"/>
+      <w:bookmarkStart w:id="115" w:name="_Toc228349934"/>
+      <w:bookmarkStart w:id="116" w:name="_Toc228351055"/>
+      <w:bookmarkStart w:id="117" w:name="_Toc228354345"/>
+      <w:bookmarkStart w:id="118" w:name="_Toc228372231"/>
+      <w:bookmarkStart w:id="119" w:name="_Toc228373039"/>
       <w:r>
         <w:rPr>
           <w:rStyle w:val="Titre2Car"/>
@@ -6359,10 +6586,11 @@
         </w:rPr>
         <w:t>ISO/IEC 15693</w:t>
       </w:r>
-      <w:bookmarkEnd w:id="96"/>
-      <w:bookmarkEnd w:id="97"/>
-      <w:bookmarkEnd w:id="98"/>
-      <w:bookmarkEnd w:id="99"/>
+      <w:bookmarkEnd w:id="115"/>
+      <w:bookmarkEnd w:id="116"/>
+      <w:bookmarkEnd w:id="117"/>
+      <w:bookmarkEnd w:id="118"/>
+      <w:bookmarkEnd w:id="119"/>
     </w:p>
     <w:p>
       <w:pPr>
@@ -6377,10 +6605,11 @@
           <w:bCs w:val="0"/>
         </w:rPr>
       </w:pPr>
-      <w:bookmarkStart w:id="100" w:name="_Toc228349935"/>
-      <w:bookmarkStart w:id="101" w:name="_Toc228351056"/>
-      <w:bookmarkStart w:id="102" w:name="_Toc228354346"/>
-      <w:bookmarkStart w:id="103" w:name="_Toc228372232"/>
+      <w:bookmarkStart w:id="120" w:name="_Toc228349935"/>
+      <w:bookmarkStart w:id="121" w:name="_Toc228351056"/>
+      <w:bookmarkStart w:id="122" w:name="_Toc228354346"/>
+      <w:bookmarkStart w:id="123" w:name="_Toc228372232"/>
+      <w:bookmarkStart w:id="124" w:name="_Toc228373040"/>
       <w:r>
         <w:rPr>
           <w:rStyle w:val="Titre2Car"/>
@@ -6389,10 +6618,11 @@
         </w:rPr>
         <w:t>Concerne les tags dits «</w:t>
       </w:r>
-      <w:bookmarkEnd w:id="100"/>
-      <w:bookmarkEnd w:id="101"/>
-      <w:bookmarkEnd w:id="102"/>
-      <w:bookmarkEnd w:id="103"/>
+      <w:bookmarkEnd w:id="120"/>
+      <w:bookmarkEnd w:id="121"/>
+      <w:bookmarkEnd w:id="122"/>
+      <w:bookmarkEnd w:id="123"/>
+      <w:bookmarkEnd w:id="124"/>
       <w:r>
         <w:rPr>
           <w:rStyle w:val="Titre2Car"/>
@@ -6431,10 +6661,11 @@
           <w:bCs w:val="0"/>
         </w:rPr>
       </w:pPr>
-      <w:bookmarkStart w:id="104" w:name="_Toc228349936"/>
-      <w:bookmarkStart w:id="105" w:name="_Toc228351057"/>
-      <w:bookmarkStart w:id="106" w:name="_Toc228354347"/>
-      <w:bookmarkStart w:id="107" w:name="_Toc228372233"/>
+      <w:bookmarkStart w:id="125" w:name="_Toc228349936"/>
+      <w:bookmarkStart w:id="126" w:name="_Toc228351057"/>
+      <w:bookmarkStart w:id="127" w:name="_Toc228354347"/>
+      <w:bookmarkStart w:id="128" w:name="_Toc228372233"/>
+      <w:bookmarkStart w:id="129" w:name="_Toc228373041"/>
       <w:r>
         <w:rPr>
           <w:rStyle w:val="Titre2Car"/>
@@ -6443,10 +6674,11 @@
         </w:rPr>
         <w:t>ISO/IEC 18000-3</w:t>
       </w:r>
-      <w:bookmarkEnd w:id="104"/>
-      <w:bookmarkEnd w:id="105"/>
-      <w:bookmarkEnd w:id="106"/>
-      <w:bookmarkEnd w:id="107"/>
+      <w:bookmarkEnd w:id="125"/>
+      <w:bookmarkEnd w:id="126"/>
+      <w:bookmarkEnd w:id="127"/>
+      <w:bookmarkEnd w:id="128"/>
+      <w:bookmarkEnd w:id="129"/>
     </w:p>
     <w:p>
       <w:pPr>
@@ -6461,10 +6693,11 @@
           <w:bCs w:val="0"/>
         </w:rPr>
       </w:pPr>
-      <w:bookmarkStart w:id="108" w:name="_Toc228349937"/>
-      <w:bookmarkStart w:id="109" w:name="_Toc228351058"/>
-      <w:bookmarkStart w:id="110" w:name="_Toc228354348"/>
-      <w:bookmarkStart w:id="111" w:name="_Toc228372234"/>
+      <w:bookmarkStart w:id="130" w:name="_Toc228349937"/>
+      <w:bookmarkStart w:id="131" w:name="_Toc228351058"/>
+      <w:bookmarkStart w:id="132" w:name="_Toc228354348"/>
+      <w:bookmarkStart w:id="133" w:name="_Toc228372234"/>
+      <w:bookmarkStart w:id="134" w:name="_Toc228373042"/>
       <w:r>
         <w:rPr>
           <w:rStyle w:val="Titre2Car"/>
@@ -6489,10 +6722,11 @@
         </w:rPr>
         <w:t xml:space="preserve"> 13.56 MHz de manière plus globale</w:t>
       </w:r>
-      <w:bookmarkEnd w:id="108"/>
-      <w:bookmarkEnd w:id="109"/>
-      <w:bookmarkEnd w:id="110"/>
-      <w:bookmarkEnd w:id="111"/>
+      <w:bookmarkEnd w:id="130"/>
+      <w:bookmarkEnd w:id="131"/>
+      <w:bookmarkEnd w:id="132"/>
+      <w:bookmarkEnd w:id="133"/>
+      <w:bookmarkEnd w:id="134"/>
     </w:p>
     <w:p>
       <w:pPr>
@@ -6516,20 +6750,22 @@
           <w:rStyle w:val="Titre2Car"/>
         </w:rPr>
       </w:pPr>
-      <w:bookmarkStart w:id="112" w:name="_Toc228349938"/>
-      <w:bookmarkStart w:id="113" w:name="_Toc228351059"/>
-      <w:bookmarkStart w:id="114" w:name="_Toc228354349"/>
-      <w:bookmarkStart w:id="115" w:name="_Toc228372235"/>
+      <w:bookmarkStart w:id="135" w:name="_Toc228349938"/>
+      <w:bookmarkStart w:id="136" w:name="_Toc228351059"/>
+      <w:bookmarkStart w:id="137" w:name="_Toc228354349"/>
+      <w:bookmarkStart w:id="138" w:name="_Toc228372235"/>
+      <w:bookmarkStart w:id="139" w:name="_Toc228373043"/>
       <w:r>
         <w:rPr>
           <w:rStyle w:val="Titre2Car"/>
         </w:rPr>
         <w:t>Les normes de Test et de Sécurité</w:t>
       </w:r>
-      <w:bookmarkEnd w:id="112"/>
-      <w:bookmarkEnd w:id="113"/>
-      <w:bookmarkEnd w:id="114"/>
-      <w:bookmarkEnd w:id="115"/>
+      <w:bookmarkEnd w:id="135"/>
+      <w:bookmarkEnd w:id="136"/>
+      <w:bookmarkEnd w:id="137"/>
+      <w:bookmarkEnd w:id="138"/>
+      <w:bookmarkEnd w:id="139"/>
     </w:p>
     <w:p>
       <w:pPr>
@@ -6544,10 +6780,11 @@
           <w:bCs w:val="0"/>
         </w:rPr>
       </w:pPr>
-      <w:bookmarkStart w:id="116" w:name="_Toc228349939"/>
-      <w:bookmarkStart w:id="117" w:name="_Toc228351060"/>
-      <w:bookmarkStart w:id="118" w:name="_Toc228354350"/>
-      <w:bookmarkStart w:id="119" w:name="_Toc228372236"/>
+      <w:bookmarkStart w:id="140" w:name="_Toc228349939"/>
+      <w:bookmarkStart w:id="141" w:name="_Toc228351060"/>
+      <w:bookmarkStart w:id="142" w:name="_Toc228354350"/>
+      <w:bookmarkStart w:id="143" w:name="_Toc228372236"/>
+      <w:bookmarkStart w:id="144" w:name="_Toc228373044"/>
       <w:r>
         <w:rPr>
           <w:rStyle w:val="Titre2Car"/>
@@ -6556,10 +6793,11 @@
         </w:rPr>
         <w:t>ISO/IEC 22536</w:t>
       </w:r>
-      <w:bookmarkEnd w:id="116"/>
-      <w:bookmarkEnd w:id="117"/>
-      <w:bookmarkEnd w:id="118"/>
-      <w:bookmarkEnd w:id="119"/>
+      <w:bookmarkEnd w:id="140"/>
+      <w:bookmarkEnd w:id="141"/>
+      <w:bookmarkEnd w:id="142"/>
+      <w:bookmarkEnd w:id="143"/>
+      <w:bookmarkEnd w:id="144"/>
     </w:p>
     <w:p>
       <w:pPr>
@@ -6572,10 +6810,11 @@
           <w:rStyle w:val="Titre2Car"/>
         </w:rPr>
       </w:pPr>
-      <w:bookmarkStart w:id="120" w:name="_Toc228349940"/>
-      <w:bookmarkStart w:id="121" w:name="_Toc228351061"/>
-      <w:bookmarkStart w:id="122" w:name="_Toc228354351"/>
-      <w:bookmarkStart w:id="123" w:name="_Toc228372237"/>
+      <w:bookmarkStart w:id="145" w:name="_Toc228349940"/>
+      <w:bookmarkStart w:id="146" w:name="_Toc228351061"/>
+      <w:bookmarkStart w:id="147" w:name="_Toc228354351"/>
+      <w:bookmarkStart w:id="148" w:name="_Toc228372237"/>
+      <w:bookmarkStart w:id="149" w:name="_Toc228373045"/>
       <w:r>
         <w:rPr>
           <w:rStyle w:val="Titre2Car"/>
@@ -6584,10 +6823,11 @@
         </w:rPr>
         <w:t>Méthodes de test pour</w:t>
       </w:r>
-      <w:bookmarkEnd w:id="120"/>
-      <w:bookmarkEnd w:id="121"/>
-      <w:bookmarkEnd w:id="122"/>
-      <w:bookmarkEnd w:id="123"/>
+      <w:bookmarkEnd w:id="145"/>
+      <w:bookmarkEnd w:id="146"/>
+      <w:bookmarkEnd w:id="147"/>
+      <w:bookmarkEnd w:id="148"/>
+      <w:bookmarkEnd w:id="149"/>
       <w:r>
         <w:rPr>
           <w:rStyle w:val="Titre2Car"/>
@@ -6613,7 +6853,19 @@
           <w:rPr>
             <w:rStyle w:val="Lienhypertexte"/>
           </w:rPr>
-          <w:t>ce RF</w:t>
+          <w:t xml:space="preserve">ce </w:t>
+        </w:r>
+        <w:r>
+          <w:rPr>
+            <w:rStyle w:val="Lienhypertexte"/>
+          </w:rPr>
+          <w:t>R</w:t>
+        </w:r>
+        <w:r>
+          <w:rPr>
+            <w:rStyle w:val="Lienhypertexte"/>
+          </w:rPr>
+          <w:t>F</w:t>
         </w:r>
       </w:hyperlink>
       <w:r>
@@ -6636,10 +6888,11 @@
           <w:rStyle w:val="Titre2Car"/>
         </w:rPr>
       </w:pPr>
-      <w:bookmarkStart w:id="124" w:name="_Toc228349941"/>
-      <w:bookmarkStart w:id="125" w:name="_Toc228351062"/>
-      <w:bookmarkStart w:id="126" w:name="_Toc228354352"/>
-      <w:bookmarkStart w:id="127" w:name="_Toc228372238"/>
+      <w:bookmarkStart w:id="150" w:name="_Toc228349941"/>
+      <w:bookmarkStart w:id="151" w:name="_Toc228351062"/>
+      <w:bookmarkStart w:id="152" w:name="_Toc228354352"/>
+      <w:bookmarkStart w:id="153" w:name="_Toc228372238"/>
+      <w:bookmarkStart w:id="154" w:name="_Toc228373046"/>
       <w:r>
         <w:rPr>
           <w:rStyle w:val="Titre2Car"/>
@@ -6648,10 +6901,11 @@
         </w:rPr>
         <w:t>ISO/IEC 2391</w:t>
       </w:r>
-      <w:bookmarkEnd w:id="124"/>
-      <w:bookmarkEnd w:id="125"/>
-      <w:bookmarkEnd w:id="126"/>
-      <w:bookmarkEnd w:id="127"/>
+      <w:bookmarkEnd w:id="150"/>
+      <w:bookmarkEnd w:id="151"/>
+      <w:bookmarkEnd w:id="152"/>
+      <w:bookmarkEnd w:id="153"/>
+      <w:bookmarkEnd w:id="154"/>
     </w:p>
     <w:p>
       <w:pPr>
@@ -6664,10 +6918,11 @@
           <w:rStyle w:val="Titre2Car"/>
         </w:rPr>
       </w:pPr>
-      <w:bookmarkStart w:id="128" w:name="_Toc228349942"/>
-      <w:bookmarkStart w:id="129" w:name="_Toc228351063"/>
-      <w:bookmarkStart w:id="130" w:name="_Toc228354353"/>
-      <w:bookmarkStart w:id="131" w:name="_Toc228372239"/>
+      <w:bookmarkStart w:id="155" w:name="_Toc228349942"/>
+      <w:bookmarkStart w:id="156" w:name="_Toc228351063"/>
+      <w:bookmarkStart w:id="157" w:name="_Toc228354353"/>
+      <w:bookmarkStart w:id="158" w:name="_Toc228372239"/>
+      <w:bookmarkStart w:id="159" w:name="_Toc228373047"/>
       <w:r>
         <w:rPr>
           <w:rStyle w:val="Titre2Car"/>
@@ -6676,10 +6931,11 @@
         </w:rPr>
         <w:t>Méthodes de test pour les protocoles (NFCIP-1)</w:t>
       </w:r>
-      <w:bookmarkEnd w:id="128"/>
-      <w:bookmarkEnd w:id="129"/>
-      <w:bookmarkEnd w:id="130"/>
-      <w:bookmarkEnd w:id="131"/>
+      <w:bookmarkEnd w:id="155"/>
+      <w:bookmarkEnd w:id="156"/>
+      <w:bookmarkEnd w:id="157"/>
+      <w:bookmarkEnd w:id="158"/>
+      <w:bookmarkEnd w:id="159"/>
     </w:p>
     <w:p>
       <w:pPr>
@@ -6692,10 +6948,11 @@
           <w:rStyle w:val="Titre2Car"/>
         </w:rPr>
       </w:pPr>
-      <w:bookmarkStart w:id="132" w:name="_Toc228349943"/>
-      <w:bookmarkStart w:id="133" w:name="_Toc228351064"/>
-      <w:bookmarkStart w:id="134" w:name="_Toc228354354"/>
-      <w:bookmarkStart w:id="135" w:name="_Toc228372240"/>
+      <w:bookmarkStart w:id="160" w:name="_Toc228349943"/>
+      <w:bookmarkStart w:id="161" w:name="_Toc228351064"/>
+      <w:bookmarkStart w:id="162" w:name="_Toc228354354"/>
+      <w:bookmarkStart w:id="163" w:name="_Toc228372240"/>
+      <w:bookmarkStart w:id="164" w:name="_Toc228373048"/>
       <w:r>
         <w:rPr>
           <w:rStyle w:val="Titre2Car"/>
@@ -6704,10 +6961,11 @@
         </w:rPr>
         <w:t>ISO/IEC 13157 (Série)</w:t>
       </w:r>
-      <w:bookmarkEnd w:id="132"/>
-      <w:bookmarkEnd w:id="133"/>
-      <w:bookmarkEnd w:id="134"/>
-      <w:bookmarkEnd w:id="135"/>
+      <w:bookmarkEnd w:id="160"/>
+      <w:bookmarkEnd w:id="161"/>
+      <w:bookmarkEnd w:id="162"/>
+      <w:bookmarkEnd w:id="163"/>
+      <w:bookmarkEnd w:id="164"/>
     </w:p>
     <w:p>
       <w:pPr>
@@ -6720,10 +6978,11 @@
           <w:rStyle w:val="Titre2Car"/>
         </w:rPr>
       </w:pPr>
-      <w:bookmarkStart w:id="136" w:name="_Toc228349944"/>
-      <w:bookmarkStart w:id="137" w:name="_Toc228351065"/>
-      <w:bookmarkStart w:id="138" w:name="_Toc228354355"/>
-      <w:bookmarkStart w:id="139" w:name="_Toc228372241"/>
+      <w:bookmarkStart w:id="165" w:name="_Toc228349944"/>
+      <w:bookmarkStart w:id="166" w:name="_Toc228351065"/>
+      <w:bookmarkStart w:id="167" w:name="_Toc228354355"/>
+      <w:bookmarkStart w:id="168" w:name="_Toc228372241"/>
+      <w:bookmarkStart w:id="169" w:name="_Toc228373049"/>
       <w:r>
         <w:rPr>
           <w:rStyle w:val="Titre2Car"/>
@@ -6732,10 +6991,11 @@
         </w:rPr>
         <w:t>Concerne la sécurité (</w:t>
       </w:r>
-      <w:bookmarkEnd w:id="136"/>
-      <w:bookmarkEnd w:id="137"/>
-      <w:bookmarkEnd w:id="138"/>
-      <w:bookmarkEnd w:id="139"/>
+      <w:bookmarkEnd w:id="165"/>
+      <w:bookmarkEnd w:id="166"/>
+      <w:bookmarkEnd w:id="167"/>
+      <w:bookmarkEnd w:id="168"/>
+      <w:bookmarkEnd w:id="169"/>
       <w:r>
         <w:rPr>
           <w:rStyle w:val="Titre2Car"/>
@@ -6859,7 +7119,7 @@
           <w:bCs/>
         </w:rPr>
       </w:pPr>
-      <w:bookmarkStart w:id="140" w:name="_Toc228372242"/>
+      <w:bookmarkStart w:id="170" w:name="_Toc228373050"/>
       <w:r>
         <w:rPr>
           <w:rStyle w:val="Titre2Car"/>
@@ -6869,7 +7129,7 @@
         <w:lastRenderedPageBreak/>
         <w:t>Fonctionnement physique du NFC</w:t>
       </w:r>
-      <w:bookmarkEnd w:id="140"/>
+      <w:bookmarkEnd w:id="170"/>
     </w:p>
     <w:p>
       <w:pPr>
@@ -6948,8 +7208,9 @@
       </w:r>
     </w:p>
     <w:p>
-      <w:bookmarkStart w:id="141" w:name="_Toc228354357"/>
-      <w:bookmarkStart w:id="142" w:name="_Toc228372243"/>
+      <w:bookmarkStart w:id="171" w:name="_Toc228354357"/>
+      <w:bookmarkStart w:id="172" w:name="_Toc228372243"/>
+      <w:bookmarkStart w:id="173" w:name="_Toc228373051"/>
       <w:r>
         <w:rPr>
           <w:rStyle w:val="Titre2Car"/>
@@ -6970,8 +7231,9 @@
         </w:rPr>
         <w:t>:</w:t>
       </w:r>
-      <w:bookmarkEnd w:id="141"/>
-      <w:bookmarkEnd w:id="142"/>
+      <w:bookmarkEnd w:id="171"/>
+      <w:bookmarkEnd w:id="172"/>
+      <w:bookmarkEnd w:id="173"/>
       <w:r>
         <w:rPr>
           <w:rStyle w:val="Titre2Car"/>
@@ -6994,16 +7256,18 @@
           <w:rStyle w:val="Titre2Car"/>
         </w:rPr>
       </w:pPr>
-      <w:bookmarkStart w:id="143" w:name="_Toc228354358"/>
-      <w:bookmarkStart w:id="144" w:name="_Toc228372244"/>
+      <w:bookmarkStart w:id="174" w:name="_Toc228354358"/>
+      <w:bookmarkStart w:id="175" w:name="_Toc228372244"/>
+      <w:bookmarkStart w:id="176" w:name="_Toc228373052"/>
       <w:r>
         <w:rPr>
           <w:rStyle w:val="Titre2Car"/>
         </w:rPr>
         <w:t>Fonctionnement de l’induction électromagnétique</w:t>
       </w:r>
-      <w:bookmarkEnd w:id="143"/>
-      <w:bookmarkEnd w:id="144"/>
+      <w:bookmarkEnd w:id="174"/>
+      <w:bookmarkEnd w:id="175"/>
+      <w:bookmarkEnd w:id="176"/>
     </w:p>
     <w:p>
       <w:pPr>
@@ -7020,8 +7284,9 @@
           <w:bCs w:val="0"/>
         </w:rPr>
       </w:pPr>
-      <w:bookmarkStart w:id="145" w:name="_Toc228354359"/>
-      <w:bookmarkStart w:id="146" w:name="_Toc228372245"/>
+      <w:bookmarkStart w:id="177" w:name="_Toc228354359"/>
+      <w:bookmarkStart w:id="178" w:name="_Toc228372245"/>
+      <w:bookmarkStart w:id="179" w:name="_Toc228373053"/>
       <w:r>
         <w:rPr>
           <w:rStyle w:val="Titre2Car"/>
@@ -7030,8 +7295,9 @@
         </w:rPr>
         <w:t>Le fonctionnement de l’induction Electromagnétique repose sur le couplage inductif entre deux antennes en forme de bobines</w:t>
       </w:r>
-      <w:bookmarkEnd w:id="145"/>
-      <w:bookmarkEnd w:id="146"/>
+      <w:bookmarkEnd w:id="177"/>
+      <w:bookmarkEnd w:id="178"/>
+      <w:bookmarkEnd w:id="179"/>
       <w:r>
         <w:rPr>
           <w:rStyle w:val="Titre2Car"/>
@@ -7295,8 +7561,9 @@
           <w:bCs w:val="0"/>
         </w:rPr>
       </w:pPr>
-      <w:bookmarkStart w:id="147" w:name="_Toc228354360"/>
-      <w:bookmarkStart w:id="148" w:name="_Toc228372246"/>
+      <w:bookmarkStart w:id="180" w:name="_Toc228354360"/>
+      <w:bookmarkStart w:id="181" w:name="_Toc228372246"/>
+      <w:bookmarkStart w:id="182" w:name="_Toc228373054"/>
       <w:r>
         <w:rPr>
           <w:rStyle w:val="Titre2Car"/>
@@ -7305,8 +7572,9 @@
         </w:rPr>
         <w:t>L’émetteur primaire fait circuler un courant alternatif dans sa propre bobine. Selon la loi d’Ampère, tout courant circulant dans un conducteur génère un champ magnétique autour de lui.</w:t>
       </w:r>
-      <w:bookmarkEnd w:id="147"/>
-      <w:bookmarkEnd w:id="148"/>
+      <w:bookmarkEnd w:id="180"/>
+      <w:bookmarkEnd w:id="181"/>
+      <w:bookmarkEnd w:id="182"/>
       <w:r>
         <w:rPr>
           <w:rStyle w:val="Titre2Car"/>
@@ -7333,8 +7601,9 @@
           <w:bCs w:val="0"/>
         </w:rPr>
       </w:pPr>
-      <w:bookmarkStart w:id="149" w:name="_Toc228354361"/>
-      <w:bookmarkStart w:id="150" w:name="_Toc228372247"/>
+      <w:bookmarkStart w:id="183" w:name="_Toc228354361"/>
+      <w:bookmarkStart w:id="184" w:name="_Toc228372247"/>
+      <w:bookmarkStart w:id="185" w:name="_Toc228373055"/>
       <w:r>
         <w:rPr>
           <w:rStyle w:val="Titre2Car"/>
@@ -7343,8 +7612,9 @@
         </w:rPr>
         <w:t>Ce même champ magnétique traverse l’espace et « baigne » l’antenne du tag passif.</w:t>
       </w:r>
-      <w:bookmarkEnd w:id="149"/>
-      <w:bookmarkEnd w:id="150"/>
+      <w:bookmarkEnd w:id="183"/>
+      <w:bookmarkEnd w:id="184"/>
+      <w:bookmarkEnd w:id="185"/>
     </w:p>
     <w:p>
       <w:pPr>
@@ -7363,8 +7633,9 @@
           <w:bCs w:val="0"/>
         </w:rPr>
       </w:pPr>
-      <w:bookmarkStart w:id="151" w:name="_Toc228354362"/>
-      <w:bookmarkStart w:id="152" w:name="_Toc228372248"/>
+      <w:bookmarkStart w:id="186" w:name="_Toc228354362"/>
+      <w:bookmarkStart w:id="187" w:name="_Toc228372248"/>
+      <w:bookmarkStart w:id="188" w:name="_Toc228373056"/>
       <w:r>
         <w:rPr>
           <w:rStyle w:val="Titre2Car"/>
@@ -7373,8 +7644,9 @@
         </w:rPr>
         <w:t>Le tag secondaire quant a lui est soumis à la loi de Faraday qui dit que : un champ magnétique variable qui traverse une bobine y induit une force électromotrice (tension). C’est ainsi que le tag reçoit son énergie, il « récupère » en quelque sorte l’électricité du champ magnétique du lecteur pour alimenter sa propre puce</w:t>
       </w:r>
-      <w:bookmarkEnd w:id="151"/>
-      <w:bookmarkEnd w:id="152"/>
+      <w:bookmarkEnd w:id="186"/>
+      <w:bookmarkEnd w:id="187"/>
+      <w:bookmarkEnd w:id="188"/>
     </w:p>
     <w:p>
       <w:pPr>
@@ -7393,8 +7665,9 @@
           <w:bCs w:val="0"/>
         </w:rPr>
       </w:pPr>
-      <w:bookmarkStart w:id="153" w:name="_Toc228354363"/>
-      <w:bookmarkStart w:id="154" w:name="_Toc228372249"/>
+      <w:bookmarkStart w:id="189" w:name="_Toc228354363"/>
+      <w:bookmarkStart w:id="190" w:name="_Toc228372249"/>
+      <w:bookmarkStart w:id="191" w:name="_Toc228373057"/>
       <w:r>
         <w:rPr>
           <w:rStyle w:val="Titre2Car"/>
@@ -7403,8 +7676,9 @@
         </w:rPr>
         <w:t>Une fois alimenté, le tag secondaire modifie sa propre charge électrique, ce qui crée des micro-variations dans le champ magnétique. Le lecteur détecte ces variations et les traduits en données binaires.</w:t>
       </w:r>
-      <w:bookmarkEnd w:id="153"/>
-      <w:bookmarkEnd w:id="154"/>
+      <w:bookmarkEnd w:id="189"/>
+      <w:bookmarkEnd w:id="190"/>
+      <w:bookmarkEnd w:id="191"/>
     </w:p>
     <w:p>
       <w:pPr>
@@ -7437,8 +7711,9 @@
           <w:bCs w:val="0"/>
         </w:rPr>
       </w:pPr>
-      <w:bookmarkStart w:id="155" w:name="_Toc228354364"/>
-      <w:bookmarkStart w:id="156" w:name="_Toc228372250"/>
+      <w:bookmarkStart w:id="192" w:name="_Toc228354364"/>
+      <w:bookmarkStart w:id="193" w:name="_Toc228372250"/>
+      <w:bookmarkStart w:id="194" w:name="_Toc228373058"/>
       <w:r>
         <w:rPr>
           <w:rStyle w:val="Titre2Car"/>
@@ -7446,8 +7721,9 @@
         <w:lastRenderedPageBreak/>
         <w:t>Pourquoi précisément 13,56 MHz ?</w:t>
       </w:r>
-      <w:bookmarkEnd w:id="155"/>
-      <w:bookmarkEnd w:id="156"/>
+      <w:bookmarkEnd w:id="192"/>
+      <w:bookmarkEnd w:id="193"/>
+      <w:bookmarkEnd w:id="194"/>
     </w:p>
     <w:p>
       <w:pPr>
@@ -7468,8 +7744,9 @@
           <w:bCs w:val="0"/>
         </w:rPr>
       </w:pPr>
-      <w:bookmarkStart w:id="157" w:name="_Toc228354365"/>
-      <w:bookmarkStart w:id="158" w:name="_Toc228372251"/>
+      <w:bookmarkStart w:id="195" w:name="_Toc228354365"/>
+      <w:bookmarkStart w:id="196" w:name="_Toc228372251"/>
+      <w:bookmarkStart w:id="197" w:name="_Toc228373059"/>
       <w:r>
         <w:rPr>
           <w:rStyle w:val="Titre2Car"/>
@@ -7502,8 +7779,9 @@
         </w:rPr>
         <w:t> :</w:t>
       </w:r>
-      <w:bookmarkEnd w:id="157"/>
-      <w:bookmarkEnd w:id="158"/>
+      <w:bookmarkEnd w:id="195"/>
+      <w:bookmarkEnd w:id="196"/>
+      <w:bookmarkEnd w:id="197"/>
     </w:p>
     <w:p>
       <w:pPr>
@@ -7522,8 +7800,9 @@
           <w:bCs w:val="0"/>
         </w:rPr>
       </w:pPr>
-      <w:bookmarkStart w:id="159" w:name="_Toc228354366"/>
-      <w:bookmarkStart w:id="160" w:name="_Toc228372252"/>
+      <w:bookmarkStart w:id="198" w:name="_Toc228354366"/>
+      <w:bookmarkStart w:id="199" w:name="_Toc228372252"/>
+      <w:bookmarkStart w:id="200" w:name="_Toc228373060"/>
       <w:r>
         <w:rPr>
           <w:rStyle w:val="Titre2Car"/>
@@ -7532,8 +7811,9 @@
         </w:rPr>
         <w:t>Sur le plan règlementaire, l’union internationale des télécommunications (UIT) réserve des fréquences pour des usages non liés aux télécommunications longue distance (FM/5G). La bande 13,56 MHz est une bande libre de licence mondiale.</w:t>
       </w:r>
-      <w:bookmarkEnd w:id="159"/>
-      <w:bookmarkEnd w:id="160"/>
+      <w:bookmarkEnd w:id="198"/>
+      <w:bookmarkEnd w:id="199"/>
+      <w:bookmarkEnd w:id="200"/>
     </w:p>
     <w:p>
       <w:pPr>
@@ -7552,8 +7832,9 @@
           <w:bCs w:val="0"/>
         </w:rPr>
       </w:pPr>
-      <w:bookmarkStart w:id="161" w:name="_Toc228354367"/>
-      <w:bookmarkStart w:id="162" w:name="_Toc228372253"/>
+      <w:bookmarkStart w:id="201" w:name="_Toc228354367"/>
+      <w:bookmarkStart w:id="202" w:name="_Toc228372253"/>
+      <w:bookmarkStart w:id="203" w:name="_Toc228373061"/>
       <w:r>
         <w:rPr>
           <w:rStyle w:val="Titre2Car"/>
@@ -7562,8 +7843,9 @@
         </w:rPr>
         <w:t>Sur le plan technique, la fréquence 13,56 MHz offre un excellent équilibre permettant de fabriquer des antennes assez petites pour tenir dans une carte de crédit ou un téléphone, tout en restant très efficaces pour le transfert d’énergie par induction.</w:t>
       </w:r>
-      <w:bookmarkEnd w:id="161"/>
-      <w:bookmarkEnd w:id="162"/>
+      <w:bookmarkEnd w:id="201"/>
+      <w:bookmarkEnd w:id="202"/>
+      <w:bookmarkEnd w:id="203"/>
     </w:p>
     <w:p>
       <w:pPr>
@@ -7583,7 +7865,7 @@
           <w:bCs/>
         </w:rPr>
       </w:pPr>
-      <w:bookmarkStart w:id="163" w:name="_Toc228372254"/>
+      <w:bookmarkStart w:id="204" w:name="_Toc228373062"/>
       <w:r>
         <w:rPr>
           <w:rStyle w:val="Titre2Car"/>
@@ -7592,7 +7874,7 @@
         </w:rPr>
         <w:t>Code Backend &amp; Frontend</w:t>
       </w:r>
-      <w:bookmarkEnd w:id="163"/>
+      <w:bookmarkEnd w:id="204"/>
     </w:p>
     <w:p>
       <w:pPr>
@@ -7612,7 +7894,7 @@
           <w:bCs/>
         </w:rPr>
       </w:pPr>
-      <w:bookmarkStart w:id="164" w:name="_Toc228372255"/>
+      <w:bookmarkStart w:id="205" w:name="_Toc228373063"/>
       <w:r>
         <w:rPr>
           <w:rStyle w:val="Titre2Car"/>
@@ -7621,7 +7903,7 @@
         </w:rPr>
         <w:t>Justification des langages utilisés</w:t>
       </w:r>
-      <w:bookmarkEnd w:id="164"/>
+      <w:bookmarkEnd w:id="205"/>
     </w:p>
     <w:p>
       <w:pPr>
@@ -7654,7 +7936,8 @@
           <w:bCs w:val="0"/>
         </w:rPr>
       </w:pPr>
-      <w:bookmarkStart w:id="165" w:name="_Toc228372256"/>
+      <w:bookmarkStart w:id="206" w:name="_Toc228372256"/>
+      <w:bookmarkStart w:id="207" w:name="_Toc228373064"/>
       <w:r>
         <w:rPr>
           <w:rStyle w:val="Titre2Car"/>
@@ -7663,7 +7946,8 @@
         </w:rPr>
         <w:t>Le projet SAC utilise plusieurs langages de programmations avec chacun une fonction précise et une justification de leurs utilisations.</w:t>
       </w:r>
-      <w:bookmarkEnd w:id="165"/>
+      <w:bookmarkEnd w:id="206"/>
+      <w:bookmarkEnd w:id="207"/>
       <w:r>
         <w:rPr>
           <w:rStyle w:val="Titre2Car"/>
@@ -7712,14 +7996,16 @@
                 <w:rStyle w:val="Titre2Car"/>
               </w:rPr>
             </w:pPr>
-            <w:bookmarkStart w:id="166" w:name="_Toc228372257"/>
+            <w:bookmarkStart w:id="208" w:name="_Toc228372257"/>
+            <w:bookmarkStart w:id="209" w:name="_Toc228373065"/>
             <w:r>
               <w:rPr>
                 <w:rStyle w:val="Titre2Car"/>
               </w:rPr>
               <w:t>Langage</w:t>
             </w:r>
-            <w:bookmarkEnd w:id="166"/>
+            <w:bookmarkEnd w:id="208"/>
+            <w:bookmarkEnd w:id="209"/>
           </w:p>
         </w:tc>
         <w:tc>
@@ -7737,14 +8023,16 @@
                 <w:rStyle w:val="Titre2Car"/>
               </w:rPr>
             </w:pPr>
-            <w:bookmarkStart w:id="167" w:name="_Toc228372258"/>
+            <w:bookmarkStart w:id="210" w:name="_Toc228372258"/>
+            <w:bookmarkStart w:id="211" w:name="_Toc228373066"/>
             <w:r>
               <w:rPr>
                 <w:rStyle w:val="Titre2Car"/>
               </w:rPr>
               <w:t>Pourcentage d’utilisation dans le projet</w:t>
             </w:r>
-            <w:bookmarkEnd w:id="167"/>
+            <w:bookmarkEnd w:id="210"/>
+            <w:bookmarkEnd w:id="211"/>
           </w:p>
         </w:tc>
         <w:tc>
@@ -7762,7 +8050,8 @@
                 <w:rStyle w:val="Titre2Car"/>
               </w:rPr>
             </w:pPr>
-            <w:bookmarkStart w:id="168" w:name="_Toc228372259"/>
+            <w:bookmarkStart w:id="212" w:name="_Toc228372259"/>
+            <w:bookmarkStart w:id="213" w:name="_Toc228373067"/>
             <w:r>
               <w:rPr>
                 <w:rStyle w:val="Titre2Car"/>
@@ -7775,7 +8064,8 @@
               </w:rPr>
               <w:t>/Description</w:t>
             </w:r>
-            <w:bookmarkEnd w:id="168"/>
+            <w:bookmarkEnd w:id="212"/>
+            <w:bookmarkEnd w:id="213"/>
           </w:p>
         </w:tc>
       </w:tr>
@@ -7809,7 +8099,8 @@
                 <w:bCs w:val="0"/>
               </w:rPr>
             </w:pPr>
-            <w:bookmarkStart w:id="169" w:name="_Toc228372260"/>
+            <w:bookmarkStart w:id="214" w:name="_Toc228372260"/>
+            <w:bookmarkStart w:id="215" w:name="_Toc228373068"/>
             <w:r>
               <w:rPr>
                 <w:rStyle w:val="Titre2Car"/>
@@ -7818,7 +8109,8 @@
               </w:rPr>
               <w:t>JavaScript (JS)</w:t>
             </w:r>
-            <w:bookmarkEnd w:id="169"/>
+            <w:bookmarkEnd w:id="214"/>
+            <w:bookmarkEnd w:id="215"/>
           </w:p>
         </w:tc>
         <w:tc>
@@ -7850,7 +8142,8 @@
                 <w:bCs w:val="0"/>
               </w:rPr>
             </w:pPr>
-            <w:bookmarkStart w:id="170" w:name="_Toc228372261"/>
+            <w:bookmarkStart w:id="216" w:name="_Toc228372261"/>
+            <w:bookmarkStart w:id="217" w:name="_Toc228373069"/>
             <w:r>
               <w:rPr>
                 <w:rStyle w:val="Titre2Car"/>
@@ -7859,7 +8152,8 @@
               </w:rPr>
               <w:t>86.4%</w:t>
             </w:r>
-            <w:bookmarkEnd w:id="170"/>
+            <w:bookmarkEnd w:id="216"/>
+            <w:bookmarkEnd w:id="217"/>
           </w:p>
         </w:tc>
         <w:tc>
@@ -7878,7 +8172,8 @@
                 <w:bCs w:val="0"/>
               </w:rPr>
             </w:pPr>
-            <w:bookmarkStart w:id="171" w:name="_Toc228372262"/>
+            <w:bookmarkStart w:id="218" w:name="_Toc228372262"/>
+            <w:bookmarkStart w:id="219" w:name="_Toc228373070"/>
             <w:r>
               <w:rPr>
                 <w:rStyle w:val="Titre2Car"/>
@@ -7903,7 +8198,8 @@
               </w:rPr>
               <w:t xml:space="preserve"> la modification</w:t>
             </w:r>
-            <w:bookmarkEnd w:id="171"/>
+            <w:bookmarkEnd w:id="218"/>
+            <w:bookmarkEnd w:id="219"/>
           </w:p>
         </w:tc>
       </w:tr>
@@ -7937,7 +8233,8 @@
                 <w:bCs w:val="0"/>
               </w:rPr>
             </w:pPr>
-            <w:bookmarkStart w:id="172" w:name="_Toc228372263"/>
+            <w:bookmarkStart w:id="220" w:name="_Toc228372263"/>
+            <w:bookmarkStart w:id="221" w:name="_Toc228373071"/>
             <w:r>
               <w:rPr>
                 <w:rStyle w:val="Titre2Car"/>
@@ -7946,7 +8243,8 @@
               </w:rPr>
               <w:t>HTML</w:t>
             </w:r>
-            <w:bookmarkEnd w:id="172"/>
+            <w:bookmarkEnd w:id="220"/>
+            <w:bookmarkEnd w:id="221"/>
           </w:p>
         </w:tc>
         <w:tc>
@@ -7978,7 +8276,8 @@
                 <w:bCs w:val="0"/>
               </w:rPr>
             </w:pPr>
-            <w:bookmarkStart w:id="173" w:name="_Toc228372264"/>
+            <w:bookmarkStart w:id="222" w:name="_Toc228372264"/>
+            <w:bookmarkStart w:id="223" w:name="_Toc228373072"/>
             <w:r>
               <w:rPr>
                 <w:rStyle w:val="Titre2Car"/>
@@ -7987,7 +8286,8 @@
               </w:rPr>
               <w:t>13.4%</w:t>
             </w:r>
-            <w:bookmarkEnd w:id="173"/>
+            <w:bookmarkEnd w:id="222"/>
+            <w:bookmarkEnd w:id="223"/>
           </w:p>
         </w:tc>
         <w:tc>
@@ -8006,7 +8306,8 @@
                 <w:bCs w:val="0"/>
               </w:rPr>
             </w:pPr>
-            <w:bookmarkStart w:id="174" w:name="_Toc228372265"/>
+            <w:bookmarkStart w:id="224" w:name="_Toc228372265"/>
+            <w:bookmarkStart w:id="225" w:name="_Toc228373073"/>
             <w:r>
               <w:rPr>
                 <w:rStyle w:val="Titre2Car"/>
@@ -8015,7 +8316,8 @@
               </w:rPr>
               <w:t>Langage de balisage servant à structurer de façon basique des pages web</w:t>
             </w:r>
-            <w:bookmarkEnd w:id="174"/>
+            <w:bookmarkEnd w:id="224"/>
+            <w:bookmarkEnd w:id="225"/>
           </w:p>
         </w:tc>
       </w:tr>
@@ -8049,7 +8351,8 @@
                 <w:bCs w:val="0"/>
               </w:rPr>
             </w:pPr>
-            <w:bookmarkStart w:id="175" w:name="_Toc228372266"/>
+            <w:bookmarkStart w:id="226" w:name="_Toc228372266"/>
+            <w:bookmarkStart w:id="227" w:name="_Toc228373074"/>
             <w:r>
               <w:rPr>
                 <w:rStyle w:val="Titre2Car"/>
@@ -8058,7 +8361,8 @@
               </w:rPr>
               <w:t>Dockerfile</w:t>
             </w:r>
-            <w:bookmarkEnd w:id="175"/>
+            <w:bookmarkEnd w:id="226"/>
+            <w:bookmarkEnd w:id="227"/>
           </w:p>
         </w:tc>
         <w:tc>
@@ -8090,7 +8394,8 @@
                 <w:bCs w:val="0"/>
               </w:rPr>
             </w:pPr>
-            <w:bookmarkStart w:id="176" w:name="_Toc228372267"/>
+            <w:bookmarkStart w:id="228" w:name="_Toc228372267"/>
+            <w:bookmarkStart w:id="229" w:name="_Toc228373075"/>
             <w:r>
               <w:rPr>
                 <w:rStyle w:val="Titre2Car"/>
@@ -8099,7 +8404,8 @@
               </w:rPr>
               <w:t>0.2%</w:t>
             </w:r>
-            <w:bookmarkEnd w:id="176"/>
+            <w:bookmarkEnd w:id="228"/>
+            <w:bookmarkEnd w:id="229"/>
           </w:p>
         </w:tc>
         <w:tc>
@@ -8118,7 +8424,8 @@
                 <w:bCs w:val="0"/>
               </w:rPr>
             </w:pPr>
-            <w:bookmarkStart w:id="177" w:name="_Toc228372268"/>
+            <w:bookmarkStart w:id="230" w:name="_Toc228372268"/>
+            <w:bookmarkStart w:id="231" w:name="_Toc228373076"/>
             <w:r>
               <w:rPr>
                 <w:rStyle w:val="Titre2Car"/>
@@ -8127,7 +8434,8 @@
               </w:rPr>
               <w:t>Fichiers centralisant tous les éléments relatifs aux conteneurs Docker</w:t>
             </w:r>
-            <w:bookmarkEnd w:id="177"/>
+            <w:bookmarkEnd w:id="230"/>
+            <w:bookmarkEnd w:id="231"/>
           </w:p>
         </w:tc>
       </w:tr>
@@ -8145,7 +8453,8 @@
           <w:iCs/>
         </w:rPr>
       </w:pPr>
-      <w:bookmarkStart w:id="178" w:name="_Toc228372269"/>
+      <w:bookmarkStart w:id="232" w:name="_Toc228372269"/>
+      <w:bookmarkStart w:id="233" w:name="_Toc228373077"/>
       <w:r>
         <w:rPr>
           <w:rStyle w:val="Titre2Car"/>
@@ -8156,7 +8465,8 @@
         </w:rPr>
         <w:t>Source des pourcentages : repo GitHub SAC</w:t>
       </w:r>
-      <w:bookmarkEnd w:id="178"/>
+      <w:bookmarkEnd w:id="232"/>
+      <w:bookmarkEnd w:id="233"/>
     </w:p>
     <w:p>
       <w:pPr>
@@ -8179,7 +8489,7 @@
           <w:bCs/>
         </w:rPr>
       </w:pPr>
-      <w:bookmarkStart w:id="179" w:name="_Toc228372270"/>
+      <w:bookmarkStart w:id="234" w:name="_Toc228373078"/>
       <w:r>
         <w:rPr>
           <w:rStyle w:val="Titre2Car"/>
@@ -8188,7 +8498,7 @@
         </w:rPr>
         <w:t>Structure du projet</w:t>
       </w:r>
-      <w:bookmarkEnd w:id="179"/>
+      <w:bookmarkEnd w:id="234"/>
       <w:r>
         <w:rPr>
           <w:rStyle w:val="Titre2Car"/>
@@ -8487,11 +8797,11 @@
       <w:pPr>
         <w:pStyle w:val="Titre2"/>
       </w:pPr>
-      <w:bookmarkStart w:id="180" w:name="_Toc228372271"/>
+      <w:bookmarkStart w:id="235" w:name="_Toc228373079"/>
       <w:r>
         <w:t>App.js, la fondation du projet</w:t>
       </w:r>
-      <w:bookmarkEnd w:id="180"/>
+      <w:bookmarkEnd w:id="235"/>
     </w:p>
     <w:p/>
     <w:p>
@@ -8633,11 +8943,11 @@
       <w:pPr>
         <w:pStyle w:val="Titre2"/>
       </w:pPr>
-      <w:bookmarkStart w:id="181" w:name="_Toc228372272"/>
+      <w:bookmarkStart w:id="236" w:name="_Toc228373080"/>
       <w:r>
         <w:t>O365.js – La gestion de la connexion avec Office 365</w:t>
       </w:r>
-      <w:bookmarkEnd w:id="181"/>
+      <w:bookmarkEnd w:id="236"/>
     </w:p>
     <w:p/>
     <w:p>
@@ -8841,11 +9151,11 @@
       <w:pPr>
         <w:pStyle w:val="Titre2"/>
       </w:pPr>
-      <w:bookmarkStart w:id="182" w:name="_Toc228372273"/>
+      <w:bookmarkStart w:id="237" w:name="_Toc228373081"/>
       <w:r>
         <w:t>Match_office_to_ED.js – La gestion des rôles utilisateurs sur la PWA</w:t>
       </w:r>
-      <w:bookmarkEnd w:id="182"/>
+      <w:bookmarkEnd w:id="237"/>
     </w:p>
     <w:p>
       <w:r>
@@ -8987,7 +9297,7 @@
           <w:bCs/>
         </w:rPr>
       </w:pPr>
-      <w:bookmarkStart w:id="183" w:name="_Toc228372274"/>
+      <w:bookmarkStart w:id="238" w:name="_Toc228373082"/>
       <w:r>
         <w:rPr>
           <w:rStyle w:val="Titre2Car"/>
@@ -8996,7 +9306,7 @@
         </w:rPr>
         <w:t>Avancement du projet</w:t>
       </w:r>
-      <w:bookmarkEnd w:id="183"/>
+      <w:bookmarkEnd w:id="238"/>
       <w:r>
         <w:rPr>
           <w:rStyle w:val="Titre2Car"/>
@@ -9011,11 +9321,11 @@
       <w:pPr>
         <w:pStyle w:val="Titre2"/>
       </w:pPr>
-      <w:bookmarkStart w:id="184" w:name="_Toc228372275"/>
+      <w:bookmarkStart w:id="239" w:name="_Toc228373083"/>
       <w:r>
         <w:t>Récapitulatif des tâches réalisées</w:t>
       </w:r>
-      <w:bookmarkEnd w:id="184"/>
+      <w:bookmarkEnd w:id="239"/>
     </w:p>
     <w:p/>
     <w:p>
@@ -9553,11 +9863,11 @@
       <w:pPr>
         <w:pStyle w:val="Titre2"/>
       </w:pPr>
-      <w:bookmarkStart w:id="185" w:name="_Toc228372276"/>
+      <w:bookmarkStart w:id="240" w:name="_Toc228373084"/>
       <w:r>
         <w:t>Tâches restantes à réaliser</w:t>
       </w:r>
-      <w:bookmarkEnd w:id="185"/>
+      <w:bookmarkEnd w:id="240"/>
     </w:p>
     <w:p/>
     <w:p>
@@ -9930,11 +10240,14 @@
       <w:pPr>
         <w:pStyle w:val="Titre1"/>
       </w:pPr>
-      <w:bookmarkStart w:id="186" w:name="_Toc228372277"/>
-      <w:r>
-        <w:t>Tableau récapitulatif d'avancement</w:t>
-      </w:r>
-      <w:bookmarkEnd w:id="186"/>
+      <w:bookmarkStart w:id="241" w:name="_Toc228373085"/>
+      <w:r>
+        <w:t>Cahier de recette</w:t>
+      </w:r>
+      <w:bookmarkEnd w:id="241"/>
+      <w:r>
+        <w:t xml:space="preserve"> </w:t>
+      </w:r>
     </w:p>
     <w:p/>
     <w:tbl>
@@ -10460,6 +10773,7 @@
           </w:tcPr>
           <w:p>
             <w:r>
+              <w:lastRenderedPageBreak/>
               <w:t>PWA Frontend (élève)</w:t>
             </w:r>
           </w:p>
@@ -10825,11 +11139,11 @@
       <w:pPr>
         <w:pStyle w:val="Titre1"/>
       </w:pPr>
-      <w:bookmarkStart w:id="187" w:name="_Toc228372278"/>
+      <w:bookmarkStart w:id="242" w:name="_Toc228373086"/>
       <w:r>
         <w:t>Diagramme de Gantt</w:t>
       </w:r>
-      <w:bookmarkEnd w:id="187"/>
+      <w:bookmarkEnd w:id="242"/>
     </w:p>
     <w:p>
       <w:r>
@@ -10918,27 +11232,98 @@
       <w:pPr>
         <w:pStyle w:val="Titre1"/>
       </w:pPr>
-      <w:bookmarkStart w:id="188" w:name="_Lexique"/>
-      <w:bookmarkStart w:id="189" w:name="_Toc228372279"/>
-      <w:bookmarkEnd w:id="188"/>
+      <w:bookmarkStart w:id="243" w:name="_Toc228373087"/>
       <w:r>
         <w:lastRenderedPageBreak/>
+        <w:t>Analyse budgetaire</w:t>
+      </w:r>
+      <w:bookmarkEnd w:id="243"/>
+    </w:p>
+    <w:p>
+      <w:pPr>
+        <w:pStyle w:val="Titre1"/>
+        <w:numPr>
+          <w:ilvl w:val="0"/>
+          <w:numId w:val="0"/>
+        </w:numPr>
+        <w:ind w:left="360" w:hanging="360"/>
+      </w:pPr>
+    </w:p>
+    <w:p>
+      <w:r>
+        <w:t>Tableau recap des charges et des couts</w:t>
+      </w:r>
+    </w:p>
+    <w:p/>
+    <w:p>
+      <w:pPr>
+        <w:pStyle w:val="Titre1"/>
+      </w:pPr>
+      <w:bookmarkStart w:id="244" w:name="_Toc228373088"/>
+      <w:r>
+        <w:t>Ameliorations futures</w:t>
+      </w:r>
+      <w:bookmarkEnd w:id="244"/>
+    </w:p>
+    <w:p>
+      <w:pPr>
+        <w:pStyle w:val="Titre1"/>
+        <w:numPr>
+          <w:ilvl w:val="0"/>
+          <w:numId w:val="0"/>
+        </w:numPr>
+        <w:ind w:left="360" w:hanging="360"/>
+      </w:pPr>
+    </w:p>
+    <w:p>
+      <w:pPr>
+        <w:pStyle w:val="Titre1"/>
+      </w:pPr>
+      <w:bookmarkStart w:id="245" w:name="_Toc228373089"/>
+      <w:r>
+        <w:t>Ce que cela m’a apporté</w:t>
+      </w:r>
+      <w:bookmarkEnd w:id="245"/>
+    </w:p>
+    <w:p>
+      <w:pPr>
+        <w:pStyle w:val="Paragraphedeliste"/>
+      </w:pPr>
+    </w:p>
+    <w:p>
+      <w:pPr>
+        <w:pStyle w:val="Titre1"/>
+        <w:numPr>
+          <w:ilvl w:val="0"/>
+          <w:numId w:val="0"/>
+        </w:numPr>
+        <w:ind w:left="360"/>
+      </w:pPr>
+    </w:p>
+    <w:p>
+      <w:pPr>
+        <w:pStyle w:val="Titre1"/>
+      </w:pPr>
+      <w:bookmarkStart w:id="246" w:name="_Lexique"/>
+      <w:bookmarkStart w:id="247" w:name="_Toc228373090"/>
+      <w:bookmarkEnd w:id="246"/>
+      <w:r>
         <w:t>Lexique</w:t>
       </w:r>
-      <w:bookmarkEnd w:id="189"/>
+      <w:bookmarkEnd w:id="247"/>
     </w:p>
     <w:p/>
     <w:p>
       <w:pPr>
         <w:pStyle w:val="Titre2"/>
       </w:pPr>
-      <w:bookmarkStart w:id="190" w:name="_Lexique_matériel_physique"/>
-      <w:bookmarkStart w:id="191" w:name="_Toc228372280"/>
-      <w:bookmarkEnd w:id="190"/>
+      <w:bookmarkStart w:id="248" w:name="_Lexique_matériel_physique"/>
+      <w:bookmarkStart w:id="249" w:name="_Toc228373091"/>
+      <w:bookmarkEnd w:id="248"/>
       <w:r>
         <w:t>Lexique matériel physique</w:t>
       </w:r>
-      <w:bookmarkEnd w:id="191"/>
+      <w:bookmarkEnd w:id="249"/>
     </w:p>
     <w:p/>
     <w:p>
@@ -11182,13 +11567,13 @@
       <w:pPr>
         <w:pStyle w:val="Titre2"/>
       </w:pPr>
-      <w:bookmarkStart w:id="192" w:name="_Lexique_Dev"/>
-      <w:bookmarkStart w:id="193" w:name="_Toc228372281"/>
-      <w:bookmarkEnd w:id="192"/>
+      <w:bookmarkStart w:id="250" w:name="_Lexique_Dev"/>
+      <w:bookmarkStart w:id="251" w:name="_Toc228373092"/>
+      <w:bookmarkEnd w:id="250"/>
       <w:r>
         <w:t>Lexique Dev</w:t>
       </w:r>
-      <w:bookmarkEnd w:id="193"/>
+      <w:bookmarkEnd w:id="251"/>
     </w:p>
     <w:p/>
     <w:p>
@@ -11745,13 +12130,13 @@
       <w:pPr>
         <w:pStyle w:val="Titre2"/>
       </w:pPr>
-      <w:bookmarkStart w:id="194" w:name="_Lexique_NFC"/>
-      <w:bookmarkStart w:id="195" w:name="_Toc228372282"/>
-      <w:bookmarkEnd w:id="194"/>
+      <w:bookmarkStart w:id="252" w:name="_Lexique_NFC"/>
+      <w:bookmarkStart w:id="253" w:name="_Toc228373093"/>
+      <w:bookmarkEnd w:id="252"/>
       <w:r>
         <w:t>Lexique NFC</w:t>
       </w:r>
-      <w:bookmarkEnd w:id="195"/>
+      <w:bookmarkEnd w:id="253"/>
     </w:p>
     <w:p/>
     <w:p>

</xml_diff>

<commit_message>
docs: add project tracking form v10 to documentation
</commit_message>
<xml_diff>
--- a/Documentation/Fiche_suivi_projet_v10.docx
+++ b/Documentation/Fiche_suivi_projet_v10.docx
@@ -3907,403 +3907,15 @@
     </w:p>
     <w:p>
       <w:pPr>
+        <w:pStyle w:val="Titre1"/>
         <w:rPr>
           <w:rFonts w:asciiTheme="majorHAnsi" w:hAnsiTheme="majorHAnsi" w:cstheme="majorBidi"/>
         </w:rPr>
       </w:pPr>
-    </w:p>
-    <w:p>
-      <w:pPr>
-        <w:rPr>
-          <w:rFonts w:asciiTheme="majorHAnsi" w:hAnsiTheme="majorHAnsi" w:cstheme="majorBidi"/>
-        </w:rPr>
-      </w:pPr>
-    </w:p>
-    <w:p>
-      <w:pPr>
-        <w:rPr>
-          <w:rFonts w:asciiTheme="majorHAnsi" w:hAnsiTheme="majorHAnsi" w:cstheme="majorBidi"/>
-        </w:rPr>
-      </w:pPr>
-    </w:p>
-    <w:p>
-      <w:pPr>
-        <w:rPr>
-          <w:rFonts w:asciiTheme="majorHAnsi" w:hAnsiTheme="majorHAnsi" w:cstheme="majorBidi"/>
-        </w:rPr>
-      </w:pPr>
-    </w:p>
-    <w:p>
-      <w:pPr>
-        <w:rPr>
-          <w:rFonts w:asciiTheme="majorHAnsi" w:hAnsiTheme="majorHAnsi" w:cstheme="majorBidi"/>
-        </w:rPr>
-      </w:pPr>
-    </w:p>
-    <w:p>
-      <w:pPr>
-        <w:rPr>
-          <w:rFonts w:asciiTheme="majorHAnsi" w:hAnsiTheme="majorHAnsi" w:cstheme="majorBidi"/>
-        </w:rPr>
-      </w:pPr>
-    </w:p>
-    <w:p>
-      <w:pPr>
-        <w:rPr>
-          <w:rFonts w:asciiTheme="majorHAnsi" w:hAnsiTheme="majorHAnsi" w:cstheme="majorBidi"/>
-        </w:rPr>
-      </w:pPr>
-    </w:p>
-    <w:p>
-      <w:pPr>
-        <w:rPr>
-          <w:rFonts w:asciiTheme="majorHAnsi" w:hAnsiTheme="majorHAnsi" w:cstheme="majorBidi"/>
-        </w:rPr>
-      </w:pPr>
-    </w:p>
-    <w:p>
-      <w:pPr>
-        <w:rPr>
-          <w:rFonts w:asciiTheme="majorHAnsi" w:hAnsiTheme="majorHAnsi" w:cstheme="majorBidi"/>
-        </w:rPr>
-      </w:pPr>
-    </w:p>
-    <w:p>
-      <w:pPr>
-        <w:rPr>
-          <w:rFonts w:asciiTheme="majorHAnsi" w:hAnsiTheme="majorHAnsi" w:cstheme="majorBidi"/>
-        </w:rPr>
-      </w:pPr>
-    </w:p>
-    <w:p>
-      <w:pPr>
-        <w:rPr>
-          <w:rFonts w:asciiTheme="majorHAnsi" w:hAnsiTheme="majorHAnsi" w:cstheme="majorBidi"/>
-        </w:rPr>
-      </w:pPr>
-    </w:p>
-    <w:p>
-      <w:pPr>
-        <w:pStyle w:val="Titre1"/>
-        <w:rPr>
-          <w:rFonts w:asciiTheme="majorHAnsi" w:hAnsiTheme="majorHAnsi" w:cstheme="majorBidi"/>
-        </w:rPr>
-      </w:pPr>
-      <w:bookmarkStart w:id="1" w:name="_Toc183509429"/>
-      <w:bookmarkStart w:id="2" w:name="_Toc228373007"/>
-      <w:r>
-        <w:t>Présentation Générale du Système Supportant le Proj</w:t>
-      </w:r>
-      <w:bookmarkEnd w:id="1"/>
-      <w:r>
-        <w:t>et</w:t>
-      </w:r>
-      <w:bookmarkEnd w:id="2"/>
-    </w:p>
-    <w:p>
-      <w:pPr>
-        <w:tabs>
-          <w:tab w:val="left" w:pos="2670"/>
-        </w:tabs>
-      </w:pPr>
-      <w:r>
-        <w:tab/>
-      </w:r>
-    </w:p>
-    <w:p>
-      <w:pPr>
-        <w:rPr>
-          <w:b/>
-          <w:bCs/>
-        </w:rPr>
-      </w:pPr>
-      <w:r>
-        <w:t>Le lycée</w:t>
-      </w:r>
-      <w:r>
-        <w:t xml:space="preserve"> </w:t>
-      </w:r>
-      <w:r>
-        <w:t>S</w:t>
-      </w:r>
-      <w:r>
-        <w:t xml:space="preserve">ainte </w:t>
-      </w:r>
-      <w:r>
-        <w:t>F</w:t>
-      </w:r>
-      <w:r>
-        <w:t xml:space="preserve">amille </w:t>
-      </w:r>
-      <w:r>
-        <w:t>S</w:t>
-      </w:r>
-      <w:r>
-        <w:t xml:space="preserve">aintonge est un établissement scolaire situé au plein cœur de Bordeaux, cet établissement accueille en moyenne entre 500 &amp; 600 élèves </w:t>
-      </w:r>
-      <w:r>
-        <w:t xml:space="preserve">chaque année </w:t>
-      </w:r>
-      <w:r>
-        <w:t>allant de la 3</w:t>
-      </w:r>
-      <w:r>
-        <w:t>è</w:t>
-      </w:r>
-      <w:r>
-        <w:t xml:space="preserve">me </w:t>
-      </w:r>
-      <w:r>
-        <w:t>Prépa</w:t>
-      </w:r>
-      <w:r>
-        <w:t xml:space="preserve"> </w:t>
-      </w:r>
-      <w:r>
-        <w:t>Métiers</w:t>
-      </w:r>
-      <w:r>
-        <w:t xml:space="preserve"> </w:t>
-      </w:r>
-      <w:r>
-        <w:t>à</w:t>
-      </w:r>
-      <w:r>
-        <w:t xml:space="preserve"> une formation BAC +3 CQP Conducteurs de Travaux. Ce lycée possède une « annexe » située au 29 rue Walter Poupot, cette annexe est composée de 2 </w:t>
-      </w:r>
-      <w:r>
-        <w:t xml:space="preserve">bâtiments : </w:t>
-      </w:r>
-    </w:p>
-    <w:p/>
-    <w:p>
-      <w:pPr>
-        <w:rPr>
-          <w:b/>
-          <w:bCs/>
-        </w:rPr>
-      </w:pPr>
-      <w:r>
-        <w:t>Le premier, le bâtiment c</w:t>
-      </w:r>
-      <w:r>
-        <w:t>ô</w:t>
-      </w:r>
-      <w:r>
-        <w:t>té Walter Poupot, est le bâtiment principal, o</w:t>
-      </w:r>
-      <w:r>
-        <w:t>ù</w:t>
-      </w:r>
-      <w:r>
-        <w:t xml:space="preserve"> les élèves viennent pour accéder </w:t>
-      </w:r>
-      <w:r>
-        <w:t>à</w:t>
-      </w:r>
-      <w:r>
-        <w:t xml:space="preserve"> leurs salles de classe. </w:t>
-      </w:r>
-    </w:p>
-    <w:p/>
-    <w:p>
-      <w:pPr>
-        <w:rPr>
-          <w:b/>
-          <w:bCs/>
-        </w:rPr>
-      </w:pPr>
-      <w:r>
-        <w:t>Le second, situé c</w:t>
-      </w:r>
-      <w:r>
-        <w:t>ôté</w:t>
-      </w:r>
-      <w:r>
-        <w:t xml:space="preserve"> rue de Pessac, est le bâtiment secondaire o</w:t>
-      </w:r>
-      <w:r>
-        <w:t>ù</w:t>
-      </w:r>
-      <w:r>
-        <w:t xml:space="preserve"> se trouve le réfectoire des élèves, ainsi que la pièce contenant le serveur qui servira au projet.</w:t>
-      </w:r>
-    </w:p>
-    <w:p/>
-    <w:p>
-      <w:pPr>
-        <w:rPr>
-          <w:b/>
-          <w:bCs/>
-        </w:rPr>
-      </w:pPr>
-      <w:r>
-        <w:t xml:space="preserve">En ce qui concerne l’accès </w:t>
-      </w:r>
-      <w:r>
-        <w:t>à</w:t>
-      </w:r>
-      <w:r>
-        <w:t xml:space="preserve"> l’</w:t>
-      </w:r>
-      <w:r>
-        <w:t>établissement</w:t>
-      </w:r>
-      <w:r>
-        <w:t xml:space="preserve"> principal situé au 12 rue de Saintonge, l’</w:t>
-      </w:r>
-      <w:r>
-        <w:t>accès</w:t>
-      </w:r>
-      <w:r>
-        <w:t xml:space="preserve"> se fait normalement, si un </w:t>
-      </w:r>
-      <w:r>
-        <w:t>él</w:t>
-      </w:r>
-      <w:r>
-        <w:t>ève</w:t>
-      </w:r>
-      <w:r>
-        <w:t xml:space="preserve"> arrive en retard, il </w:t>
-      </w:r>
-      <w:r>
-        <w:t>devra</w:t>
-      </w:r>
-      <w:r>
-        <w:t xml:space="preserve"> obligatoirement passer par la « vie scolaire », qui lui mettra un retard, </w:t>
-      </w:r>
-      <w:r>
-        <w:t>et possiblement même une sanction.</w:t>
-      </w:r>
-    </w:p>
-    <w:p/>
-    <w:p>
-      <w:pPr>
-        <w:pStyle w:val="Titre1"/>
-      </w:pPr>
-      <w:bookmarkStart w:id="3" w:name="_Toc228373008"/>
-      <w:r>
-        <w:t>Cahier des charges</w:t>
-      </w:r>
-      <w:bookmarkEnd w:id="3"/>
-    </w:p>
-    <w:p/>
-    <w:p>
-      <w:pPr>
-        <w:pStyle w:val="Titre2"/>
-      </w:pPr>
-      <w:bookmarkStart w:id="4" w:name="_Toc183509430"/>
-      <w:bookmarkStart w:id="5" w:name="_Toc228373009"/>
-      <w:r>
-        <w:t xml:space="preserve">Cahier des charges - </w:t>
-      </w:r>
-      <w:r>
-        <w:t>Analyse de l’Existant</w:t>
-      </w:r>
-      <w:bookmarkEnd w:id="4"/>
-      <w:bookmarkEnd w:id="5"/>
-    </w:p>
-    <w:p/>
-    <w:p>
-      <w:r>
-        <w:t xml:space="preserve">Concernant la gestion d’arrivée des élèves </w:t>
-      </w:r>
-      <w:r>
-        <w:t>à</w:t>
-      </w:r>
-      <w:r>
-        <w:t xml:space="preserve"> l’annexe de l’établissement, </w:t>
-      </w:r>
-      <w:r>
-        <w:t>un système de feuilles d’émargement est déjà mis en place mais ce système n’est pas efficient</w:t>
-      </w:r>
-      <w:r>
-        <w:t xml:space="preserve"> pour plusieurs raisons :</w:t>
-      </w:r>
-    </w:p>
-    <w:p/>
-    <w:p>
-      <w:r>
-        <w:tab/>
-        <w:t xml:space="preserve">1/ </w:t>
-      </w:r>
-      <w:r>
-        <w:t>Difficile de garder un historique organisé et précis</w:t>
-      </w:r>
-      <w:r>
-        <w:t>.</w:t>
-      </w:r>
-    </w:p>
-    <w:p>
-      <w:r>
-        <w:tab/>
-        <w:t xml:space="preserve">2/ </w:t>
-      </w:r>
-      <w:r>
-        <w:t>Problème du point de vue écologique (surconsommation de papier)</w:t>
-      </w:r>
-      <w:r>
-        <w:t>.</w:t>
-      </w:r>
-    </w:p>
-    <w:p>
-      <w:pPr>
-        <w:ind w:left="720"/>
-      </w:pPr>
-      <w:r>
-        <w:t>3/ Les élèves ne peuvent pas être autonome (obligation de la présence d’un membre du personnel administratif pour distribuer les feuilles)</w:t>
-      </w:r>
-      <w:r>
-        <w:t>.</w:t>
-      </w:r>
-    </w:p>
-    <w:p>
-      <w:pPr>
-        <w:ind w:left="720"/>
-      </w:pPr>
-      <w:r>
-        <w:t xml:space="preserve">4/ </w:t>
-      </w:r>
-      <w:r>
-        <w:t>Problème de sécurité/fraude (un élève peut signer à la place d’un autre)</w:t>
-      </w:r>
-      <w:r>
-        <w:t>.</w:t>
-      </w:r>
-    </w:p>
-    <w:p>
-      <w:pPr>
-        <w:ind w:left="720"/>
-      </w:pPr>
-      <w:r>
-        <w:t>5/ Manque de pr</w:t>
-      </w:r>
-      <w:r>
-        <w:t>é</w:t>
-      </w:r>
-      <w:r>
-        <w:t xml:space="preserve">cision concernant l’horodatage </w:t>
-      </w:r>
-      <w:r>
-        <w:t>des signatures.</w:t>
-      </w:r>
-    </w:p>
-    <w:p>
-      <w:r>
-        <w:br w:type="page"/>
-      </w:r>
-    </w:p>
-    <w:p>
-      <w:pPr>
-        <w:pStyle w:val="Titre2"/>
-      </w:pPr>
-      <w:bookmarkStart w:id="6" w:name="_Toc228373010"/>
       <w:r>
         <w:lastRenderedPageBreak/>
-        <w:t>Diagramme des cas d’utilisation (UML)</w:t>
-      </w:r>
-      <w:bookmarkEnd w:id="6"/>
+        <w:t>Remercîments</w:t>
+      </w:r>
     </w:p>
     <w:p>
       <w:pPr>
@@ -4314,6 +3926,441 @@
         </w:numPr>
         <w:ind w:left="360" w:hanging="360"/>
       </w:pPr>
+    </w:p>
+    <w:p>
+      <w:r>
+        <w:t xml:space="preserve">Je tenais </w:t>
+      </w:r>
+      <w:proofErr w:type="gramStart"/>
+      <w:r>
+        <w:t>a</w:t>
+      </w:r>
+      <w:proofErr w:type="gramEnd"/>
+      <w:r>
+        <w:t xml:space="preserve"> remercier l’ensemble scolaire Sainte Famille Saintonge qui m’accueille </w:t>
+      </w:r>
+      <w:proofErr w:type="gramStart"/>
+      <w:r>
+        <w:t>a</w:t>
+      </w:r>
+      <w:proofErr w:type="gramEnd"/>
+      <w:r>
+        <w:t xml:space="preserve"> la fois en tant qu’alternant et en tant qu’élève. </w:t>
+      </w:r>
+    </w:p>
+    <w:p/>
+    <w:p>
+      <w:r>
+        <w:t xml:space="preserve">Enseuite, je tenais a remericer mon tuteur </w:t>
+      </w:r>
+      <w:proofErr w:type="gramStart"/>
+      <w:r>
+        <w:t>M.Berges</w:t>
+      </w:r>
+      <w:proofErr w:type="gramEnd"/>
+      <w:r>
+        <w:t xml:space="preserve"> Stephane qui a su m’accompagner durant les 2 ans d’alternance que j’ai </w:t>
+      </w:r>
+      <w:proofErr w:type="gramStart"/>
+      <w:r>
+        <w:t>traversé</w:t>
+      </w:r>
+      <w:proofErr w:type="gramEnd"/>
+      <w:r>
+        <w:t>.</w:t>
+      </w:r>
+    </w:p>
+    <w:p>
+      <w:pPr>
+        <w:rPr>
+          <w:rFonts w:asciiTheme="majorHAnsi" w:hAnsiTheme="majorHAnsi" w:cstheme="majorBidi"/>
+        </w:rPr>
+      </w:pPr>
+      <w:r>
+        <w:t xml:space="preserve">J’aimerais également remercier la directrice de l’etablissement Mme Dion Lamant, et </w:t>
+      </w:r>
+      <w:proofErr w:type="gramStart"/>
+      <w:r>
+        <w:t>M.Madec</w:t>
+      </w:r>
+      <w:proofErr w:type="gramEnd"/>
+      <w:r>
+        <w:t xml:space="preserve"> Vincent, le responsable de formation du campus.</w:t>
+      </w:r>
+    </w:p>
+    <w:p>
+      <w:pPr>
+        <w:rPr>
+          <w:rFonts w:asciiTheme="majorHAnsi" w:hAnsiTheme="majorHAnsi" w:cstheme="majorBidi"/>
+        </w:rPr>
+      </w:pPr>
+    </w:p>
+    <w:p>
+      <w:pPr>
+        <w:rPr>
+          <w:rFonts w:asciiTheme="majorHAnsi" w:hAnsiTheme="majorHAnsi" w:cstheme="majorBidi"/>
+        </w:rPr>
+      </w:pPr>
+    </w:p>
+    <w:p>
+      <w:pPr>
+        <w:rPr>
+          <w:rFonts w:asciiTheme="majorHAnsi" w:hAnsiTheme="majorHAnsi" w:cstheme="majorBidi"/>
+        </w:rPr>
+      </w:pPr>
+    </w:p>
+    <w:p>
+      <w:pPr>
+        <w:rPr>
+          <w:rFonts w:asciiTheme="majorHAnsi" w:hAnsiTheme="majorHAnsi" w:cstheme="majorBidi"/>
+        </w:rPr>
+      </w:pPr>
+    </w:p>
+    <w:p>
+      <w:pPr>
+        <w:rPr>
+          <w:rFonts w:asciiTheme="majorHAnsi" w:hAnsiTheme="majorHAnsi" w:cstheme="majorBidi"/>
+        </w:rPr>
+      </w:pPr>
+    </w:p>
+    <w:p>
+      <w:pPr>
+        <w:rPr>
+          <w:rFonts w:asciiTheme="majorHAnsi" w:hAnsiTheme="majorHAnsi" w:cstheme="majorBidi"/>
+        </w:rPr>
+      </w:pPr>
+    </w:p>
+    <w:p>
+      <w:pPr>
+        <w:rPr>
+          <w:rFonts w:asciiTheme="majorHAnsi" w:hAnsiTheme="majorHAnsi" w:cstheme="majorBidi"/>
+        </w:rPr>
+      </w:pPr>
+    </w:p>
+    <w:p>
+      <w:pPr>
+        <w:pStyle w:val="Titre1"/>
+        <w:rPr>
+          <w:rFonts w:asciiTheme="majorHAnsi" w:hAnsiTheme="majorHAnsi" w:cstheme="majorBidi"/>
+        </w:rPr>
+      </w:pPr>
+      <w:bookmarkStart w:id="1" w:name="_Toc183509429"/>
+      <w:bookmarkStart w:id="2" w:name="_Toc228373007"/>
+      <w:r>
+        <w:t>Présentation Générale du Système Supportant le Proj</w:t>
+      </w:r>
+      <w:bookmarkEnd w:id="1"/>
+      <w:r>
+        <w:t>et</w:t>
+      </w:r>
+      <w:bookmarkEnd w:id="2"/>
+    </w:p>
+    <w:p>
+      <w:pPr>
+        <w:tabs>
+          <w:tab w:val="left" w:pos="2670"/>
+        </w:tabs>
+      </w:pPr>
+      <w:r>
+        <w:tab/>
+      </w:r>
+    </w:p>
+    <w:p>
+      <w:pPr>
+        <w:rPr>
+          <w:b/>
+          <w:bCs/>
+        </w:rPr>
+      </w:pPr>
+      <w:r>
+        <w:t>Le lycée</w:t>
+      </w:r>
+      <w:r>
+        <w:t xml:space="preserve"> </w:t>
+      </w:r>
+      <w:r>
+        <w:t>S</w:t>
+      </w:r>
+      <w:r>
+        <w:t xml:space="preserve">ainte </w:t>
+      </w:r>
+      <w:r>
+        <w:t>F</w:t>
+      </w:r>
+      <w:r>
+        <w:t xml:space="preserve">amille </w:t>
+      </w:r>
+      <w:r>
+        <w:t>S</w:t>
+      </w:r>
+      <w:r>
+        <w:t xml:space="preserve">aintonge est un établissement scolaire situé au plein cœur de Bordeaux, cet établissement accueille en moyenne entre 500 &amp; 600 élèves </w:t>
+      </w:r>
+      <w:r>
+        <w:t xml:space="preserve">chaque année </w:t>
+      </w:r>
+      <w:r>
+        <w:t>allant de la 3</w:t>
+      </w:r>
+      <w:r>
+        <w:t>è</w:t>
+      </w:r>
+      <w:r>
+        <w:t xml:space="preserve">me </w:t>
+      </w:r>
+      <w:r>
+        <w:t>Prépa</w:t>
+      </w:r>
+      <w:r>
+        <w:t xml:space="preserve"> </w:t>
+      </w:r>
+      <w:r>
+        <w:t>Métiers</w:t>
+      </w:r>
+      <w:r>
+        <w:t xml:space="preserve"> </w:t>
+      </w:r>
+      <w:r>
+        <w:t>à</w:t>
+      </w:r>
+      <w:r>
+        <w:t xml:space="preserve"> une formation BAC +3 CQP Conducteurs de Travaux. Ce lycée possède une « annexe » située au 29 rue Walter Poupot, cette annexe est composée de 2 </w:t>
+      </w:r>
+      <w:r>
+        <w:t xml:space="preserve">bâtiments : </w:t>
+      </w:r>
+    </w:p>
+    <w:p/>
+    <w:p>
+      <w:pPr>
+        <w:rPr>
+          <w:b/>
+          <w:bCs/>
+        </w:rPr>
+      </w:pPr>
+      <w:r>
+        <w:t>Le premier, le bâtiment c</w:t>
+      </w:r>
+      <w:r>
+        <w:t>ô</w:t>
+      </w:r>
+      <w:r>
+        <w:t>té Walter Poupot, est le bâtiment principal, o</w:t>
+      </w:r>
+      <w:r>
+        <w:t>ù</w:t>
+      </w:r>
+      <w:r>
+        <w:t xml:space="preserve"> les élèves viennent pour accéder </w:t>
+      </w:r>
+      <w:r>
+        <w:t>à</w:t>
+      </w:r>
+      <w:r>
+        <w:t xml:space="preserve"> leurs salles de classe. </w:t>
+      </w:r>
+    </w:p>
+    <w:p/>
+    <w:p>
+      <w:pPr>
+        <w:rPr>
+          <w:b/>
+          <w:bCs/>
+        </w:rPr>
+      </w:pPr>
+      <w:r>
+        <w:t>Le second, situé c</w:t>
+      </w:r>
+      <w:r>
+        <w:t>ôté</w:t>
+      </w:r>
+      <w:r>
+        <w:t xml:space="preserve"> rue de Pessac, est le bâtiment secondaire o</w:t>
+      </w:r>
+      <w:r>
+        <w:t>ù</w:t>
+      </w:r>
+      <w:r>
+        <w:t xml:space="preserve"> se trouve le réfectoire des élèves, ainsi que la pièce contenant le serveur qui servira au projet.</w:t>
+      </w:r>
+    </w:p>
+    <w:p/>
+    <w:p>
+      <w:pPr>
+        <w:rPr>
+          <w:b/>
+          <w:bCs/>
+        </w:rPr>
+      </w:pPr>
+      <w:r>
+        <w:t xml:space="preserve">En ce qui concerne l’accès </w:t>
+      </w:r>
+      <w:r>
+        <w:t>à</w:t>
+      </w:r>
+      <w:r>
+        <w:t xml:space="preserve"> l’</w:t>
+      </w:r>
+      <w:r>
+        <w:t>établissement</w:t>
+      </w:r>
+      <w:r>
+        <w:t xml:space="preserve"> principal situé au 12 rue de Saintonge, l’</w:t>
+      </w:r>
+      <w:r>
+        <w:t>accès</w:t>
+      </w:r>
+      <w:r>
+        <w:t xml:space="preserve"> se fait normalement, si un </w:t>
+      </w:r>
+      <w:r>
+        <w:t>él</w:t>
+      </w:r>
+      <w:r>
+        <w:t>ève</w:t>
+      </w:r>
+      <w:r>
+        <w:t xml:space="preserve"> arrive en retard, il </w:t>
+      </w:r>
+      <w:r>
+        <w:t>devra</w:t>
+      </w:r>
+      <w:r>
+        <w:t xml:space="preserve"> obligatoirement passer par la « vie scolaire », qui lui mettra un retard, </w:t>
+      </w:r>
+      <w:r>
+        <w:t>et possiblement même une sanction.</w:t>
+      </w:r>
+    </w:p>
+    <w:p/>
+    <w:p>
+      <w:pPr>
+        <w:pStyle w:val="Titre1"/>
+      </w:pPr>
+      <w:bookmarkStart w:id="3" w:name="_Toc228373008"/>
+      <w:r>
+        <w:t>Cahier des charges</w:t>
+      </w:r>
+      <w:bookmarkEnd w:id="3"/>
+    </w:p>
+    <w:p/>
+    <w:p>
+      <w:pPr>
+        <w:pStyle w:val="Titre2"/>
+      </w:pPr>
+      <w:bookmarkStart w:id="4" w:name="_Toc183509430"/>
+      <w:bookmarkStart w:id="5" w:name="_Toc228373009"/>
+      <w:r>
+        <w:t xml:space="preserve">Cahier des charges - </w:t>
+      </w:r>
+      <w:r>
+        <w:t>Analyse de l’Existant</w:t>
+      </w:r>
+      <w:bookmarkEnd w:id="4"/>
+      <w:bookmarkEnd w:id="5"/>
+    </w:p>
+    <w:p/>
+    <w:p>
+      <w:r>
+        <w:t xml:space="preserve">Concernant la gestion d’arrivée des élèves </w:t>
+      </w:r>
+      <w:r>
+        <w:t>à</w:t>
+      </w:r>
+      <w:r>
+        <w:t xml:space="preserve"> l’annexe de l’établissement, </w:t>
+      </w:r>
+      <w:r>
+        <w:t>un système de feuilles d’émargement est déjà mis en place mais ce système n’est pas efficient</w:t>
+      </w:r>
+      <w:r>
+        <w:t xml:space="preserve"> pour plusieurs raisons :</w:t>
+      </w:r>
+    </w:p>
+    <w:p/>
+    <w:p>
+      <w:r>
+        <w:tab/>
+        <w:t xml:space="preserve">1/ </w:t>
+      </w:r>
+      <w:r>
+        <w:t>Difficile de garder un historique organisé et précis</w:t>
+      </w:r>
+      <w:r>
+        <w:t>.</w:t>
+      </w:r>
+    </w:p>
+    <w:p>
+      <w:r>
+        <w:tab/>
+        <w:t xml:space="preserve">2/ </w:t>
+      </w:r>
+      <w:r>
+        <w:t>Problème du point de vue écologique (surconsommation de papier)</w:t>
+      </w:r>
+      <w:r>
+        <w:t>.</w:t>
+      </w:r>
+    </w:p>
+    <w:p>
+      <w:pPr>
+        <w:ind w:left="720"/>
+      </w:pPr>
+      <w:r>
+        <w:t>3/ Les élèves ne peuvent pas être autonome (obligation de la présence d’un membre du personnel administratif pour distribuer les feuilles)</w:t>
+      </w:r>
+      <w:r>
+        <w:t>.</w:t>
+      </w:r>
+    </w:p>
+    <w:p>
+      <w:pPr>
+        <w:ind w:left="720"/>
+      </w:pPr>
+      <w:r>
+        <w:t xml:space="preserve">4/ </w:t>
+      </w:r>
+      <w:r>
+        <w:t>Problème de sécurité/fraude (un élève peut signer à la place d’un autre)</w:t>
+      </w:r>
+      <w:r>
+        <w:t>.</w:t>
+      </w:r>
+    </w:p>
+    <w:p>
+      <w:pPr>
+        <w:ind w:left="720"/>
+      </w:pPr>
+      <w:r>
+        <w:t>5/ Manque de pr</w:t>
+      </w:r>
+      <w:r>
+        <w:t>é</w:t>
+      </w:r>
+      <w:r>
+        <w:t xml:space="preserve">cision concernant l’horodatage </w:t>
+      </w:r>
+      <w:r>
+        <w:t>des signatures.</w:t>
+      </w:r>
+    </w:p>
+    <w:p>
+      <w:r>
+        <w:br w:type="page"/>
+      </w:r>
+    </w:p>
+    <w:p>
+      <w:pPr>
+        <w:pStyle w:val="Titre2"/>
+      </w:pPr>
+      <w:bookmarkStart w:id="6" w:name="_Toc228373010"/>
+      <w:r>
+        <w:lastRenderedPageBreak/>
+        <w:t>Diagramme des cas d’utilisation (UML)</w:t>
+      </w:r>
+      <w:bookmarkEnd w:id="6"/>
+    </w:p>
+    <w:p>
       <w:bookmarkStart w:id="7" w:name="_Toc228373011"/>
       <w:r>
         <w:rPr>
@@ -4593,7 +4640,19 @@
           <w:rPr>
             <w:rStyle w:val="Lienhypertexte"/>
           </w:rPr>
-          <w:t>compte BOT</w:t>
+          <w:t>comp</w:t>
+        </w:r>
+        <w:r>
+          <w:rPr>
+            <w:rStyle w:val="Lienhypertexte"/>
+          </w:rPr>
+          <w:t>t</w:t>
+        </w:r>
+        <w:r>
+          <w:rPr>
+            <w:rStyle w:val="Lienhypertexte"/>
+          </w:rPr>
+          <w:t>e BOT</w:t>
         </w:r>
       </w:hyperlink>
       <w:r>
@@ -4682,7 +4741,13 @@
         </w:r>
       </w:hyperlink>
       <w:r>
-        <w:t xml:space="preserve"> le l’application déjà en place qui se nomme EcoleDirecte.</w:t>
+        <w:t xml:space="preserve"> </w:t>
+      </w:r>
+      <w:r>
+        <w:t>d</w:t>
+      </w:r>
+      <w:r>
+        <w:t>e l’application déjà en place qui se nomme EcoleDirecte.</w:t>
       </w:r>
     </w:p>
     <w:p/>
@@ -4698,7 +4763,56 @@
           <w:b/>
           <w:bCs/>
         </w:rPr>
-        <w:t>Fonctionnalités assurées par le syst</w:t>
+        <w:t xml:space="preserve">Fonctionnalités </w:t>
+      </w:r>
+      <w:r>
+        <w:rPr>
+          <w:b/>
+          <w:bCs/>
+        </w:rPr>
+        <w:t>que devr</w:t>
+      </w:r>
+      <w:r>
+        <w:rPr>
+          <w:b/>
+          <w:bCs/>
+        </w:rPr>
+        <w:t>a</w:t>
+      </w:r>
+      <w:r>
+        <w:rPr>
+          <w:b/>
+          <w:bCs/>
+        </w:rPr>
+        <w:t xml:space="preserve"> as</w:t>
+      </w:r>
+      <w:r>
+        <w:rPr>
+          <w:b/>
+          <w:bCs/>
+        </w:rPr>
+        <w:t>sur</w:t>
+      </w:r>
+      <w:r>
+        <w:rPr>
+          <w:b/>
+          <w:bCs/>
+        </w:rPr>
+        <w:t xml:space="preserve">er </w:t>
+      </w:r>
+      <w:r>
+        <w:rPr>
+          <w:b/>
+          <w:bCs/>
+        </w:rPr>
+        <w:t>le</w:t>
+      </w:r>
+      <w:r>
+        <w:rPr>
+          <w:b/>
+          <w:bCs/>
+        </w:rPr>
+        <w:t xml:space="preserve"> syst</w:t>
       </w:r>
       <w:r>
         <w:rPr>
@@ -10225,23 +10339,18 @@
         <w:t>Mise à jour de la fiche de suivi projet (version finale)</w:t>
       </w:r>
     </w:p>
-    <w:p/>
-    <w:p/>
-    <w:p/>
-    <w:p/>
-    <w:p/>
-    <w:p/>
-    <w:p/>
-    <w:p/>
-    <w:p/>
-    <w:p/>
-    <w:p/>
+    <w:p>
+      <w:r>
+        <w:br w:type="page"/>
+      </w:r>
+    </w:p>
     <w:p>
       <w:pPr>
         <w:pStyle w:val="Titre1"/>
       </w:pPr>
       <w:bookmarkStart w:id="241" w:name="_Toc228373085"/>
       <w:r>
+        <w:lastRenderedPageBreak/>
         <w:t>Cahier de recette</w:t>
       </w:r>
       <w:bookmarkEnd w:id="241"/>
@@ -10757,11 +10866,7 @@
           </w:tcPr>
           <w:p>
             <w:r>
-              <w:t xml:space="preserve">Consultation et </w:t>
-            </w:r>
-            <w:r>
-              <w:lastRenderedPageBreak/>
-              <w:t>validation OK, envoi vers ED à faire</w:t>
+              <w:t>Consultation et validation OK, envoi vers ED à faire</w:t>
             </w:r>
           </w:p>
         </w:tc>
@@ -10773,7 +10878,6 @@
           </w:tcPr>
           <w:p>
             <w:r>
-              <w:lastRenderedPageBreak/>
               <w:t>PWA Frontend (élève)</w:t>
             </w:r>
           </w:p>
@@ -11141,6 +11245,7 @@
       </w:pPr>
       <w:bookmarkStart w:id="242" w:name="_Toc228373086"/>
       <w:r>
+        <w:lastRenderedPageBreak/>
         <w:t>Diagramme de Gantt</w:t>
       </w:r>
       <w:bookmarkEnd w:id="242"/>
@@ -11259,6 +11364,15 @@
       <w:pPr>
         <w:pStyle w:val="Titre1"/>
       </w:pPr>
+      <w:r>
+        <w:t>Problemes rencontrés (avant cahier de recette)</w:t>
+      </w:r>
+    </w:p>
+    <w:p/>
+    <w:p>
+      <w:pPr>
+        <w:pStyle w:val="Titre1"/>
+      </w:pPr>
       <w:bookmarkStart w:id="244" w:name="_Toc228373088"/>
       <w:r>
         <w:t>Ameliorations futures</w:t>
@@ -11279,51 +11393,80 @@
       <w:pPr>
         <w:pStyle w:val="Titre1"/>
       </w:pPr>
-      <w:bookmarkStart w:id="245" w:name="_Toc228373089"/>
-      <w:r>
-        <w:t>Ce que cela m’a apporté</w:t>
-      </w:r>
+      <w:r>
+        <w:t>Apport personnel du projet</w:t>
+      </w:r>
+    </w:p>
+    <w:p>
+      <w:pPr>
+        <w:pStyle w:val="Paragraphedeliste"/>
+      </w:pPr>
+    </w:p>
+    <w:p>
+      <w:pPr>
+        <w:pStyle w:val="Titre1"/>
+      </w:pPr>
+      <w:r>
+        <w:t>Apport du projet a l’entreprise</w:t>
+      </w:r>
+    </w:p>
+    <w:p>
+      <w:pPr>
+        <w:pStyle w:val="Paragraphedeliste"/>
+      </w:pPr>
+    </w:p>
+    <w:p>
+      <w:pPr>
+        <w:pStyle w:val="Titre1"/>
+      </w:pPr>
+      <w:r>
+        <w:t xml:space="preserve">Conclusion </w:t>
+      </w:r>
+    </w:p>
+    <w:p>
+      <w:pPr>
+        <w:pStyle w:val="Paragraphedeliste"/>
+      </w:pPr>
+    </w:p>
+    <w:p>
+      <w:pPr>
+        <w:rPr>
+          <w:b/>
+          <w:bCs/>
+        </w:rPr>
+      </w:pPr>
+      <w:r>
+        <w:rPr>
+          <w:b/>
+          <w:bCs/>
+        </w:rPr>
+        <w:t>Mettre en annexe partie nfc et partie code</w:t>
+      </w:r>
+    </w:p>
+    <w:p>
+      <w:pPr>
+        <w:pStyle w:val="Titre1"/>
+      </w:pPr>
+      <w:bookmarkStart w:id="245" w:name="_Lexique"/>
+      <w:bookmarkStart w:id="246" w:name="_Toc228373090"/>
       <w:bookmarkEnd w:id="245"/>
-    </w:p>
-    <w:p>
-      <w:pPr>
-        <w:pStyle w:val="Paragraphedeliste"/>
-      </w:pPr>
-    </w:p>
-    <w:p>
-      <w:pPr>
-        <w:pStyle w:val="Titre1"/>
-        <w:numPr>
-          <w:ilvl w:val="0"/>
-          <w:numId w:val="0"/>
-        </w:numPr>
-        <w:ind w:left="360"/>
-      </w:pPr>
-    </w:p>
-    <w:p>
-      <w:pPr>
-        <w:pStyle w:val="Titre1"/>
-      </w:pPr>
-      <w:bookmarkStart w:id="246" w:name="_Lexique"/>
-      <w:bookmarkStart w:id="247" w:name="_Toc228373090"/>
+      <w:r>
+        <w:t>Lexique</w:t>
+      </w:r>
       <w:bookmarkEnd w:id="246"/>
-      <w:r>
-        <w:t>Lexique</w:t>
-      </w:r>
+    </w:p>
+    <w:p/>
+    <w:p>
+      <w:pPr>
+        <w:pStyle w:val="Titre2"/>
+      </w:pPr>
+      <w:bookmarkStart w:id="247" w:name="_Lexique_matériel_physique"/>
+      <w:bookmarkStart w:id="248" w:name="_Toc228373091"/>
       <w:bookmarkEnd w:id="247"/>
-    </w:p>
-    <w:p/>
-    <w:p>
-      <w:pPr>
-        <w:pStyle w:val="Titre2"/>
-      </w:pPr>
-      <w:bookmarkStart w:id="248" w:name="_Lexique_matériel_physique"/>
-      <w:bookmarkStart w:id="249" w:name="_Toc228373091"/>
+      <w:r>
+        <w:t>Lexique matériel physique</w:t>
+      </w:r>
       <w:bookmarkEnd w:id="248"/>
-      <w:r>
-        <w:t>Lexique matériel physique</w:t>
-      </w:r>
-      <w:bookmarkEnd w:id="249"/>
     </w:p>
     <w:p/>
     <w:p>
@@ -11567,13 +11710,13 @@
       <w:pPr>
         <w:pStyle w:val="Titre2"/>
       </w:pPr>
-      <w:bookmarkStart w:id="250" w:name="_Lexique_Dev"/>
-      <w:bookmarkStart w:id="251" w:name="_Toc228373092"/>
+      <w:bookmarkStart w:id="249" w:name="_Lexique_Dev"/>
+      <w:bookmarkStart w:id="250" w:name="_Toc228373092"/>
+      <w:bookmarkEnd w:id="249"/>
+      <w:r>
+        <w:t>Lexique Dev</w:t>
+      </w:r>
       <w:bookmarkEnd w:id="250"/>
-      <w:r>
-        <w:t>Lexique Dev</w:t>
-      </w:r>
-      <w:bookmarkEnd w:id="251"/>
     </w:p>
     <w:p/>
     <w:p>
@@ -12130,13 +12273,13 @@
       <w:pPr>
         <w:pStyle w:val="Titre2"/>
       </w:pPr>
-      <w:bookmarkStart w:id="252" w:name="_Lexique_NFC"/>
-      <w:bookmarkStart w:id="253" w:name="_Toc228373093"/>
+      <w:bookmarkStart w:id="251" w:name="_Lexique_NFC"/>
+      <w:bookmarkStart w:id="252" w:name="_Toc228373093"/>
+      <w:bookmarkEnd w:id="251"/>
+      <w:r>
+        <w:t>Lexique NFC</w:t>
+      </w:r>
       <w:bookmarkEnd w:id="252"/>
-      <w:r>
-        <w:t>Lexique NFC</w:t>
-      </w:r>
-      <w:bookmarkEnd w:id="253"/>
     </w:p>
     <w:p/>
     <w:p>
@@ -12164,6 +12307,7 @@
         </w:numPr>
       </w:pPr>
       <w:r>
+        <w:lastRenderedPageBreak/>
         <w:t>Technologie de communication sans fil à très courte portée (quelques centimètres).</w:t>
       </w:r>
     </w:p>

</xml_diff>